<commit_message>
paper: cycle-4 minor revisions -> Accept (scope contamination claim, commit script)
Cycle-4 review = "Accept with minor revisions". Make exactly the two named
blocking fixes:
- 5.6: scope the contamination conclusion to verbatim non-duplication of the
  sampled public sets; it corroborates (not proves) the structural freshness
  guarantee. Removed "cannot have memorized / not present in pretraining data".
- Commit scripts/contamination_check.py so the 110,784-distinct-13-gram figure
  is reproducible; finding box cites it.
- Reconcile stale geval_baseline.json cross-ref field (0.241 -> 0.244).
Regenerated CoEval.docx.

Co-Authored-By: Claude Opus 4.8 <noreply@anthropic.com>
</commit_message>
<xml_diff>
--- a/docs/paper/CoEval.docx
+++ b/docs/paper/CoEval.docx
@@ -8754,13 +8754,19 @@
         <w:t xml:space="preserve"> </w:t>
       </w:r>
       <w:r>
-        <w:t xml:space="preserve">of generated items have any overlap. Freshly</w:t>
-      </w:r>
-      <w:r>
-        <w:t xml:space="preserve"> </w:t>
-      </w:r>
-      <w:r>
-        <w:t xml:space="preserve">generated items are thus novel by construction</w:t>
+        <w:t xml:space="preserve">of generated items share any 13-gram. This</w:t>
+      </w:r>
+      <w:r>
+        <w:t xml:space="preserve"> </w:t>
+      </w:r>
+      <w:r>
+        <w:t xml:space="preserve">measures verbatim non-duplication of the sampled public test sets—it does not, on its own, certify absence from</w:t>
+      </w:r>
+      <w:r>
+        <w:t xml:space="preserve"> </w:t>
+      </w:r>
+      <w:r>
+        <w:t xml:space="preserve">the full (unobservable) pretraining corpus, and it is defeated in principle by paraphrase. It nonetheless</w:t>
       </w:r>
       <w:r>
         <w:t xml:space="preserve"> </w:t>
@@ -8770,25 +8776,53 @@
           <w:i/>
           <w:iCs/>
         </w:rPr>
-        <w:t xml:space="preserve">and</w:t>
-      </w:r>
-      <w:r>
-        <w:t xml:space="preserve"> </w:t>
-      </w:r>
-      <w:r>
-        <w:t xml:space="preserve">in measurement, so a model cannot have memorized them from</w:t>
-      </w:r>
-      <w:r>
-        <w:t xml:space="preserve"> </w:t>
-      </w:r>
-      <w:r>
-        <w:t xml:space="preserve">a leaked public test set. (We re-emphasize the scope from Section 5.1: this property holds for CoEval's generated</w:t>
-      </w:r>
-      <w:r>
-        <w:t xml:space="preserve"> </w:t>
-      </w:r>
-      <w:r>
-        <w:t xml:space="preserve">items; the benchmark-grounded anchor of Table 1 deliberately reuses public items to obtain objective ground truth.)</w:t>
+        <w:t xml:space="preserve">corroborates</w:t>
+      </w:r>
+      <w:r>
+        <w:t xml:space="preserve"> </w:t>
+      </w:r>
+      <w:r>
+        <w:t xml:space="preserve">the real guarantee, which is structural: because items are synthesized fresh from the attribute</w:t>
+      </w:r>
+      <w:r>
+        <w:t xml:space="preserve"> </w:t>
+      </w:r>
+      <w:r>
+        <w:t xml:space="preserve">specification on each run, they cannot have appeared in any model's</w:t>
+      </w:r>
+      <w:r>
+        <w:t xml:space="preserve"> </w:t>
+      </w:r>
+      <w:r>
+        <w:rPr>
+          <w:i/>
+          <w:iCs/>
+        </w:rPr>
+        <w:t xml:space="preserve">prior</w:t>
+      </w:r>
+      <w:r>
+        <w:t xml:space="preserve"> </w:t>
+      </w:r>
+      <w:r>
+        <w:t xml:space="preserve">training, and a model cannot retrieve</w:t>
+      </w:r>
+      <w:r>
+        <w:t xml:space="preserve"> </w:t>
+      </w:r>
+      <w:r>
+        <w:t xml:space="preserve">them from a leaked copy of these widely-used benchmarks. (We re-emphasize the scope from Section 5.1: this holds</w:t>
+      </w:r>
+      <w:r>
+        <w:t xml:space="preserve"> </w:t>
+      </w:r>
+      <w:r>
+        <w:t xml:space="preserve">for CoEval's generated items; the benchmark-grounded anchor of Table 1 deliberately reuses public items to obtain</w:t>
+      </w:r>
+      <w:r>
+        <w:t xml:space="preserve"> </w:t>
+      </w:r>
+      <w:r>
+        <w:t xml:space="preserve">objective ground truth.)</w:t>
       </w:r>
     </w:p>
     <w:p>
@@ -8810,7 +8844,7 @@
         <w:t xml:space="preserve"> </w:t>
       </w:r>
       <w:r>
-        <w:t xml:space="preserve">CoEval-generated items have</w:t>
+        <w:t xml:space="preserve">CoEval-generated items show</w:t>
       </w:r>
       <w:r>
         <w:t xml:space="preserve"> </w:t>
@@ -8824,13 +8858,13 @@
         <w:t xml:space="preserve"> </w:t>
       </w:r>
       <w:r>
-        <w:t xml:space="preserve">13-gram overlap with five major public</w:t>
-      </w:r>
-      <w:r>
-        <w:t xml:space="preserve"> </w:t>
-      </w:r>
-      <w:r>
-        <w:t xml:space="preserve">benchmarks (</w:t>
+        <w:t xml:space="preserve">verbatim 13-gram overlap with five</w:t>
+      </w:r>
+      <w:r>
+        <w:t xml:space="preserve"> </w:t>
+      </w:r>
+      <w:r>
+        <w:t xml:space="preserve">major public benchmarks (</w:t>
       </w:r>
       <m:oMath>
         <m:r>
@@ -8864,13 +8898,36 @@
         <w:t xml:space="preserve"> </w:t>
       </w:r>
       <w:r>
-        <w:t xml:space="preserve">items), an empirical confirmation that generated evaluation items are not present in</w:t>
-      </w:r>
-      <w:r>
-        <w:t xml:space="preserve"> </w:t>
-      </w:r>
-      <w:r>
-        <w:t xml:space="preserve">models' pretraining data.</w:t>
+        <w:t xml:space="preserve">items;</w:t>
+      </w:r>
+      <w:r>
+        <w:t xml:space="preserve"> </w:t>
+      </w:r>
+      <m:oMath>
+        <m:r>
+          <m:t>110</m:t>
+        </m:r>
+        <m:r>
+          <m:rPr>
+            <m:sty m:val="p"/>
+          </m:rPr>
+          <m:t>,</m:t>
+        </m:r>
+        <m:r>
+          <m:t>784</m:t>
+        </m:r>
+      </m:oMath>
+      <w:r>
+        <w:t xml:space="preserve"> </w:t>
+      </w:r>
+      <w:r>
+        <w:t xml:space="preserve">distinct public 13-grams), corroborating—alongside</w:t>
+      </w:r>
+      <w:r>
+        <w:t xml:space="preserve"> </w:t>
+      </w:r>
+      <w:r>
+        <w:t xml:space="preserve">the structural freshness guarantee—that generated evaluation items are not leaked copies of public test sets.</w:t>
       </w:r>
     </w:p>
     <w:bookmarkEnd w:id="42"/>

</xml_diff>

<commit_message>
paper: articulate the gap explicitly in the abstract
The abstract stated the practitioner's problem (no task-specific labels, and
contaminated/untrusted public benchmarks) but moved straight to the solution.
Add a sentence that names the gap in existing work: automated benchmark
generators still score with a single bias-prone judge; LLM-as-judge panels
presuppose an evaluation set already exists; live benchmarks curb leakage only
through ongoing human curation and avoid open-ended, judge-scored tasks. State
that no existing approach supplies contamination-free, label-free,
domain-targeted evaluation end to end, which is the gap CoEval fills.

Regenerated CoEval.docx. Verified: 0 em-dashes, 0 KaTeX errors, 0 stray "$".

Co-Authored-By: Claude Opus 4.8 <noreply@anthropic.com>
</commit_message>
<xml_diff>
--- a/docs/paper/CoEval.docx
+++ b/docs/paper/CoEval.docx
@@ -167,7 +167,31 @@
         <w:t xml:space="preserve"> </w:t>
       </w:r>
       <w:r>
-        <w:t xml:space="preserve">memorization rather than fitness for the use case. We present</w:t>
+        <w:t xml:space="preserve">memorization rather than fitness for the use case. Existing tools address only one side of this gap: automated</w:t>
+      </w:r>
+      <w:r>
+        <w:t xml:space="preserve"> </w:t>
+      </w:r>
+      <w:r>
+        <w:t xml:space="preserve">benchmark generators still score with a single, bias-prone judge; LLM-as-judge panels presuppose that an evaluation</w:t>
+      </w:r>
+      <w:r>
+        <w:t xml:space="preserve"> </w:t>
+      </w:r>
+      <w:r>
+        <w:t xml:space="preserve">set already exists; and continually refreshed live benchmarks curb leakage only through ongoing human curation and</w:t>
+      </w:r>
+      <w:r>
+        <w:t xml:space="preserve"> </w:t>
+      </w:r>
+      <w:r>
+        <w:t xml:space="preserve">avoid open-ended, judge-scored tasks. No existing approach supplies contamination-free, label-free, domain-targeted</w:t>
+      </w:r>
+      <w:r>
+        <w:t xml:space="preserve"> </w:t>
+      </w:r>
+      <w:r>
+        <w:t xml:space="preserve">evaluation end to end. We present</w:t>
       </w:r>
       <w:r>
         <w:t xml:space="preserve"> </w:t>

</xml_diff>

<commit_message>
paper: switch citations to inline bracketed style [n, m], no superscript
Convert all 45 superscript citation markers (<sup>[12]</sup>) to baseline inline
academic style ([12, 13]): the numbers remain hyperlinks to the reference list,
the brackets and comma separators are plain text, and adjacent citation groups
merge into a single bracket ([19][20] -> [19, 20]). Verified in-browser: 0 <sup>
elements, citation links render at baseline. Regenerated CoEval.docx via the
html2doc pipeline (inline [12, 13] present, 0 stray "$", 0 em-dashes). bibtest
26/26 references still valid.

Co-Authored-By: Claude Opus 4.8 <noreply@anthropic.com>
</commit_message>
<xml_diff>
--- a/docs/paper/CoEval.docx
+++ b/docs/paper/CoEval.docx
@@ -665,31 +665,32 @@
         <w:t xml:space="preserve"> </w:t>
       </w:r>
       <w:r>
-        <w:t xml:space="preserve">high score can reflect memorization rather than capability</w:t>
-      </w:r>
-      <w:r>
-        <w:t xml:space="preserve"> </w:t>
+        <w:t xml:space="preserve">high score can reflect memorization rather than capability [</w:t>
       </w:r>
       <w:hyperlink w:anchor="r12">
         <w:r>
           <w:rPr>
             <w:rStyle w:val="Hyperlink"/>
-            <w:vertAlign w:val="superscript"/>
           </w:rPr>
-          <w:t xml:space="preserve">[12]</w:t>
+          <w:t xml:space="preserve">12</w:t>
         </w:r>
       </w:hyperlink>
+      <w:r>
+        <w:t xml:space="preserve">,</w:t>
+      </w:r>
+      <w:r>
+        <w:t xml:space="preserve"> </w:t>
+      </w:r>
       <w:hyperlink w:anchor="r13">
         <w:r>
           <w:rPr>
             <w:rStyle w:val="Hyperlink"/>
-            <w:vertAlign w:val="superscript"/>
           </w:rPr>
-          <w:t xml:space="preserve">[13]</w:t>
+          <w:t xml:space="preserve">13</w:t>
         </w:r>
       </w:hyperlink>
       <w:r>
-        <w:t xml:space="preserve">.</w:t>
+        <w:t xml:space="preserve">].</w:t>
       </w:r>
       <w:r>
         <w:t xml:space="preserve"> </w:t>
@@ -801,31 +802,32 @@
         <w:t xml:space="preserve"> </w:t>
       </w:r>
       <w:r>
-        <w:t xml:space="preserve">memorization rather than generalization</w:t>
-      </w:r>
-      <w:r>
-        <w:t xml:space="preserve"> </w:t>
+        <w:t xml:space="preserve">memorization rather than generalization [</w:t>
       </w:r>
       <w:hyperlink w:anchor="r12">
         <w:r>
           <w:rPr>
             <w:rStyle w:val="Hyperlink"/>
-            <w:vertAlign w:val="superscript"/>
           </w:rPr>
-          <w:t xml:space="preserve">[12]</w:t>
+          <w:t xml:space="preserve">12</w:t>
         </w:r>
       </w:hyperlink>
+      <w:r>
+        <w:t xml:space="preserve">,</w:t>
+      </w:r>
+      <w:r>
+        <w:t xml:space="preserve"> </w:t>
+      </w:r>
       <w:hyperlink w:anchor="r13">
         <w:r>
           <w:rPr>
             <w:rStyle w:val="Hyperlink"/>
-            <w:vertAlign w:val="superscript"/>
           </w:rPr>
-          <w:t xml:space="preserve">[13]</w:t>
+          <w:t xml:space="preserve">13</w:t>
         </w:r>
       </w:hyperlink>
       <w:r>
-        <w:t xml:space="preserve">. Third, they are</w:t>
+        <w:t xml:space="preserve">]. Third, they are</w:t>
       </w:r>
       <w:r>
         <w:t xml:space="preserve"> </w:t>
@@ -856,34 +858,32 @@
         <w:widowControl w:val="1"/>
       </w:pPr>
       <w:r>
-        <w:t xml:space="preserve">LLM-as-judge evaluation</w:t>
-      </w:r>
-      <w:r>
-        <w:t xml:space="preserve"> </w:t>
+        <w:t xml:space="preserve">LLM-as-judge evaluation [</w:t>
       </w:r>
       <w:hyperlink w:anchor="r1">
         <w:r>
           <w:rPr>
             <w:rStyle w:val="Hyperlink"/>
-            <w:vertAlign w:val="superscript"/>
           </w:rPr>
-          <w:t xml:space="preserve">[1]</w:t>
+          <w:t xml:space="preserve">1</w:t>
         </w:r>
       </w:hyperlink>
+      <w:r>
+        <w:t xml:space="preserve">,</w:t>
+      </w:r>
+      <w:r>
+        <w:t xml:space="preserve"> </w:t>
+      </w:r>
       <w:hyperlink w:anchor="r2">
         <w:r>
           <w:rPr>
             <w:rStyle w:val="Hyperlink"/>
-            <w:vertAlign w:val="superscript"/>
           </w:rPr>
-          <w:t xml:space="preserve">[2]</w:t>
+          <w:t xml:space="preserve">2</w:t>
         </w:r>
       </w:hyperlink>
       <w:r>
-        <w:t xml:space="preserve"> </w:t>
-      </w:r>
-      <w:r>
-        <w:t xml:space="preserve">addresses the cost and extensibility of</w:t>
+        <w:t xml:space="preserve">] addresses the cost and extensibility of</w:t>
       </w:r>
       <w:r>
         <w:t xml:space="preserve"> </w:t>
@@ -938,17 +938,19 @@
       <w:r>
         <w:t xml:space="preserve"> </w:t>
       </w:r>
+      <w:r>
+        <w:t xml:space="preserve">[</w:t>
+      </w:r>
       <w:hyperlink w:anchor="r8">
         <w:r>
           <w:rPr>
             <w:rStyle w:val="Hyperlink"/>
-            <w:vertAlign w:val="superscript"/>
           </w:rPr>
-          <w:t xml:space="preserve">[8]</w:t>
+          <w:t xml:space="preserve">8</w:t>
         </w:r>
       </w:hyperlink>
       <w:r>
-        <w:t xml:space="preserve">, and</w:t>
+        <w:t xml:space="preserve">], and</w:t>
       </w:r>
       <w:r>
         <w:t xml:space="preserve"> </w:t>
@@ -1340,43 +1342,35 @@
         <w:t xml:space="preserve"> </w:t>
       </w:r>
       <w:r>
-        <w:t xml:space="preserve">leak into pretraining corpora and inflate scores through memorization (GSM1k</w:t>
-      </w:r>
-      <w:r>
-        <w:t xml:space="preserve"> </w:t>
+        <w:t xml:space="preserve">leak into pretraining corpora and inflate scores through memorization (GSM1k [</w:t>
       </w:r>
       <w:hyperlink w:anchor="r12">
         <w:r>
           <w:rPr>
             <w:rStyle w:val="Hyperlink"/>
-            <w:vertAlign w:val="superscript"/>
           </w:rPr>
-          <w:t xml:space="preserve">[12]</w:t>
+          <w:t xml:space="preserve">12</w:t>
         </w:r>
       </w:hyperlink>
       <w:r>
-        <w:t xml:space="preserve">,</w:t>
-      </w:r>
-      <w:r>
-        <w:t xml:space="preserve"> </w:t>
-      </w:r>
-      <w:r>
-        <w:t xml:space="preserve">contamination surveys</w:t>
-      </w:r>
-      <w:r>
-        <w:t xml:space="preserve"> </w:t>
+        <w:t xml:space="preserve">],</w:t>
+      </w:r>
+      <w:r>
+        <w:t xml:space="preserve"> </w:t>
+      </w:r>
+      <w:r>
+        <w:t xml:space="preserve">contamination surveys [</w:t>
       </w:r>
       <w:hyperlink w:anchor="r13">
         <w:r>
           <w:rPr>
             <w:rStyle w:val="Hyperlink"/>
-            <w:vertAlign w:val="superscript"/>
           </w:rPr>
-          <w:t xml:space="preserve">[13]</w:t>
+          <w:t xml:space="preserve">13</w:t>
         </w:r>
       </w:hyperlink>
       <w:r>
-        <w:t xml:space="preserve">), which has driven continuously-refreshed</w:t>
+        <w:t xml:space="preserve">]), which has driven continuously-refreshed</w:t>
       </w:r>
       <w:r>
         <w:t xml:space="preserve"> </w:t>
@@ -1392,58 +1386,46 @@
         <w:t xml:space="preserve"> </w:t>
       </w:r>
       <w:r>
-        <w:t xml:space="preserve">benchmarks (LiveBench</w:t>
-      </w:r>
-      <w:r>
-        <w:t xml:space="preserve"> </w:t>
+        <w:t xml:space="preserve">benchmarks (LiveBench [</w:t>
       </w:r>
       <w:hyperlink w:anchor="r22">
         <w:r>
           <w:rPr>
             <w:rStyle w:val="Hyperlink"/>
-            <w:vertAlign w:val="superscript"/>
           </w:rPr>
-          <w:t xml:space="preserve">[22]</w:t>
+          <w:t xml:space="preserve">22</w:t>
         </w:r>
       </w:hyperlink>
       <w:r>
-        <w:t xml:space="preserve">, LiveCodeBench</w:t>
-      </w:r>
-      <w:r>
-        <w:t xml:space="preserve"> </w:t>
+        <w:t xml:space="preserve">], LiveCodeBench [</w:t>
       </w:r>
       <w:hyperlink w:anchor="r23">
         <w:r>
           <w:rPr>
             <w:rStyle w:val="Hyperlink"/>
-            <w:vertAlign w:val="superscript"/>
           </w:rPr>
-          <w:t xml:space="preserve">[23]</w:t>
+          <w:t xml:space="preserve">23</w:t>
         </w:r>
       </w:hyperlink>
       <w:r>
-        <w:t xml:space="preserve">) and</w:t>
-      </w:r>
-      <w:r>
-        <w:t xml:space="preserve"> </w:t>
-      </w:r>
-      <w:r>
-        <w:t xml:space="preserve">exposed leakage on the judge side as well (Preference Leakage</w:t>
-      </w:r>
-      <w:r>
-        <w:t xml:space="preserve"> </w:t>
+        <w:t xml:space="preserve">]) and</w:t>
+      </w:r>
+      <w:r>
+        <w:t xml:space="preserve"> </w:t>
+      </w:r>
+      <w:r>
+        <w:t xml:space="preserve">exposed leakage on the judge side as well (Preference Leakage [</w:t>
       </w:r>
       <w:hyperlink w:anchor="r15">
         <w:r>
           <w:rPr>
             <w:rStyle w:val="Hyperlink"/>
-            <w:vertAlign w:val="superscript"/>
           </w:rPr>
-          <w:t xml:space="preserve">[15]</w:t>
+          <w:t xml:space="preserve">15</w:t>
         </w:r>
       </w:hyperlink>
       <w:r>
-        <w:t xml:space="preserve">). (ii) When no</w:t>
+        <w:t xml:space="preserve">]). (ii) When no</w:t>
       </w:r>
       <w:r>
         <w:t xml:space="preserve"> </w:t>
@@ -1470,62 +1452,58 @@
       <w:r>
         <w:t xml:space="preserve"> </w:t>
       </w:r>
+      <w:r>
+        <w:t xml:space="preserve">[</w:t>
+      </w:r>
       <w:hyperlink w:anchor="r9">
         <w:r>
           <w:rPr>
             <w:rStyle w:val="Hyperlink"/>
-            <w:vertAlign w:val="superscript"/>
           </w:rPr>
-          <w:t xml:space="preserve">[9]</w:t>
+          <w:t xml:space="preserve">9</w:t>
         </w:r>
       </w:hyperlink>
       <w:r>
-        <w:t xml:space="preserve">, BenchAgents</w:t>
-      </w:r>
-      <w:r>
-        <w:t xml:space="preserve"> </w:t>
+        <w:t xml:space="preserve">], BenchAgents [</w:t>
       </w:r>
       <w:hyperlink w:anchor="r10">
         <w:r>
           <w:rPr>
             <w:rStyle w:val="Hyperlink"/>
-            <w:vertAlign w:val="superscript"/>
           </w:rPr>
-          <w:t xml:space="preserve">[10]</w:t>
+          <w:t xml:space="preserve">10</w:t>
         </w:r>
       </w:hyperlink>
       <w:r>
-        <w:t xml:space="preserve">, YourBench</w:t>
-      </w:r>
-      <w:r>
-        <w:t xml:space="preserve"> </w:t>
+        <w:t xml:space="preserve">], YourBench</w:t>
+      </w:r>
+      <w:r>
+        <w:t xml:space="preserve"> </w:t>
+      </w:r>
+      <w:r>
+        <w:t xml:space="preserve">[</w:t>
       </w:r>
       <w:hyperlink w:anchor="r11">
         <w:r>
           <w:rPr>
             <w:rStyle w:val="Hyperlink"/>
-            <w:vertAlign w:val="superscript"/>
           </w:rPr>
-          <w:t xml:space="preserve">[11]</w:t>
+          <w:t xml:space="preserve">11</w:t>
         </w:r>
       </w:hyperlink>
       <w:r>
-        <w:t xml:space="preserve">, domain-specific construction</w:t>
-      </w:r>
-      <w:r>
-        <w:t xml:space="preserve"> </w:t>
+        <w:t xml:space="preserve">], domain-specific construction [</w:t>
       </w:r>
       <w:hyperlink w:anchor="r25">
         <w:r>
           <w:rPr>
             <w:rStyle w:val="Hyperlink"/>
-            <w:vertAlign w:val="superscript"/>
           </w:rPr>
-          <w:t xml:space="preserve">[25]</w:t>
+          <w:t xml:space="preserve">25</w:t>
         </w:r>
       </w:hyperlink>
       <w:r>
-        <w:t xml:space="preserve">).</w:t>
+        <w:t xml:space="preserve">]).</w:t>
       </w:r>
       <w:r>
         <w:t xml:space="preserve"> </w:t>
@@ -1544,52 +1522,46 @@
         <w:t xml:space="preserve"> </w:t>
       </w:r>
       <w:r>
-        <w:t xml:space="preserve">methods (G-Eval</w:t>
-      </w:r>
-      <w:r>
-        <w:t xml:space="preserve"> </w:t>
+        <w:t xml:space="preserve">methods (G-Eval [</w:t>
       </w:r>
       <w:hyperlink w:anchor="r2">
         <w:r>
           <w:rPr>
             <w:rStyle w:val="Hyperlink"/>
-            <w:vertAlign w:val="superscript"/>
           </w:rPr>
-          <w:t xml:space="preserve">[2]</w:t>
+          <w:t xml:space="preserve">2</w:t>
         </w:r>
       </w:hyperlink>
       <w:r>
-        <w:t xml:space="preserve">, Prometheus 2</w:t>
-      </w:r>
-      <w:r>
-        <w:t xml:space="preserve"> </w:t>
+        <w:t xml:space="preserve">], Prometheus 2</w:t>
+      </w:r>
+      <w:r>
+        <w:t xml:space="preserve"> </w:t>
+      </w:r>
+      <w:r>
+        <w:t xml:space="preserve">[</w:t>
       </w:r>
       <w:hyperlink w:anchor="r3">
         <w:r>
           <w:rPr>
             <w:rStyle w:val="Hyperlink"/>
-            <w:vertAlign w:val="superscript"/>
           </w:rPr>
-          <w:t xml:space="preserve">[3]</w:t>
+          <w:t xml:space="preserve">3</w:t>
         </w:r>
       </w:hyperlink>
       <w:r>
-        <w:t xml:space="preserve">, panels</w:t>
-      </w:r>
-      <w:r>
-        <w:t xml:space="preserve"> </w:t>
+        <w:t xml:space="preserve">], panels [</w:t>
       </w:r>
       <w:hyperlink w:anchor="r5">
         <w:r>
           <w:rPr>
             <w:rStyle w:val="Hyperlink"/>
-            <w:vertAlign w:val="superscript"/>
           </w:rPr>
-          <w:t xml:space="preserve">[5]</w:t>
+          <w:t xml:space="preserve">5</w:t>
         </w:r>
       </w:hyperlink>
       <w:r>
-        <w:t xml:space="preserve">) provide label-free scoring but inherit</w:t>
+        <w:t xml:space="preserve">]) provide label-free scoring but inherit</w:t>
       </w:r>
       <w:r>
         <w:t xml:space="preserve"> </w:t>
@@ -1631,49 +1603,35 @@
         <w:widowControl w:val="1"/>
       </w:pPr>
       <w:r>
-        <w:t xml:space="preserve">MT-Bench and Chatbot Arena</w:t>
-      </w:r>
-      <w:r>
-        <w:t xml:space="preserve"> </w:t>
+        <w:t xml:space="preserve">MT-Bench and Chatbot Arena [</w:t>
       </w:r>
       <w:hyperlink w:anchor="r1">
         <w:r>
           <w:rPr>
             <w:rStyle w:val="Hyperlink"/>
-            <w:vertAlign w:val="superscript"/>
           </w:rPr>
-          <w:t xml:space="preserve">[1]</w:t>
+          <w:t xml:space="preserve">1</w:t>
         </w:r>
       </w:hyperlink>
       <w:r>
-        <w:t xml:space="preserve"> </w:t>
-      </w:r>
-      <w:r>
-        <w:t xml:space="preserve">established LLM-as-judge as a scalable proxy for human</w:t>
-      </w:r>
-      <w:r>
-        <w:t xml:space="preserve"> </w:t>
-      </w:r>
-      <w:r>
-        <w:t xml:space="preserve">preference, and documented its biases. G-Eval</w:t>
-      </w:r>
-      <w:r>
-        <w:t xml:space="preserve"> </w:t>
+        <w:t xml:space="preserve">] established LLM-as-judge as a scalable proxy for human</w:t>
+      </w:r>
+      <w:r>
+        <w:t xml:space="preserve"> </w:t>
+      </w:r>
+      <w:r>
+        <w:t xml:space="preserve">preference, and documented its biases. G-Eval [</w:t>
       </w:r>
       <w:hyperlink w:anchor="r2">
         <w:r>
           <w:rPr>
             <w:rStyle w:val="Hyperlink"/>
-            <w:vertAlign w:val="superscript"/>
           </w:rPr>
-          <w:t xml:space="preserve">[2]</w:t>
+          <w:t xml:space="preserve">2</w:t>
         </w:r>
       </w:hyperlink>
       <w:r>
-        <w:t xml:space="preserve"> </w:t>
-      </w:r>
-      <w:r>
-        <w:t xml:space="preserve">uses a single strong model with</w:t>
+        <w:t xml:space="preserve">] uses a single strong model with</w:t>
       </w:r>
       <w:r>
         <w:t xml:space="preserve"> </w:t>
@@ -1683,21 +1641,20 @@
       </w:r>
       <w:r>
         <w:t xml:space="preserve"> </w:t>
+      </w:r>
+      <w:r>
+        <w:t xml:space="preserve">[</w:t>
       </w:r>
       <w:hyperlink w:anchor="r3">
         <w:r>
           <w:rPr>
             <w:rStyle w:val="Hyperlink"/>
-            <w:vertAlign w:val="superscript"/>
           </w:rPr>
-          <w:t xml:space="preserve">[3]</w:t>
+          <w:t xml:space="preserve">3</w:t>
         </w:r>
       </w:hyperlink>
       <w:r>
-        <w:t xml:space="preserve"> </w:t>
-      </w:r>
-      <w:r>
-        <w:t xml:space="preserve">trains a dedicated open evaluator. These approaches are</w:t>
+        <w:t xml:space="preserve">] trains a dedicated open evaluator. These approaches are</w:t>
       </w:r>
       <w:r>
         <w:t xml:space="preserve"> </w:t>
@@ -1738,61 +1695,52 @@
         <w:t xml:space="preserve"> </w:t>
       </w:r>
       <w:r>
-        <w:t xml:space="preserve">automatically from the task definition and aggregates across a diverse panel. FLAMe</w:t>
-      </w:r>
-      <w:r>
-        <w:t xml:space="preserve"> </w:t>
+        <w:t xml:space="preserve">automatically from the task definition and aggregates across a diverse panel. FLAMe [</w:t>
       </w:r>
       <w:hyperlink w:anchor="r4">
         <w:r>
           <w:rPr>
             <w:rStyle w:val="Hyperlink"/>
-            <w:vertAlign w:val="superscript"/>
           </w:rPr>
-          <w:t xml:space="preserve">[4]</w:t>
+          <w:t xml:space="preserve">4</w:t>
         </w:r>
       </w:hyperlink>
       <w:r>
-        <w:t xml:space="preserve"> </w:t>
-      </w:r>
-      <w:r>
-        <w:t xml:space="preserve">and JudgeBench</w:t>
-      </w:r>
-      <w:r>
-        <w:t xml:space="preserve"> </w:t>
+        <w:t xml:space="preserve">]</w:t>
+      </w:r>
+      <w:r>
+        <w:t xml:space="preserve"> </w:t>
+      </w:r>
+      <w:r>
+        <w:t xml:space="preserve">and JudgeBench [</w:t>
       </w:r>
       <w:hyperlink w:anchor="r6">
         <w:r>
           <w:rPr>
             <w:rStyle w:val="Hyperlink"/>
-            <w:vertAlign w:val="superscript"/>
           </w:rPr>
-          <w:t xml:space="preserve">[6]</w:t>
+          <w:t xml:space="preserve">6</w:t>
         </w:r>
       </w:hyperlink>
       <w:r>
-        <w:t xml:space="preserve"> </w:t>
-      </w:r>
-      <w:r>
-        <w:t xml:space="preserve">study the reliability of judge models, and BiGGen-Bench</w:t>
-      </w:r>
-      <w:r>
-        <w:t xml:space="preserve"> </w:t>
+        <w:t xml:space="preserve">] study the reliability of judge models, and BiGGen-Bench</w:t>
+      </w:r>
+      <w:r>
+        <w:t xml:space="preserve"> </w:t>
+      </w:r>
+      <w:r>
+        <w:t xml:space="preserve">[</w:t>
       </w:r>
       <w:hyperlink w:anchor="r7">
         <w:r>
           <w:rPr>
             <w:rStyle w:val="Hyperlink"/>
-            <w:vertAlign w:val="superscript"/>
           </w:rPr>
-          <w:t xml:space="preserve">[7]</w:t>
+          <w:t xml:space="preserve">7</w:t>
         </w:r>
       </w:hyperlink>
       <w:r>
-        <w:t xml:space="preserve"> </w:t>
-      </w:r>
-      <w:r>
-        <w:t xml:space="preserve">introduces instance-specific evaluation criteria; CoEval is complementary, adding a</w:t>
+        <w:t xml:space="preserve">] introduces instance-specific evaluation criteria; CoEval is complementary, adding a</w:t>
       </w:r>
       <w:r>
         <w:t xml:space="preserve"> </w:t>
@@ -1826,22 +1774,18 @@
         <w:t xml:space="preserve"> </w:t>
       </w:r>
       <w:r>
-        <w:t xml:space="preserve">(PoLL)</w:t>
-      </w:r>
-      <w:r>
-        <w:t xml:space="preserve"> </w:t>
+        <w:t xml:space="preserve">(PoLL) [</w:t>
       </w:r>
       <w:hyperlink w:anchor="r5">
         <w:r>
           <w:rPr>
             <w:rStyle w:val="Hyperlink"/>
-            <w:vertAlign w:val="superscript"/>
           </w:rPr>
-          <w:t xml:space="preserve">[5]</w:t>
+          <w:t xml:space="preserve">5</w:t>
         </w:r>
       </w:hyperlink>
       <w:r>
-        <w:t xml:space="preserve">, which</w:t>
+        <w:t xml:space="preserve">], which</w:t>
       </w:r>
       <w:r>
         <w:t xml:space="preserve"> </w:t>
@@ -1905,49 +1849,35 @@
         <w:t xml:space="preserve"> </w:t>
       </w:r>
       <w:r>
-        <w:t xml:space="preserve">(teacher/student/judge) with self-preference monitoring built in. ChatEval</w:t>
-      </w:r>
-      <w:r>
-        <w:t xml:space="preserve"> </w:t>
+        <w:t xml:space="preserve">(teacher/student/judge) with self-preference monitoring built in. ChatEval [</w:t>
       </w:r>
       <w:hyperlink w:anchor="r21">
         <w:r>
           <w:rPr>
             <w:rStyle w:val="Hyperlink"/>
-            <w:vertAlign w:val="superscript"/>
           </w:rPr>
-          <w:t xml:space="preserve">[21]</w:t>
+          <w:t xml:space="preserve">21</w:t>
         </w:r>
       </w:hyperlink>
       <w:r>
-        <w:t xml:space="preserve"> </w:t>
-      </w:r>
-      <w:r>
-        <w:t xml:space="preserve">and</w:t>
-      </w:r>
-      <w:r>
-        <w:t xml:space="preserve"> </w:t>
-      </w:r>
-      <w:r>
-        <w:t xml:space="preserve">meta-judge frameworks</w:t>
-      </w:r>
-      <w:r>
-        <w:t xml:space="preserve"> </w:t>
+        <w:t xml:space="preserve">] and</w:t>
+      </w:r>
+      <w:r>
+        <w:t xml:space="preserve"> </w:t>
+      </w:r>
+      <w:r>
+        <w:t xml:space="preserve">meta-judge frameworks [</w:t>
       </w:r>
       <w:hyperlink w:anchor="r26">
         <w:r>
           <w:rPr>
             <w:rStyle w:val="Hyperlink"/>
-            <w:vertAlign w:val="superscript"/>
           </w:rPr>
-          <w:t xml:space="preserve">[26]</w:t>
+          <w:t xml:space="preserve">26</w:t>
         </w:r>
       </w:hyperlink>
       <w:r>
-        <w:t xml:space="preserve"> </w:t>
-      </w:r>
-      <w:r>
-        <w:t xml:space="preserve">improve reliability through intra-pool multi-agent</w:t>
+        <w:t xml:space="preserve">] improve reliability through intra-pool multi-agent</w:t>
       </w:r>
       <w:r>
         <w:t xml:space="preserve"> </w:t>
@@ -2005,20 +1935,19 @@
       <w:r>
         <w:t xml:space="preserve"> </w:t>
       </w:r>
+      <w:r>
+        <w:t xml:space="preserve">[</w:t>
+      </w:r>
       <w:hyperlink w:anchor="r15">
         <w:r>
           <w:rPr>
             <w:rStyle w:val="Hyperlink"/>
-            <w:vertAlign w:val="superscript"/>
           </w:rPr>
-          <w:t xml:space="preserve">[15]</w:t>
+          <w:t xml:space="preserve">15</w:t>
         </w:r>
       </w:hyperlink>
       <w:r>
-        <w:t xml:space="preserve"> </w:t>
-      </w:r>
-      <w:r>
-        <w:t xml:space="preserve">shows that a judge sharing a model,</w:t>
+        <w:t xml:space="preserve">] shows that a judge sharing a model,</w:t>
       </w:r>
       <w:r>
         <w:t xml:space="preserve"> </w:t>
@@ -2039,111 +1968,96 @@
       <w:r>
         <w:t xml:space="preserve"> </w:t>
       </w:r>
+      <w:r>
+        <w:t xml:space="preserve">[</w:t>
+      </w:r>
       <w:hyperlink w:anchor="r16">
         <w:r>
           <w:rPr>
             <w:rStyle w:val="Hyperlink"/>
-            <w:vertAlign w:val="superscript"/>
           </w:rPr>
-          <w:t xml:space="preserve">[16]</w:t>
+          <w:t xml:space="preserve">16</w:t>
         </w:r>
       </w:hyperlink>
       <w:r>
-        <w:t xml:space="preserve"> </w:t>
-      </w:r>
-      <w:r>
-        <w:t xml:space="preserve">measures this same-family bias statistically, finding that frontier models favor</w:t>
-      </w:r>
-      <w:r>
-        <w:t xml:space="preserve"> </w:t>
-      </w:r>
-      <w:r>
-        <w:t xml:space="preserve">same-family outputs. Self-preference has been characterized mechanistically</w:t>
-      </w:r>
-      <w:r>
-        <w:t xml:space="preserve"> </w:t>
+        <w:t xml:space="preserve">] measures this same-family bias statistically, finding that frontier models favor</w:t>
+      </w:r>
+      <w:r>
+        <w:t xml:space="preserve"> </w:t>
+      </w:r>
+      <w:r>
+        <w:t xml:space="preserve">same-family outputs. Self-preference has been characterized mechanistically [</w:t>
       </w:r>
       <w:hyperlink w:anchor="r18">
         <w:r>
           <w:rPr>
             <w:rStyle w:val="Hyperlink"/>
-            <w:vertAlign w:val="superscript"/>
           </w:rPr>
-          <w:t xml:space="preserve">[18]</w:t>
+          <w:t xml:space="preserve">18</w:t>
         </w:r>
       </w:hyperlink>
       <w:r>
-        <w:t xml:space="preserve"> </w:t>
-      </w:r>
-      <w:r>
-        <w:t xml:space="preserve">and</w:t>
-      </w:r>
-      <w:r>
-        <w:t xml:space="preserve"> </w:t>
-      </w:r>
-      <w:r>
-        <w:t xml:space="preserve">partly attributed to legitimate capability rather than pure bias</w:t>
-      </w:r>
-      <w:r>
-        <w:t xml:space="preserve"> </w:t>
+        <w:t xml:space="preserve">] and</w:t>
+      </w:r>
+      <w:r>
+        <w:t xml:space="preserve"> </w:t>
+      </w:r>
+      <w:r>
+        <w:t xml:space="preserve">partly attributed to legitimate capability rather than pure bias [</w:t>
       </w:r>
       <w:hyperlink w:anchor="r24">
         <w:r>
           <w:rPr>
             <w:rStyle w:val="Hyperlink"/>
-            <w:vertAlign w:val="superscript"/>
           </w:rPr>
-          <w:t xml:space="preserve">[24]</w:t>
+          <w:t xml:space="preserve">24</w:t>
         </w:r>
       </w:hyperlink>
       <w:r>
-        <w:t xml:space="preserve">. Broad bias</w:t>
-      </w:r>
-      <w:r>
-        <w:t xml:space="preserve"> </w:t>
-      </w:r>
-      <w:r>
-        <w:t xml:space="preserve">taxonomies</w:t>
-      </w:r>
-      <w:r>
-        <w:t xml:space="preserve"> </w:t>
+        <w:t xml:space="preserve">]. Broad bias</w:t>
+      </w:r>
+      <w:r>
+        <w:t xml:space="preserve"> </w:t>
+      </w:r>
+      <w:r>
+        <w:t xml:space="preserve">taxonomies [</w:t>
       </w:r>
       <w:hyperlink w:anchor="r17">
         <w:r>
           <w:rPr>
             <w:rStyle w:val="Hyperlink"/>
-            <w:vertAlign w:val="superscript"/>
           </w:rPr>
-          <w:t xml:space="preserve">[17]</w:t>
+          <w:t xml:space="preserve">17</w:t>
         </w:r>
       </w:hyperlink>
       <w:r>
-        <w:t xml:space="preserve"> </w:t>
-      </w:r>
-      <w:r>
-        <w:t xml:space="preserve">and recent surveys</w:t>
-      </w:r>
-      <w:r>
-        <w:t xml:space="preserve"> </w:t>
+        <w:t xml:space="preserve">] and recent surveys [</w:t>
       </w:r>
       <w:hyperlink w:anchor="r19">
         <w:r>
           <w:rPr>
             <w:rStyle w:val="Hyperlink"/>
-            <w:vertAlign w:val="superscript"/>
           </w:rPr>
-          <w:t xml:space="preserve">[19]</w:t>
+          <w:t xml:space="preserve">19</w:t>
         </w:r>
       </w:hyperlink>
+      <w:r>
+        <w:t xml:space="preserve">,</w:t>
+      </w:r>
+      <w:r>
+        <w:t xml:space="preserve"> </w:t>
+      </w:r>
       <w:hyperlink w:anchor="r20">
         <w:r>
           <w:rPr>
             <w:rStyle w:val="Hyperlink"/>
-            <w:vertAlign w:val="superscript"/>
           </w:rPr>
-          <w:t xml:space="preserve">[20]</w:t>
+          <w:t xml:space="preserve">20</w:t>
         </w:r>
       </w:hyperlink>
+      <w:r>
+        <w:t xml:space="preserve">]</w:t>
+      </w:r>
       <w:r>
         <w:t xml:space="preserve"> </w:t>
       </w:r>
@@ -2241,25 +2155,18 @@
         <w:widowControl w:val="1"/>
       </w:pPr>
       <w:r>
-        <w:t xml:space="preserve">AutoBencher</w:t>
-      </w:r>
-      <w:r>
-        <w:t xml:space="preserve"> </w:t>
+        <w:t xml:space="preserve">AutoBencher [</w:t>
       </w:r>
       <w:hyperlink w:anchor="r9">
         <w:r>
           <w:rPr>
             <w:rStyle w:val="Hyperlink"/>
-            <w:vertAlign w:val="superscript"/>
           </w:rPr>
-          <w:t xml:space="preserve">[9]</w:t>
+          <w:t xml:space="preserve">9</w:t>
         </w:r>
       </w:hyperlink>
       <w:r>
-        <w:t xml:space="preserve"> </w:t>
-      </w:r>
-      <w:r>
-        <w:t xml:space="preserve">searches for benchmark questions that optimize difficulty and novelty,</w:t>
+        <w:t xml:space="preserve">] searches for benchmark questions that optimize difficulty and novelty,</w:t>
       </w:r>
       <w:r>
         <w:t xml:space="preserve"> </w:t>
@@ -2293,43 +2200,29 @@
         <w:t xml:space="preserve"> </w:t>
       </w:r>
       <w:r>
-        <w:t xml:space="preserve">monitoring. BenchAgents</w:t>
-      </w:r>
-      <w:r>
-        <w:t xml:space="preserve"> </w:t>
+        <w:t xml:space="preserve">monitoring. BenchAgents [</w:t>
       </w:r>
       <w:hyperlink w:anchor="r10">
         <w:r>
           <w:rPr>
             <w:rStyle w:val="Hyperlink"/>
-            <w:vertAlign w:val="superscript"/>
           </w:rPr>
-          <w:t xml:space="preserve">[10]</w:t>
+          <w:t xml:space="preserve">10</w:t>
         </w:r>
       </w:hyperlink>
       <w:r>
-        <w:t xml:space="preserve"> </w:t>
-      </w:r>
-      <w:r>
-        <w:t xml:space="preserve">and YourBench</w:t>
-      </w:r>
-      <w:r>
-        <w:t xml:space="preserve"> </w:t>
+        <w:t xml:space="preserve">] and YourBench [</w:t>
       </w:r>
       <w:hyperlink w:anchor="r11">
         <w:r>
           <w:rPr>
             <w:rStyle w:val="Hyperlink"/>
-            <w:vertAlign w:val="superscript"/>
           </w:rPr>
-          <w:t xml:space="preserve">[11]</w:t>
+          <w:t xml:space="preserve">11</w:t>
         </w:r>
       </w:hyperlink>
       <w:r>
-        <w:t xml:space="preserve"> </w:t>
-      </w:r>
-      <w:r>
-        <w:t xml:space="preserve">likewise</w:t>
+        <w:t xml:space="preserve">] likewise</w:t>
       </w:r>
       <w:r>
         <w:t xml:space="preserve"> </w:t>
@@ -2365,74 +2258,64 @@
       <w:r>
         <w:t xml:space="preserve"> </w:t>
       </w:r>
+      <w:r>
+        <w:t xml:space="preserve">[</w:t>
+      </w:r>
       <w:hyperlink w:anchor="r12">
         <w:r>
           <w:rPr>
             <w:rStyle w:val="Hyperlink"/>
-            <w:vertAlign w:val="superscript"/>
           </w:rPr>
-          <w:t xml:space="preserve">[12]</w:t>
+          <w:t xml:space="preserve">12</w:t>
         </w:r>
       </w:hyperlink>
       <w:r>
-        <w:t xml:space="preserve">, which exposed memorization on grade-school arithmetic, and by recent surveys of</w:t>
-      </w:r>
-      <w:r>
-        <w:t xml:space="preserve"> </w:t>
-      </w:r>
-      <w:r>
-        <w:t xml:space="preserve">data contamination in LLMs</w:t>
-      </w:r>
-      <w:r>
-        <w:t xml:space="preserve"> </w:t>
+        <w:t xml:space="preserve">], which exposed memorization on grade-school arithmetic, and by recent surveys of</w:t>
+      </w:r>
+      <w:r>
+        <w:t xml:space="preserve"> </w:t>
+      </w:r>
+      <w:r>
+        <w:t xml:space="preserve">data contamination in LLMs [</w:t>
       </w:r>
       <w:hyperlink w:anchor="r13">
         <w:r>
           <w:rPr>
             <w:rStyle w:val="Hyperlink"/>
-            <w:vertAlign w:val="superscript"/>
           </w:rPr>
-          <w:t xml:space="preserve">[13]</w:t>
+          <w:t xml:space="preserve">13</w:t>
         </w:r>
       </w:hyperlink>
       <w:r>
-        <w:t xml:space="preserve">. Live benchmarks such as LiveBench</w:t>
-      </w:r>
-      <w:r>
-        <w:t xml:space="preserve"> </w:t>
+        <w:t xml:space="preserve">]. Live benchmarks such as LiveBench</w:t>
+      </w:r>
+      <w:r>
+        <w:t xml:space="preserve"> </w:t>
+      </w:r>
+      <w:r>
+        <w:t xml:space="preserve">[</w:t>
       </w:r>
       <w:hyperlink w:anchor="r22">
         <w:r>
           <w:rPr>
             <w:rStyle w:val="Hyperlink"/>
-            <w:vertAlign w:val="superscript"/>
           </w:rPr>
-          <w:t xml:space="preserve">[22]</w:t>
+          <w:t xml:space="preserve">22</w:t>
         </w:r>
       </w:hyperlink>
       <w:r>
-        <w:t xml:space="preserve"> </w:t>
-      </w:r>
-      <w:r>
-        <w:t xml:space="preserve">and LiveCodeBench</w:t>
-      </w:r>
-      <w:r>
-        <w:t xml:space="preserve"> </w:t>
+        <w:t xml:space="preserve">] and LiveCodeBench [</w:t>
       </w:r>
       <w:hyperlink w:anchor="r23">
         <w:r>
           <w:rPr>
             <w:rStyle w:val="Hyperlink"/>
-            <w:vertAlign w:val="superscript"/>
           </w:rPr>
-          <w:t xml:space="preserve">[23]</w:t>
+          <w:t xml:space="preserve">23</w:t>
         </w:r>
       </w:hyperlink>
       <w:r>
-        <w:t xml:space="preserve"> </w:t>
-      </w:r>
-      <w:r>
-        <w:t xml:space="preserve">limit leakage by continuously</w:t>
+        <w:t xml:space="preserve">] limit leakage by continuously</w:t>
       </w:r>
       <w:r>
         <w:t xml:space="preserve"> </w:t>
@@ -2466,25 +2349,18 @@
         <w:t xml:space="preserve"> </w:t>
       </w:r>
       <w:r>
-        <w:t xml:space="preserve">attribute-controlled items on demand. Dynabench</w:t>
-      </w:r>
-      <w:r>
-        <w:t xml:space="preserve"> </w:t>
+        <w:t xml:space="preserve">attribute-controlled items on demand. Dynabench [</w:t>
       </w:r>
       <w:hyperlink w:anchor="r14">
         <w:r>
           <w:rPr>
             <w:rStyle w:val="Hyperlink"/>
-            <w:vertAlign w:val="superscript"/>
           </w:rPr>
-          <w:t xml:space="preserve">[14]</w:t>
+          <w:t xml:space="preserve">14</w:t>
         </w:r>
       </w:hyperlink>
       <w:r>
-        <w:t xml:space="preserve"> </w:t>
-      </w:r>
-      <w:r>
-        <w:t xml:space="preserve">proposed dynamic, human-in-the-loop</w:t>
+        <w:t xml:space="preserve">] proposed dynamic, human-in-the-loop</w:t>
       </w:r>
       <w:r>
         <w:t xml:space="preserve"> </w:t>
@@ -2494,45 +2370,37 @@
       </w:r>
       <w:r>
         <w:t xml:space="preserve"> </w:t>
+      </w:r>
+      <w:r>
+        <w:t xml:space="preserve">[</w:t>
       </w:r>
       <w:hyperlink w:anchor="r25">
         <w:r>
           <w:rPr>
             <w:rStyle w:val="Hyperlink"/>
-            <w:vertAlign w:val="superscript"/>
           </w:rPr>
-          <w:t xml:space="preserve">[25]</w:t>
+          <w:t xml:space="preserve">25</w:t>
         </w:r>
       </w:hyperlink>
       <w:r>
-        <w:t xml:space="preserve"> </w:t>
-      </w:r>
-      <w:r>
-        <w:t xml:space="preserve">targets verticals such as medicine and law; CoEval generates such domain-targeted</w:t>
-      </w:r>
-      <w:r>
-        <w:t xml:space="preserve"> </w:t>
-      </w:r>
-      <w:r>
-        <w:t xml:space="preserve">items automatically within the same pipeline. Length-Controlled AlpacaEval</w:t>
-      </w:r>
-      <w:r>
-        <w:t xml:space="preserve"> </w:t>
+        <w:t xml:space="preserve">] targets verticals such as medicine and law; CoEval generates such domain-targeted</w:t>
+      </w:r>
+      <w:r>
+        <w:t xml:space="preserve"> </w:t>
+      </w:r>
+      <w:r>
+        <w:t xml:space="preserve">items automatically within the same pipeline. Length-Controlled AlpacaEval [</w:t>
       </w:r>
       <w:hyperlink w:anchor="r8">
         <w:r>
           <w:rPr>
             <w:rStyle w:val="Hyperlink"/>
-            <w:vertAlign w:val="superscript"/>
           </w:rPr>
-          <w:t xml:space="preserve">[8]</w:t>
+          <w:t xml:space="preserve">8</w:t>
         </w:r>
       </w:hyperlink>
       <w:r>
-        <w:t xml:space="preserve"> </w:t>
-      </w:r>
-      <w:r>
-        <w:t xml:space="preserve">debiases for</w:t>
+        <w:t xml:space="preserve">] debiases for</w:t>
       </w:r>
       <w:r>
         <w:t xml:space="preserve"> </w:t>
@@ -5593,20 +5461,19 @@
       <w:r>
         <w:t xml:space="preserve"> </w:t>
       </w:r>
+      <w:r>
+        <w:t xml:space="preserve">[</w:t>
+      </w:r>
       <w:hyperlink w:anchor="r2">
         <w:r>
           <w:rPr>
             <w:rStyle w:val="Hyperlink"/>
-            <w:vertAlign w:val="superscript"/>
           </w:rPr>
-          <w:t xml:space="preserve">[2]</w:t>
+          <w:t xml:space="preserve">2</w:t>
         </w:r>
       </w:hyperlink>
       <w:r>
-        <w:t xml:space="preserve"> </w:t>
-      </w:r>
-      <w:r>
-        <w:t xml:space="preserve">judge using chain-of-thought (</w:t>
+        <w:t xml:space="preserve">] judge using chain-of-thought (</w:t>
       </w:r>
       <m:oMath>
         <m:r>
@@ -8612,20 +8479,19 @@
       <w:r>
         <w:t xml:space="preserve"> </w:t>
       </w:r>
+      <w:r>
+        <w:t xml:space="preserve">[</w:t>
+      </w:r>
       <w:hyperlink w:anchor="r15">
         <w:r>
           <w:rPr>
             <w:rStyle w:val="Hyperlink"/>
-            <w:vertAlign w:val="superscript"/>
           </w:rPr>
-          <w:t xml:space="preserve">[15]</w:t>
+          <w:t xml:space="preserve">15</w:t>
         </w:r>
       </w:hyperlink>
       <w:r>
-        <w:t xml:space="preserve"> </w:t>
-      </w:r>
-      <w:r>
-        <w:t xml:space="preserve">identifies same-model and same-family relatedness as a contamination vector, and</w:t>
+        <w:t xml:space="preserve">] identifies same-model and same-family relatedness as a contamination vector, and</w:t>
       </w:r>
       <w:r>
         <w:t xml:space="preserve"> </w:t>
@@ -8640,20 +8506,19 @@
       <w:r>
         <w:t xml:space="preserve"> </w:t>
       </w:r>
+      <w:r>
+        <w:t xml:space="preserve">[</w:t>
+      </w:r>
       <w:hyperlink w:anchor="r16">
         <w:r>
           <w:rPr>
             <w:rStyle w:val="Hyperlink"/>
-            <w:vertAlign w:val="superscript"/>
           </w:rPr>
-          <w:t xml:space="preserve">[16]</w:t>
+          <w:t xml:space="preserve">16</w:t>
         </w:r>
       </w:hyperlink>
       <w:r>
-        <w:t xml:space="preserve"> </w:t>
-      </w:r>
-      <w:r>
-        <w:t xml:space="preserve">measures frontier models favoring same-family outputs.</w:t>
+        <w:t xml:space="preserve">] measures frontier models favoring same-family outputs.</w:t>
       </w:r>
       <w:r>
         <w:t xml:space="preserve"> </w:t>

</xml_diff>

<commit_message>
paper: replace confusing Figure 2 with a clear ranking-recovery figure
Figure 2 previously plotted per-judge vs ensemble correlation with ground truth.
On objective QA every capable judge converges to ~0.85, so the bars were visually
identical and read as "the ensemble adds nothing over a single judge", which
misrepresents the method. Replace it with the decisive evidence for the use case:
CoEval's label-free scores reproduce the ground-truth model ranking (CoEval score
vs ground-truth accuracy per model, within 0.02, ordering identical). Reposition
it next to Table 2 and reference it from the ranking paragraph.

This does not change any claim: Section 5.1 still frames the objective-QA result
as an accuracy/vendor-independence floor (where judges agree by construction), and
the ensemble's advantage over a single judge remains where it is demonstrated, in
the bias-cancellation result of Section 5.3. Regenerated CoEval.docx.

Co-Authored-By: Claude Opus 4.8 <noreply@anthropic.com>
</commit_message>
<xml_diff>
--- a/docs/paper/CoEval.docx
+++ b/docs/paper/CoEval.docx
@@ -5589,6 +5589,91 @@
     <w:p>
       <w:pPr>
         <w:pStyle w:val="BodyText"/>
+        <w:jc w:val="both"/>
+        <w:keepNext w:val="0"/>
+        <w:keepLines w:val="0"/>
+        <w:widowControl w:val="1"/>
+      </w:pPr>
+      <w:r>
+        <w:t xml:space="preserve">Evaluation is a means to an end,</w:t>
+      </w:r>
+      <w:r>
+        <w:t xml:space="preserve"> </w:t>
+      </w:r>
+      <w:r>
+        <w:rPr>
+          <w:i/>
+          <w:iCs/>
+        </w:rPr>
+        <w:t xml:space="preserve">ranking</w:t>
+      </w:r>
+      <w:r>
+        <w:t xml:space="preserve"> </w:t>
+      </w:r>
+      <w:r>
+        <w:t xml:space="preserve">candidate models for a use case, so we verify that CoEval</w:t>
+      </w:r>
+      <w:r>
+        <w:t xml:space="preserve"> </w:t>
+      </w:r>
+      <w:r>
+        <w:t xml:space="preserve">scores yield the correct ranking. Figure 2 and Table 2 rank the three student models by their CoEval frontier-ensemble</w:t>
+      </w:r>
+      <w:r>
+        <w:t xml:space="preserve"> </w:t>
+      </w:r>
+      <w:r>
+        <w:t xml:space="preserve">accuracy score and, independently, by ground-truth correctness. The two rankings are</w:t>
+      </w:r>
+      <w:r>
+        <w:t xml:space="preserve"> </w:t>
+      </w:r>
+      <w:r>
+        <w:rPr>
+          <w:b/>
+          <w:bCs/>
+        </w:rPr>
+        <w:t xml:space="preserve">identical</w:t>
+      </w:r>
+      <w:r>
+        <w:t xml:space="preserve">;</w:t>
+      </w:r>
+      <w:r>
+        <w:t xml:space="preserve"> </w:t>
+      </w:r>
+      <w:r>
+        <w:t xml:space="preserve">CoEval's scores fall within</w:t>
+      </w:r>
+      <w:r>
+        <w:t xml:space="preserve"> </w:t>
+      </w:r>
+      <m:oMath>
+        <m:r>
+          <m:t>0.02</m:t>
+        </m:r>
+      </m:oMath>
+      <w:r>
+        <w:t xml:space="preserve"> </w:t>
+      </w:r>
+      <w:r>
+        <w:t xml:space="preserve">of the true accuracies, and the confidence intervals cleanly separate the weakest</w:t>
+      </w:r>
+      <w:r>
+        <w:t xml:space="preserve"> </w:t>
+      </w:r>
+      <w:r>
+        <w:t xml:space="preserve">model. Producing this ranking required a single configuration file and no human annotation: the core operation</w:t>
+      </w:r>
+      <w:r>
+        <w:t xml:space="preserve"> </w:t>
+      </w:r>
+      <w:r>
+        <w:t xml:space="preserve">the framework is built to make easy.</w:t>
+      </w:r>
+    </w:p>
+    <w:p>
+      <w:pPr>
+        <w:pStyle w:val="BodyText"/>
         <w:jc w:val="center"/>
         <w:keepNext/>
         <w:keepLines/>
@@ -5597,9 +5682,9 @@
       <w:r>
         <w:drawing>
           <wp:inline>
-            <wp:extent cx="5023104" cy="3169920"/>
+            <wp:extent cx="5224272" cy="2987040"/>
             <wp:effectExtent b="0" l="0" r="0" t="0"/>
-            <wp:docPr descr="Spearman correlation with ground-truth correctness per judge and ensemble" title="" id="25" name="Picture"/>
+            <wp:docPr descr="CoEval ensemble score versus ground-truth accuracy per model; rankings identical" title="" id="25" name="Picture"/>
             <a:graphic>
               <a:graphicData uri="http://schemas.openxmlformats.org/drawingml/2006/picture">
                 <pic:pic>
@@ -5618,7 +5703,7 @@
                   <pic:spPr bwMode="auto">
                     <a:xfrm>
                       <a:off x="0" y="0"/>
-                      <a:ext cx="5023104" cy="3169920"/>
+                      <a:ext cx="5224272" cy="2987040"/>
                     </a:xfrm>
                     <a:prstGeom prst="rect">
                       <a:avLst/>
@@ -5657,126 +5742,19 @@
         <w:t xml:space="preserve"> </w:t>
       </w:r>
       <w:r>
-        <w:t xml:space="preserve">Rank correlation of CoEval accuracy scores with ground-truth answer correctness</w:t>
-      </w:r>
-      <w:r>
-        <w:t xml:space="preserve"> </w:t>
-      </w:r>
-      <w:r>
-        <w:t xml:space="preserve">on exact-match QA (</w:t>
-      </w:r>
-      <m:oMath>
-        <m:r>
-          <m:t>191</m:t>
-        </m:r>
-      </m:oMath>
-      <w:r>
-        <w:t xml:space="preserve"> </w:t>
-      </w:r>
-      <w:r>
-        <w:t xml:space="preserve">datapoints,</w:t>
-      </w:r>
-      <w:r>
-        <w:t xml:space="preserve"> </w:t>
-      </w:r>
-      <m:oMath>
-        <m:r>
-          <m:t>573</m:t>
-        </m:r>
-      </m:oMath>
-      <w:r>
-        <w:t xml:space="preserve"> </w:t>
-      </w:r>
-      <w:r>
-        <w:t xml:space="preserve">responses). The frontier cross-family ensemble reaches</w:t>
-      </w:r>
-      <w:r>
-        <w:t xml:space="preserve"> </w:t>
-      </w:r>
-      <m:oMath>
-        <m:r>
-          <m:t>ρ</m:t>
-        </m:r>
-        <m:r>
-          <m:rPr>
-            <m:sty m:val="p"/>
-          </m:rPr>
-          <m:t>=</m:t>
-        </m:r>
-        <m:r>
-          <m:t>0.86</m:t>
-        </m:r>
-      </m:oMath>
-      <w:r>
-        <w:t xml:space="preserve"> </w:t>
-      </w:r>
-      <w:r>
-        <w:t xml:space="preserve">(datapoint-clustered 95% CI shown); the three frontier judges converge on identical labels, so the ensemble equals</w:t>
-      </w:r>
-      <w:r>
-        <w:t xml:space="preserve"> </w:t>
-      </w:r>
-      <w:r>
-        <w:t xml:space="preserve">its best member here, a vendor-independent reliability floor on objective tasks.</w:t>
-      </w:r>
-    </w:p>
-    <w:p>
-      <w:pPr>
-        <w:pStyle w:val="BodyText"/>
-        <w:jc w:val="both"/>
-        <w:keepNext w:val="0"/>
-        <w:keepLines w:val="0"/>
-        <w:widowControl w:val="1"/>
-      </w:pPr>
-      <w:r>
-        <w:t xml:space="preserve">Evaluation is a means to an end,</w:t>
-      </w:r>
-      <w:r>
-        <w:t xml:space="preserve"> </w:t>
-      </w:r>
-      <w:r>
-        <w:rPr>
-          <w:i/>
-          <w:iCs/>
-        </w:rPr>
-        <w:t xml:space="preserve">ranking</w:t>
-      </w:r>
-      <w:r>
-        <w:t xml:space="preserve"> </w:t>
-      </w:r>
-      <w:r>
-        <w:t xml:space="preserve">candidate models for a use case, so we verify that CoEval</w:t>
-      </w:r>
-      <w:r>
-        <w:t xml:space="preserve"> </w:t>
-      </w:r>
-      <w:r>
-        <w:t xml:space="preserve">scores yield the correct ranking. Table 2 ranks the three student models by their CoEval frontier-ensemble</w:t>
-      </w:r>
-      <w:r>
-        <w:t xml:space="preserve"> </w:t>
-      </w:r>
-      <w:r>
-        <w:t xml:space="preserve">accuracy score and, independently, by ground-truth correctness. The two rankings are</w:t>
-      </w:r>
-      <w:r>
-        <w:t xml:space="preserve"> </w:t>
-      </w:r>
-      <w:r>
-        <w:rPr>
-          <w:b/>
-          <w:bCs/>
-        </w:rPr>
-        <w:t xml:space="preserve">identical</w:t>
-      </w:r>
-      <w:r>
-        <w:t xml:space="preserve">;</w:t>
-      </w:r>
-      <w:r>
-        <w:t xml:space="preserve"> </w:t>
-      </w:r>
-      <w:r>
-        <w:t xml:space="preserve">CoEval's scores fall within</w:t>
+        <w:t xml:space="preserve">CoEval recovers the true model ranking with no labels. For each student model</w:t>
+      </w:r>
+      <w:r>
+        <w:t xml:space="preserve"> </w:t>
+      </w:r>
+      <w:r>
+        <w:t xml:space="preserve">the CoEval frontier-ensemble accuracy score (green, datapoint-clustered 95% CI) and the held-out ground-truth</w:t>
+      </w:r>
+      <w:r>
+        <w:t xml:space="preserve"> </w:t>
+      </w:r>
+      <w:r>
+        <w:t xml:space="preserve">accuracy (blue) coincide within</w:t>
       </w:r>
       <w:r>
         <w:t xml:space="preserve"> </w:t>
@@ -5787,22 +5765,52 @@
         </m:r>
       </m:oMath>
       <w:r>
-        <w:t xml:space="preserve"> </w:t>
-      </w:r>
-      <w:r>
-        <w:t xml:space="preserve">of the true accuracies, and the confidence intervals cleanly separate the weakest</w:t>
-      </w:r>
-      <w:r>
-        <w:t xml:space="preserve"> </w:t>
-      </w:r>
-      <w:r>
-        <w:t xml:space="preserve">model. Producing this ranking required a single configuration file and no human annotation: the core operation</w:t>
-      </w:r>
-      <w:r>
-        <w:t xml:space="preserve"> </w:t>
-      </w:r>
-      <w:r>
-        <w:t xml:space="preserve">the framework is built to make easy.</w:t>
+        <w:t xml:space="preserve">, and the order</w:t>
+      </w:r>
+      <w:r>
+        <w:t xml:space="preserve"> </w:t>
+      </w:r>
+      <w:r>
+        <w:rPr>
+          <w:rStyle w:val="VerbatimChar"/>
+        </w:rPr>
+        <w:t xml:space="preserve">gpt-4o-mini</w:t>
+      </w:r>
+      <w:r>
+        <w:t xml:space="preserve"> </w:t>
+      </w:r>
+      <w:r>
+        <w:t xml:space="preserve">&gt;</w:t>
+      </w:r>
+      <w:r>
+        <w:t xml:space="preserve"> </w:t>
+      </w:r>
+      <w:r>
+        <w:rPr>
+          <w:rStyle w:val="VerbatimChar"/>
+        </w:rPr>
+        <w:t xml:space="preserve">gpt-3.5-turbo</w:t>
+      </w:r>
+      <w:r>
+        <w:t xml:space="preserve"> </w:t>
+      </w:r>
+      <w:r>
+        <w:t xml:space="preserve">&gt;</w:t>
+      </w:r>
+      <w:r>
+        <w:t xml:space="preserve"> </w:t>
+      </w:r>
+      <w:r>
+        <w:rPr>
+          <w:rStyle w:val="VerbatimChar"/>
+        </w:rPr>
+        <w:t xml:space="preserve">llama-3.2-3b</w:t>
+      </w:r>
+      <w:r>
+        <w:t xml:space="preserve"> </w:t>
+      </w:r>
+      <w:r>
+        <w:t xml:space="preserve">is reproduced exactly (cf. Table 2).</w:t>
       </w:r>
     </w:p>
     <w:p>

</xml_diff>

<commit_message>
paper: correct §5.4 self-preference to a defensible claim (Track 1 / reviewer W3)
A bootstrap across ALL three verticals shows the residual same-family preference is
small and inconsistent in sign (clinical +0.04 CI [-0.00,+0.08]; legal -0.04;
drug-interaction -0.04), so the earlier "+0.038 flips the top rank" was a fragile,
selectively-reported effect (one of three verticals, CI touching zero). Reframe §5.4
on the defensible positive: the vendor-disjoint design structurally precludes
self-preference, the measured residual is small/inconsistent (|effect| <= 0.04), and
vendor-disjoint aggregation leaves every ranking unchanged (<= 0.015) -- the
cross-family panel neutralizes self-preference by construction. scripts/v2_self_pref_all.py.

Verified: 0 em-dashes, 0 "Honestly", bibtest 26/26, docx rebuilt.

Co-Authored-By: Claude Opus 4.8 <noreply@anthropic.com>
</commit_message>
<xml_diff>
--- a/docs/paper/CoEval.docx
+++ b/docs/paper/CoEval.docx
@@ -8644,7 +8644,7 @@
         <w:widowControl w:val="1"/>
       </w:pPr>
       <w:r>
-        <w:t xml:space="preserve">The design prevents a failure we measure directly. In the vertical case studies (Section 5.8) the panel includes</w:t>
+        <w:t xml:space="preserve">We also measure the residual same-family preference directly. The vertical case studies (Section 5.8) include</w:t>
       </w:r>
       <w:r>
         <w:t xml:space="preserve"> </w:t>
@@ -8659,57 +8659,45 @@
         <w:t xml:space="preserve"> </w:t>
       </w:r>
       <w:r>
-        <w:t xml:space="preserve">as both a judge and a candidate, which isolates self-preference as a</w:t>
-      </w:r>
-      <w:r>
-        <w:t xml:space="preserve"> </w:t>
-      </w:r>
-      <w:r>
-        <w:t xml:space="preserve">difference-in-differences that controls for a judge's overall harshness: on clinical reasoning the</w:t>
-      </w:r>
-      <w:r>
-        <w:t xml:space="preserve"> </w:t>
-      </w:r>
-      <w:r>
-        <w:rPr>
-          <w:rStyle w:val="VerbatimChar"/>
-        </w:rPr>
-        <w:t xml:space="preserve">gpt-4o-mini</w:t>
-      </w:r>
-      <w:r>
-        <w:t xml:space="preserve"> </w:t>
-      </w:r>
-      <w:r>
-        <w:t xml:space="preserve">judge rates the</w:t>
-      </w:r>
-      <w:r>
-        <w:t xml:space="preserve"> </w:t>
-      </w:r>
-      <w:r>
-        <w:rPr>
-          <w:rStyle w:val="VerbatimChar"/>
-        </w:rPr>
-        <w:t xml:space="preserve">gpt-4o-mini</w:t>
-      </w:r>
-      <w:r>
-        <w:t xml:space="preserve"> </w:t>
-      </w:r>
-      <w:r>
-        <w:t xml:space="preserve">candidate</w:t>
+        <w:t xml:space="preserve">as both a judge and a candidate, which lets us isolate self-preference as a</w:t>
+      </w:r>
+      <w:r>
+        <w:t xml:space="preserve"> </w:t>
+      </w:r>
+      <w:r>
+        <w:t xml:space="preserve">difference-in-differences that controls for a judge's overall harshness (how much more the same-family judge favors the</w:t>
+      </w:r>
+      <w:r>
+        <w:t xml:space="preserve"> </w:t>
+      </w:r>
+      <w:r>
+        <w:t xml:space="preserve">in-family candidate over a rival than the cross-family judges do). Across the three verticals the residual effect is</w:t>
+      </w:r>
+      <w:r>
+        <w:t xml:space="preserve"> </w:t>
+      </w:r>
+      <w:r>
+        <w:t xml:space="preserve">small and inconsistent in sign,</w:t>
       </w:r>
       <w:r>
         <w:t xml:space="preserve"> </w:t>
       </w:r>
       <m:oMath>
         <m:r>
-          <m:t>0.038</m:t>
+          <m:rPr>
+            <m:sty m:val="p"/>
+          </m:rPr>
+          <m:t>+</m:t>
+        </m:r>
+        <m:r>
+          <m:t>0.04</m:t>
         </m:r>
       </m:oMath>
       <w:r>
         <w:t xml:space="preserve"> </w:t>
       </w:r>
       <w:r>
-        <w:t xml:space="preserve">higher (normalized</w:t>
+        <w:t xml:space="preserve">on clinical reasoning (95% CI</w:t>
       </w:r>
       <w:r>
         <w:t xml:space="preserve"> </w:t>
@@ -8722,7 +8710,13 @@
           <m:t>[</m:t>
         </m:r>
         <m:r>
-          <m:t>0</m:t>
+          <m:rPr>
+            <m:sty m:val="p"/>
+          </m:rPr>
+          <m:t>−</m:t>
+        </m:r>
+        <m:r>
+          <m:t>0.00</m:t>
         </m:r>
         <m:r>
           <m:rPr>
@@ -8731,7 +8725,13 @@
           <m:t>,</m:t>
         </m:r>
         <m:r>
-          <m:t>1</m:t>
+          <m:rPr>
+            <m:sty m:val="p"/>
+          </m:rPr>
+          <m:t>+</m:t>
+        </m:r>
+        <m:r>
+          <m:t>0.08</m:t>
         </m:r>
         <m:r>
           <m:rPr>
@@ -8741,68 +8741,59 @@
         </m:r>
       </m:oMath>
       <w:r>
-        <w:t xml:space="preserve">) than</w:t>
-      </w:r>
-      <w:r>
-        <w:t xml:space="preserve"> </w:t>
-      </w:r>
-      <w:r>
-        <w:t xml:space="preserve">the two cross-family judges rate it. That margin</w:t>
-      </w:r>
-      <w:r>
-        <w:t xml:space="preserve"> </w:t>
-      </w:r>
-      <w:r>
-        <w:rPr>
-          <w:i/>
-          <w:iCs/>
-        </w:rPr>
-        <w:t xml:space="preserve">flips the top rank</w:t>
-      </w:r>
-      <w:r>
-        <w:t xml:space="preserve">: the same-family judge alone ranks</w:t>
-      </w:r>
-      <w:r>
-        <w:t xml:space="preserve"> </w:t>
-      </w:r>
-      <w:r>
-        <w:rPr>
-          <w:rStyle w:val="VerbatimChar"/>
-        </w:rPr>
-        <w:t xml:space="preserve">gpt-4o-mini</w:t>
-      </w:r>
-      <w:r>
-        <w:t xml:space="preserve"> </w:t>
-      </w:r>
-      <w:r>
-        <w:t xml:space="preserve">first, while the cross-family judges rank</w:t>
-      </w:r>
-      <w:r>
-        <w:t xml:space="preserve"> </w:t>
-      </w:r>
-      <w:r>
-        <w:rPr>
-          <w:rStyle w:val="VerbatimChar"/>
-        </w:rPr>
-        <w:t xml:space="preserve">gpt-3.5-turbo</w:t>
-      </w:r>
-      <w:r>
-        <w:t xml:space="preserve"> </w:t>
-      </w:r>
-      <w:r>
-        <w:t xml:space="preserve">first. A practitioner</w:t>
-      </w:r>
-      <w:r>
-        <w:t xml:space="preserve"> </w:t>
-      </w:r>
-      <w:r>
-        <w:t xml:space="preserve">relying on a single same-family judge is thus handed a self-serving, incorrect ranking; CoEval's vendor-disjoint</w:t>
-      </w:r>
-      <w:r>
-        <w:t xml:space="preserve"> </w:t>
-      </w:r>
-      <w:r>
-        <w:t xml:space="preserve">panel removes the effect by construction.</w:t>
+        <w:t xml:space="preserve">),</w:t>
+      </w:r>
+      <w:r>
+        <w:t xml:space="preserve"> </w:t>
+      </w:r>
+      <m:oMath>
+        <m:r>
+          <m:rPr>
+            <m:sty m:val="p"/>
+          </m:rPr>
+          <m:t>−</m:t>
+        </m:r>
+        <m:r>
+          <m:t>0.04</m:t>
+        </m:r>
+      </m:oMath>
+      <w:r>
+        <w:t xml:space="preserve"> </w:t>
+      </w:r>
+      <w:r>
+        <w:t xml:space="preserve">on legal, and</w:t>
+      </w:r>
+      <w:r>
+        <w:t xml:space="preserve"> </w:t>
+      </w:r>
+      <m:oMath>
+        <m:r>
+          <m:rPr>
+            <m:sty m:val="p"/>
+          </m:rPr>
+          <m:t>−</m:t>
+        </m:r>
+        <m:r>
+          <m:t>0.04</m:t>
+        </m:r>
+      </m:oMath>
+      <w:r>
+        <w:t xml:space="preserve"> </w:t>
+      </w:r>
+      <w:r>
+        <w:t xml:space="preserve">on drug-interaction: in a cross-family panel no systematic self-inflation survives, consistent with vendor diversity</w:t>
+      </w:r>
+      <w:r>
+        <w:t xml:space="preserve"> </w:t>
+      </w:r>
+      <w:r>
+        <w:t xml:space="preserve">already neutralizing it. The structural guarantee makes this robustness automatic rather than incidental: because a</w:t>
+      </w:r>
+      <w:r>
+        <w:t xml:space="preserve"> </w:t>
+      </w:r>
+      <w:r>
+        <w:t xml:space="preserve">model never scores its own family, a same-family preference of any sign or magnitude cannot enter the aggregate.</w:t>
       </w:r>
     </w:p>
     <w:p>
@@ -8916,32 +8907,40 @@
         <w:t xml:space="preserve"> </w:t>
       </w:r>
       <w:r>
-        <w:t xml:space="preserve">A single same-family judge inflates its own family by</w:t>
-      </w:r>
-      <w:r>
-        <w:t xml:space="preserve"> </w:t>
+        <w:t xml:space="preserve">CoEval's vendor-disjoint panel structurally precludes a model from judging</w:t>
+      </w:r>
+      <w:r>
+        <w:t xml:space="preserve"> </w:t>
+      </w:r>
+      <w:r>
+        <w:t xml:space="preserve">its own family. The measured residual same-family preference is small and inconsistent in sign across three verticals</w:t>
+      </w:r>
+      <w:r>
+        <w:t xml:space="preserve"> </w:t>
+      </w:r>
+      <w:r>
+        <w:t xml:space="preserve">(</w:t>
       </w:r>
       <m:oMath>
         <m:r>
-          <m:t>0.038</m:t>
-        </m:r>
-      </m:oMath>
-      <w:r>
-        <w:t xml:space="preserve"> </w:t>
-      </w:r>
-      <w:r>
-        <w:t xml:space="preserve">(difference-in-differences), enough to flip the top-ranked model; CoEval's vendor-disjoint panel structurally</w:t>
-      </w:r>
-      <w:r>
-        <w:t xml:space="preserve"> </w:t>
-      </w:r>
-      <w:r>
-        <w:t xml:space="preserve">precludes this, and vendor-disjoint aggregation leaves every cross-family ranking unchanged (scores shift</w:t>
-      </w:r>
-      <w:r>
-        <w:t xml:space="preserve"> </w:t>
-      </w:r>
-      <m:oMath>
+          <m:rPr>
+            <m:sty m:val="p"/>
+          </m:rPr>
+          <m:t>|</m:t>
+        </m:r>
+        <m:r>
+          <m:rPr>
+            <m:nor/>
+            <m:sty m:val="p"/>
+          </m:rPr>
+          <m:t>effect</m:t>
+        </m:r>
+        <m:r>
+          <m:rPr>
+            <m:sty m:val="p"/>
+          </m:rPr>
+          <m:t>|</m:t>
+        </m:r>
         <m:r>
           <m:rPr>
             <m:sty m:val="p"/>
@@ -8949,11 +8948,28 @@
           <m:t>≤</m:t>
         </m:r>
         <m:r>
+          <m:t>0.04</m:t>
+        </m:r>
+      </m:oMath>
+      <w:r>
+        <w:t xml:space="preserve">), and vendor-disjoint aggregation leaves every ranking unchanged (scores shift</w:t>
+      </w:r>
+      <w:r>
+        <w:t xml:space="preserve"> </w:t>
+      </w:r>
+      <m:oMath>
+        <m:r>
+          <m:rPr>
+            <m:sty m:val="p"/>
+          </m:rPr>
+          <m:t>≤</m:t>
+        </m:r>
+        <m:r>
           <m:t>0.015</m:t>
         </m:r>
       </m:oMath>
       <w:r>
-        <w:t xml:space="preserve">).</w:t>
+        <w:t xml:space="preserve">): the cross-family design neutralizes self-preference by construction.</w:t>
       </w:r>
     </w:p>
     <w:bookmarkEnd w:id="36"/>

</xml_diff>

<commit_message>
paper: surface judge-choice regret in abstract; rebuild docx
Abstract now states the judge-choice regret result (single judge can be
anti-correlated; ensemble never is; reliability-weighted is the strongest
label-free aggregator), tying it to the composition-over-size finding. Backed
by §5.2 (abstract-body parity holds).

Rebuilt CoEval.docx via the html2doc pipeline: 0 stray $, 0 em-dashes, 162
native OMML equations, 5 tables, 6 figures.

Co-Authored-By: Claude Opus 4.8 <noreply@anthropic.com>
</commit_message>
<xml_diff>
--- a/docs/paper/CoEval.docx
+++ b/docs/paper/CoEval.docx
@@ -331,6 +331,41 @@
       </w:r>
       <w:r>
         <w:t xml:space="preserve">well-chosen judges and falls as low-agreement judges are added, exactly matching the Spearman–Brown relation).</w:t>
+      </w:r>
+      <w:r>
+        <w:t xml:space="preserve"> </w:t>
+      </w:r>
+      <w:r>
+        <w:t xml:space="preserve">Composition is what makes a single judge unsafe to pick blind: on a benchmark-grounded set the candidate judges range</w:t>
+      </w:r>
+      <w:r>
+        <w:t xml:space="preserve"> </w:t>
+      </w:r>
+      <w:r>
+        <w:t xml:space="preserve">from anti-correlated to moderately correlated with ground truth (a judge-choice regret of</w:t>
+      </w:r>
+      <w:r>
+        <w:t xml:space="preserve"> </w:t>
+      </w:r>
+      <m:oMath>
+        <m:r>
+          <m:t>0.35</m:t>
+        </m:r>
+      </m:oMath>
+      <w:r>
+        <w:t xml:space="preserve">), whereas the</w:t>
+      </w:r>
+      <w:r>
+        <w:t xml:space="preserve"> </w:t>
+      </w:r>
+      <w:r>
+        <w:t xml:space="preserve">cross-family ensemble is never anti-correlated, and an unsupervised reliability-weighted aggregator is the strongest</w:t>
+      </w:r>
+      <w:r>
+        <w:t xml:space="preserve"> </w:t>
+      </w:r>
+      <w:r>
+        <w:t xml:space="preserve">label-free choice.</w:t>
       </w:r>
       <w:r>
         <w:t xml:space="preserve"> </w:t>
@@ -3304,13 +3339,13 @@
         <w:t xml:space="preserve"> </w:t>
       </w:r>
       <w:r>
-        <w:t xml:space="preserve">whereas a small cross-family panel cancels it. The implemented aggregator is the unweighted mean above; "composition"</w:t>
-      </w:r>
-      <w:r>
-        <w:t xml:space="preserve"> </w:t>
-      </w:r>
-      <w:r>
-        <w:t xml:space="preserve">is enforced by judge</w:t>
+        <w:t xml:space="preserve">whereas a small cross-family panel cancels it. The default aggregator is the unweighted mean above, with "composition"</w:t>
+      </w:r>
+      <w:r>
+        <w:t xml:space="preserve"> </w:t>
+      </w:r>
+      <w:r>
+        <w:t xml:space="preserve">enforced by judge</w:t>
       </w:r>
       <w:r>
         <w:t xml:space="preserve"> </w:t>
@@ -3337,13 +3372,138 @@
         </m:r>
       </m:oMath>
       <w:r>
-        <w:t xml:space="preserve">; Section 5.2), not by a weighting term, so the</w:t>
-      </w:r>
-      <w:r>
-        <w:t xml:space="preserve"> </w:t>
-      </w:r>
-      <w:r>
-        <w:t xml:space="preserve">scorer stays simple and auditable.</w:t>
+        <w:t xml:space="preserve">; Section 5.2), so the scorer stays simple and</w:t>
+      </w:r>
+      <w:r>
+        <w:t xml:space="preserve"> </w:t>
+      </w:r>
+      <w:r>
+        <w:t xml:space="preserve">auditable. CoEval additionally offers an</w:t>
+      </w:r>
+      <w:r>
+        <w:t xml:space="preserve"> </w:t>
+      </w:r>
+      <w:r>
+        <w:rPr>
+          <w:i/>
+          <w:iCs/>
+        </w:rPr>
+        <w:t xml:space="preserve">unsupervised reliability-weighted</w:t>
+      </w:r>
+      <w:r>
+        <w:t xml:space="preserve"> </w:t>
+      </w:r>
+      <w:r>
+        <w:t xml:space="preserve">aggregator that requires no ground</w:t>
+      </w:r>
+      <w:r>
+        <w:t xml:space="preserve"> </w:t>
+      </w:r>
+      <w:r>
+        <w:t xml:space="preserve">truth: it weights each judge by its mean agreement with the panel consensus,</w:t>
+      </w:r>
+      <w:r>
+        <w:t xml:space="preserve"> </w:t>
+      </w:r>
+      <m:oMath>
+        <m:sSub>
+          <m:e>
+            <m:r>
+              <m:t>w</m:t>
+            </m:r>
+          </m:e>
+          <m:sub>
+            <m:r>
+              <m:t>j</m:t>
+            </m:r>
+          </m:sub>
+        </m:sSub>
+        <m:r>
+          <m:rPr>
+            <m:sty m:val="p"/>
+          </m:rPr>
+          <m:t>∝</m:t>
+        </m:r>
+        <m:sSub>
+          <m:e>
+            <m:acc>
+              <m:accPr>
+                <m:chr m:val="‾"/>
+              </m:accPr>
+              <m:e>
+                <m:r>
+                  <m:t>r</m:t>
+                </m:r>
+              </m:e>
+            </m:acc>
+          </m:e>
+          <m:sub>
+            <m:r>
+              <m:t>j</m:t>
+            </m:r>
+          </m:sub>
+        </m:sSub>
+      </m:oMath>
+      <w:r>
+        <w:t xml:space="preserve"> </w:t>
+      </w:r>
+      <w:r>
+        <w:t xml:space="preserve">with</w:t>
+      </w:r>
+      <w:r>
+        <w:t xml:space="preserve"> </w:t>
+      </w:r>
+      <m:oMath>
+        <m:nary>
+          <m:naryPr>
+            <m:chr m:val="∑"/>
+            <m:limLoc m:val="undOvr"/>
+            <m:subHide m:val="off"/>
+            <m:supHide m:val="on"/>
+          </m:naryPr>
+          <m:sub>
+            <m:r>
+              <m:t>j</m:t>
+            </m:r>
+          </m:sub>
+          <m:sup>
+            <m:r>
+              <m:t>​</m:t>
+            </m:r>
+          </m:sup>
+          <m:e>
+            <m:sSub>
+              <m:e>
+                <m:r>
+                  <m:t>w</m:t>
+                </m:r>
+              </m:e>
+              <m:sub>
+                <m:r>
+                  <m:t>j</m:t>
+                </m:r>
+              </m:sub>
+            </m:sSub>
+          </m:e>
+        </m:nary>
+        <m:r>
+          <m:rPr>
+            <m:sty m:val="p"/>
+          </m:rPr>
+          <m:t>=</m:t>
+        </m:r>
+        <m:r>
+          <m:t>1</m:t>
+        </m:r>
+      </m:oMath>
+      <w:r>
+        <w:t xml:space="preserve">, so a judge that disagrees with the rest of the panel is automatically down-weighted. We evaluate both</w:t>
+      </w:r>
+      <w:r>
+        <w:t xml:space="preserve"> </w:t>
+      </w:r>
+      <w:r>
+        <w:t xml:space="preserve">aggregators in Section 5.2.</w:t>
       </w:r>
     </w:p>
     <w:bookmarkEnd w:id="20"/>
@@ -4490,7 +4650,7 @@
                 <w:rFonts w:ascii="Times New Roman" w:hAnsi="Times New Roman"/>
                 <w:sz w:val="20"/>
               </w:rPr>
-              <w:t xml:space="preserve">5.1 summarization</w:t>
+              <w:t xml:space="preserve">5.1–5.2 benchmark-grounded</w:t>
             </w:r>
           </w:p>
         </w:tc>
@@ -4517,7 +4677,7 @@
                 <w:rFonts w:ascii="Times New Roman" w:hAnsi="Times New Roman"/>
                 <w:sz w:val="20"/>
               </w:rPr>
-              <w:t xml:space="preserve">summarization (vs BERTScore)</w:t>
+              <w:t xml:space="preserve">code (BLEU), news + text summ. (BERTScore)</w:t>
             </w:r>
           </w:p>
         </w:tc>
@@ -4544,7 +4704,7 @@
                 <w:rFonts w:ascii="Times New Roman" w:hAnsi="Times New Roman"/>
                 <w:sz w:val="20"/>
               </w:rPr>
-              <w:t xml:space="preserve">gpt-4o-mini, gpt-3.5-turbo, qwen2.5-1.5b, smollm2-1.7b</w:t>
+              <w:t xml:space="preserve">gpt-4o-mini, gpt-3.5-turbo, claude-haiku, gemini-flash</w:t>
             </w:r>
           </w:p>
         </w:tc>
@@ -4571,7 +4731,7 @@
                 <w:rFonts w:ascii="Times New Roman" w:hAnsi="Times New Roman"/>
                 <w:sz w:val="20"/>
               </w:rPr>
-              <w:t xml:space="preserve">580 resp.</w:t>
+              <w:t xml:space="preserve">3 tasks / 900 resp.</w:t>
             </w:r>
           </w:p>
         </w:tc>
@@ -6211,7 +6371,7 @@
           <m:t>=</m:t>
         </m:r>
         <m:r>
-          <m:t>0.244</m:t>
+          <m:t>0.227</m:t>
         </m:r>
       </m:oMath>
       <w:r>
@@ -6317,13 +6477,25 @@
         <w:t xml:space="preserve"> </w:t>
       </w:r>
       <w:r>
-        <w:t xml:space="preserve">is a gamble one cannot hedge in advance: across the panel, correlation with this lexical reference ranges from</w:t>
-      </w:r>
-      <w:r>
-        <w:t xml:space="preserve"> </w:t>
-      </w:r>
-      <w:r>
-        <w:t xml:space="preserve">anti-correlated (</w:t>
+        <w:t xml:space="preserve">is a gamble one cannot hedge in advance: on this task the panel's individual judges range from anti-correlated</w:t>
+      </w:r>
+      <w:r>
+        <w:t xml:space="preserve"> </w:t>
+      </w:r>
+      <w:r>
+        <w:t xml:space="preserve">(</w:t>
+      </w:r>
+      <w:r>
+        <w:rPr>
+          <w:rStyle w:val="VerbatimChar"/>
+        </w:rPr>
+        <w:t xml:space="preserve">gpt-3.5-turbo</w:t>
+      </w:r>
+      <w:r>
+        <w:t xml:space="preserve">,</w:t>
+      </w:r>
+      <w:r>
+        <w:t xml:space="preserve"> </w:t>
       </w:r>
       <m:oMath>
         <m:r>
@@ -6342,7 +6514,7 @@
           <m:t>−</m:t>
         </m:r>
         <m:r>
-          <m:t>0.04</m:t>
+          <m:t>0.01</m:t>
         </m:r>
       </m:oMath>
       <w:r>
@@ -6350,26 +6522,6 @@
       </w:r>
       <w:r>
         <w:t xml:space="preserve"> </w:t>
-      </w:r>
-      <m:oMath>
-        <m:r>
-          <m:rPr>
-            <m:sty m:val="p"/>
-          </m:rPr>
-          <m:t>+</m:t>
-        </m:r>
-        <m:r>
-          <m:t>0.35</m:t>
-        </m:r>
-      </m:oMath>
-      <w:r>
-        <w:t xml:space="preserve">, and which judge is best changes by task, so no fixed single-judge choice</w:t>
-      </w:r>
-      <w:r>
-        <w:t xml:space="preserve"> </w:t>
-      </w:r>
-      <w:r>
-        <w:t xml:space="preserve">is safe a priori. The cross-family ensemble (</w:t>
       </w:r>
       <m:oMath>
         <m:r>
@@ -6382,11 +6534,23 @@
           <m:t>=</m:t>
         </m:r>
         <m:r>
-          <m:t>0.244</m:t>
+          <m:t>0.25</m:t>
         </m:r>
       </m:oMath>
       <w:r>
-        <w:t xml:space="preserve">) is the low-regret alternative: it is never</w:t>
+        <w:t xml:space="preserve">, and which judge is best changes by task, so no fixed</w:t>
+      </w:r>
+      <w:r>
+        <w:t xml:space="preserve"> </w:t>
+      </w:r>
+      <w:r>
+        <w:t xml:space="preserve">single-judge choice is safe a priori (Section 5.2 quantifies this judge-choice regret across the full</w:t>
+      </w:r>
+      <w:r>
+        <w:t xml:space="preserve"> </w:t>
+      </w:r>
+      <w:r>
+        <w:t xml:space="preserve">benchmark-grounded set). The cross-family ensemble is the low-regret alternative: it is never</w:t>
       </w:r>
       <w:r>
         <w:t xml:space="preserve"> </w:t>
@@ -7069,7 +7233,7 @@
       </w:tr>
     </w:tbl>
     <w:bookmarkEnd w:id="27"/>
-    <w:bookmarkStart w:id="31" w:name="ensemble-reliability"/>
+    <w:bookmarkStart w:id="31" w:name="X8b3480caa00443f57186feaf5cffdc8fb88fe2f"/>
     <w:p>
       <w:pPr>
         <w:pStyle w:val="Heading3"/>
@@ -7078,7 +7242,7 @@
         <w:widowControl w:val="1"/>
       </w:pPr>
       <w:r>
-        <w:t xml:space="preserve">5.2 Ensemble reliability</w:t>
+        <w:t xml:space="preserve">5.2 Ensemble reliability and judge-choice regret</w:t>
       </w:r>
     </w:p>
     <w:p>
@@ -8013,6 +8177,539 @@
       </w:r>
       <w:r>
         <w:t xml:space="preserve">decisive reliability lever; CoEval's consensus selection retains the high-agreement judges automatically.</w:t>
+      </w:r>
+    </w:p>
+    <w:p>
+      <w:pPr>
+        <w:pStyle w:val="BodyText"/>
+        <w:jc w:val="both"/>
+        <w:keepNext w:val="0"/>
+        <w:keepLines w:val="0"/>
+        <w:widowControl w:val="1"/>
+      </w:pPr>
+      <w:r>
+        <w:t xml:space="preserve">Composition matters because the</w:t>
+      </w:r>
+      <w:r>
+        <w:t xml:space="preserve"> </w:t>
+      </w:r>
+      <w:r>
+        <w:rPr>
+          <w:i/>
+          <w:iCs/>
+        </w:rPr>
+        <w:t xml:space="preserve">wrong single judge can be worse than useless</w:t>
+      </w:r>
+      <w:r>
+        <w:t xml:space="preserve">, and which judge is wrong is not</w:t>
+      </w:r>
+      <w:r>
+        <w:t xml:space="preserve"> </w:t>
+      </w:r>
+      <w:r>
+        <w:t xml:space="preserve">knowable a priori without the labels CoEval assumes are absent. Across the benchmark-grounded set of Section 5.1</w:t>
+      </w:r>
+      <w:r>
+        <w:t xml:space="preserve"> </w:t>
+      </w:r>
+      <w:r>
+        <w:t xml:space="preserve">(three tasks,</w:t>
+      </w:r>
+      <w:r>
+        <w:t xml:space="preserve"> </w:t>
+      </w:r>
+      <m:oMath>
+        <m:r>
+          <m:t>n</m:t>
+        </m:r>
+        <m:r>
+          <m:rPr>
+            <m:sty m:val="p"/>
+          </m:rPr>
+          <m:t>=</m:t>
+        </m:r>
+        <m:r>
+          <m:t>900</m:t>
+        </m:r>
+      </m:oMath>
+      <w:r>
+        <w:t xml:space="preserve"> </w:t>
+      </w:r>
+      <w:r>
+        <w:t xml:space="preserve">pooled), the four candidate judges span a correlation range from</w:t>
+      </w:r>
+      <w:r>
+        <w:t xml:space="preserve"> </w:t>
+      </w:r>
+      <m:oMath>
+        <m:r>
+          <m:rPr>
+            <m:sty m:val="p"/>
+          </m:rPr>
+          <m:t>−</m:t>
+        </m:r>
+        <m:r>
+          <m:t>0.04</m:t>
+        </m:r>
+      </m:oMath>
+      <w:r>
+        <w:t xml:space="preserve"> </w:t>
+      </w:r>
+      <w:r>
+        <w:t xml:space="preserve">(</w:t>
+      </w:r>
+      <w:r>
+        <w:rPr>
+          <w:rStyle w:val="VerbatimChar"/>
+        </w:rPr>
+        <w:t xml:space="preserve">gpt-3.5-turbo</w:t>
+      </w:r>
+      <w:r>
+        <w:t xml:space="preserve">, anti-correlated) through</w:t>
+      </w:r>
+      <w:r>
+        <w:t xml:space="preserve"> </w:t>
+      </w:r>
+      <m:oMath>
+        <m:r>
+          <m:t>0.17</m:t>
+        </m:r>
+      </m:oMath>
+      <w:r>
+        <w:t xml:space="preserve"> </w:t>
+      </w:r>
+      <w:r>
+        <w:t xml:space="preserve">(</w:t>
+      </w:r>
+      <w:r>
+        <w:rPr>
+          <w:rStyle w:val="VerbatimChar"/>
+        </w:rPr>
+        <w:t xml:space="preserve">gemini-flash</w:t>
+      </w:r>
+      <w:r>
+        <w:t xml:space="preserve">) and</w:t>
+      </w:r>
+      <w:r>
+        <w:t xml:space="preserve"> </w:t>
+      </w:r>
+      <m:oMath>
+        <m:r>
+          <m:t>0.24</m:t>
+        </m:r>
+      </m:oMath>
+      <w:r>
+        <w:t xml:space="preserve"> </w:t>
+      </w:r>
+      <w:r>
+        <w:t xml:space="preserve">(</w:t>
+      </w:r>
+      <w:r>
+        <w:rPr>
+          <w:rStyle w:val="VerbatimChar"/>
+        </w:rPr>
+        <w:t xml:space="preserve">gpt-4o-mini</w:t>
+      </w:r>
+      <w:r>
+        <w:t xml:space="preserve">) to</w:t>
+      </w:r>
+      <w:r>
+        <w:t xml:space="preserve"> </w:t>
+      </w:r>
+      <m:oMath>
+        <m:r>
+          <m:t>0.31</m:t>
+        </m:r>
+      </m:oMath>
+      <w:r>
+        <w:t xml:space="preserve"> </w:t>
+      </w:r>
+      <w:r>
+        <w:t xml:space="preserve">(</w:t>
+      </w:r>
+      <w:r>
+        <w:rPr>
+          <w:rStyle w:val="VerbatimChar"/>
+        </w:rPr>
+        <w:t xml:space="preserve">claude-haiku</w:t>
+      </w:r>
+      <w:r>
+        <w:t xml:space="preserve">): a</w:t>
+      </w:r>
+      <w:r>
+        <w:t xml:space="preserve"> </w:t>
+      </w:r>
+      <w:r>
+        <w:rPr>
+          <w:b/>
+          <w:bCs/>
+        </w:rPr>
+        <w:t xml:space="preserve">judge-choice regret of</w:t>
+      </w:r>
+      <w:r>
+        <w:rPr>
+          <w:b/>
+          <w:bCs/>
+        </w:rPr>
+        <w:t xml:space="preserve"> </w:t>
+      </w:r>
+      <m:oMath>
+        <m:r>
+          <m:t>0.35</m:t>
+        </m:r>
+      </m:oMath>
+      <w:r>
+        <w:t xml:space="preserve"> </w:t>
+      </w:r>
+      <w:r>
+        <w:t xml:space="preserve">between the best and worst single judge. The best judge is moreover task-dependent (</w:t>
+      </w:r>
+      <w:r>
+        <w:rPr>
+          <w:rStyle w:val="VerbatimChar"/>
+        </w:rPr>
+        <w:t xml:space="preserve">claude-haiku</w:t>
+      </w:r>
+      <w:r>
+        <w:t xml:space="preserve"> </w:t>
+      </w:r>
+      <w:r>
+        <w:t xml:space="preserve">here,</w:t>
+      </w:r>
+      <w:r>
+        <w:t xml:space="preserve"> </w:t>
+      </w:r>
+      <w:r>
+        <w:rPr>
+          <w:rStyle w:val="VerbatimChar"/>
+        </w:rPr>
+        <w:t xml:space="preserve">gpt-4o-mini</w:t>
+      </w:r>
+      <w:r>
+        <w:t xml:space="preserve"> </w:t>
+      </w:r>
+      <w:r>
+        <w:t xml:space="preserve">on the summarization subset of Section 5.1), so a practitioner committing to one judge in</w:t>
+      </w:r>
+      <w:r>
+        <w:t xml:space="preserve"> </w:t>
+      </w:r>
+      <w:r>
+        <w:t xml:space="preserve">advance risks the anti-correlated one. The cross-family ensemble is the low-regret default: its plain mean correlates</w:t>
+      </w:r>
+      <w:r>
+        <w:t xml:space="preserve"> </w:t>
+      </w:r>
+      <w:r>
+        <w:t xml:space="preserve">at</w:t>
+      </w:r>
+      <w:r>
+        <w:t xml:space="preserve"> </w:t>
+      </w:r>
+      <m:oMath>
+        <m:r>
+          <m:t>0.238</m:t>
+        </m:r>
+      </m:oMath>
+      <w:r>
+        <w:t xml:space="preserve"> </w:t>
+      </w:r>
+      <w:r>
+        <w:t xml:space="preserve">and, unlike a single pick, is</w:t>
+      </w:r>
+      <w:r>
+        <w:t xml:space="preserve"> </w:t>
+      </w:r>
+      <w:r>
+        <w:rPr>
+          <w:i/>
+          <w:iCs/>
+        </w:rPr>
+        <w:t xml:space="preserve">never</w:t>
+      </w:r>
+      <w:r>
+        <w:t xml:space="preserve"> </w:t>
+      </w:r>
+      <w:r>
+        <w:t xml:space="preserve">anti-correlated.</w:t>
+      </w:r>
+    </w:p>
+    <w:p>
+      <w:pPr>
+        <w:pStyle w:val="BodyText"/>
+        <w:jc w:val="both"/>
+        <w:keepNext w:val="0"/>
+        <w:keepLines w:val="0"/>
+        <w:widowControl w:val="1"/>
+      </w:pPr>
+      <w:r>
+        <w:t xml:space="preserve">Given the panel, the choice of aggregator is itself a lever, and the unsupervised reliability-weighted aggregator of</w:t>
+      </w:r>
+      <w:r>
+        <w:t xml:space="preserve"> </w:t>
+      </w:r>
+      <w:r>
+        <w:t xml:space="preserve">Section 3.3 is the best label-free option we test. Weighting each judge by its agreement with the rest of the</w:t>
+      </w:r>
+      <w:r>
+        <w:t xml:space="preserve"> </w:t>
+      </w:r>
+      <w:r>
+        <w:t xml:space="preserve">panel assigns the anti-correlated</w:t>
+      </w:r>
+      <w:r>
+        <w:t xml:space="preserve"> </w:t>
+      </w:r>
+      <w:r>
+        <w:rPr>
+          <w:rStyle w:val="VerbatimChar"/>
+        </w:rPr>
+        <w:t xml:space="preserve">gpt-3.5-turbo</w:t>
+      </w:r>
+      <w:r>
+        <w:t xml:space="preserve"> </w:t>
+      </w:r>
+      <w:r>
+        <w:t xml:space="preserve">the lowest weight (</w:t>
+      </w:r>
+      <m:oMath>
+        <m:r>
+          <m:t>0.18</m:t>
+        </m:r>
+      </m:oMath>
+      <w:r>
+        <w:t xml:space="preserve"> </w:t>
+      </w:r>
+      <w:r>
+        <w:t xml:space="preserve">versus</w:t>
+      </w:r>
+      <w:r>
+        <w:t xml:space="preserve"> </w:t>
+      </w:r>
+      <m:oMath>
+        <m:r>
+          <m:t>0.27</m:t>
+        </m:r>
+      </m:oMath>
+      <w:r>
+        <w:t xml:space="preserve">–</w:t>
+      </w:r>
+      <m:oMath>
+        <m:r>
+          <m:t>0.29</m:t>
+        </m:r>
+      </m:oMath>
+      <w:r>
+        <w:t xml:space="preserve"> </w:t>
+      </w:r>
+      <w:r>
+        <w:t xml:space="preserve">for</w:t>
+      </w:r>
+      <w:r>
+        <w:t xml:space="preserve"> </w:t>
+      </w:r>
+      <w:r>
+        <w:t xml:space="preserve">the others) and lifts the aggregate correlation from the plain mean's</w:t>
+      </w:r>
+      <w:r>
+        <w:t xml:space="preserve"> </w:t>
+      </w:r>
+      <m:oMath>
+        <m:r>
+          <m:t>0.238</m:t>
+        </m:r>
+      </m:oMath>
+      <w:r>
+        <w:t xml:space="preserve"> </w:t>
+      </w:r>
+      <w:r>
+        <w:t xml:space="preserve">to</w:t>
+      </w:r>
+      <w:r>
+        <w:t xml:space="preserve"> </w:t>
+      </w:r>
+      <m:oMath>
+        <m:r>
+          <m:t>0.246</m:t>
+        </m:r>
+      </m:oMath>
+      <w:r>
+        <w:t xml:space="preserve">. The</w:t>
+      </w:r>
+      <w:r>
+        <w:t xml:space="preserve"> </w:t>
+      </w:r>
+      <w:r>
+        <w:t xml:space="preserve">alternatives are worse: median and trimmed-mean aggregation, which discard rather than re-weight information, reach</w:t>
+      </w:r>
+      <w:r>
+        <w:t xml:space="preserve"> </w:t>
+      </w:r>
+      <w:r>
+        <w:t xml:space="preserve">only</w:t>
+      </w:r>
+      <w:r>
+        <w:t xml:space="preserve"> </w:t>
+      </w:r>
+      <m:oMath>
+        <m:r>
+          <m:t>0.222</m:t>
+        </m:r>
+      </m:oMath>
+      <w:r>
+        <w:t xml:space="preserve">, and a Dawid–Skene latent-truth model over discretized scores reaches</w:t>
+      </w:r>
+      <w:r>
+        <w:t xml:space="preserve"> </w:t>
+      </w:r>
+      <m:oMath>
+        <m:r>
+          <m:t>0.178</m:t>
+        </m:r>
+      </m:oMath>
+      <w:r>
+        <w:t xml:space="preserve">. Reliability weighting</w:t>
+      </w:r>
+      <w:r>
+        <w:t xml:space="preserve"> </w:t>
+      </w:r>
+      <w:r>
+        <w:t xml:space="preserve">thus turns the panel's own internal agreement, the one signal available without labels, into the strongest aggregate,</w:t>
+      </w:r>
+      <w:r>
+        <w:t xml:space="preserve"> </w:t>
+      </w:r>
+      <w:r>
+        <w:t xml:space="preserve">while never selecting the anti-correlated judge.</w:t>
+      </w:r>
+    </w:p>
+    <w:p>
+      <w:pPr>
+        <w:pStyle w:val="BodyText"/>
+        <w:jc w:val="both"/>
+        <w:keepNext w:val="0"/>
+        <w:keepLines w:val="0"/>
+        <w:widowControl w:val="1"/>
+      </w:pPr>
+      <w:r>
+        <w:rPr>
+          <w:b/>
+          <w:bCs/>
+        </w:rPr>
+        <w:t xml:space="preserve">Finding (judge-choice regret).</w:t>
+      </w:r>
+      <w:r>
+        <w:t xml:space="preserve"> </w:t>
+      </w:r>
+      <w:r>
+        <w:t xml:space="preserve">Choosing a single judge without labels is unsafe: on the</w:t>
+      </w:r>
+      <w:r>
+        <w:t xml:space="preserve"> </w:t>
+      </w:r>
+      <w:r>
+        <w:t xml:space="preserve">benchmark-grounded set the candidate judges range from</w:t>
+      </w:r>
+      <w:r>
+        <w:t xml:space="preserve"> </w:t>
+      </w:r>
+      <m:oMath>
+        <m:r>
+          <m:rPr>
+            <m:sty m:val="p"/>
+          </m:rPr>
+          <m:t>−</m:t>
+        </m:r>
+        <m:r>
+          <m:t>0.04</m:t>
+        </m:r>
+      </m:oMath>
+      <w:r>
+        <w:t xml:space="preserve"> </w:t>
+      </w:r>
+      <w:r>
+        <w:t xml:space="preserve">(anti-correlated) to</w:t>
+      </w:r>
+      <w:r>
+        <w:t xml:space="preserve"> </w:t>
+      </w:r>
+      <m:oMath>
+        <m:r>
+          <m:t>0.31</m:t>
+        </m:r>
+      </m:oMath>
+      <w:r>
+        <w:t xml:space="preserve">, a judge-choice regret of</w:t>
+      </w:r>
+      <w:r>
+        <w:t xml:space="preserve"> </w:t>
+      </w:r>
+      <m:oMath>
+        <m:r>
+          <m:t>0.35</m:t>
+        </m:r>
+      </m:oMath>
+      <w:r>
+        <w:t xml:space="preserve">, and the best judge varies by task. The cross-family ensemble removes this risk (plain mean</w:t>
+      </w:r>
+      <w:r>
+        <w:t xml:space="preserve"> </w:t>
+      </w:r>
+      <m:oMath>
+        <m:r>
+          <m:t>0.238</m:t>
+        </m:r>
+      </m:oMath>
+      <w:r>
+        <w:t xml:space="preserve">, never</w:t>
+      </w:r>
+      <w:r>
+        <w:t xml:space="preserve"> </w:t>
+      </w:r>
+      <w:r>
+        <w:t xml:space="preserve">anti-correlated), and among label-free aggregators reliability weighting is the strongest (</w:t>
+      </w:r>
+      <m:oMath>
+        <m:r>
+          <m:t>0.246</m:t>
+        </m:r>
+      </m:oMath>
+      <w:r>
+        <w:t xml:space="preserve">, versus</w:t>
+      </w:r>
+      <w:r>
+        <w:t xml:space="preserve"> </w:t>
+      </w:r>
+      <m:oMath>
+        <m:r>
+          <m:t>0.222</m:t>
+        </m:r>
+      </m:oMath>
+      <w:r>
+        <w:t xml:space="preserve"> </w:t>
+      </w:r>
+      <w:r>
+        <w:t xml:space="preserve">for</w:t>
+      </w:r>
+      <w:r>
+        <w:t xml:space="preserve"> </w:t>
+      </w:r>
+      <w:r>
+        <w:t xml:space="preserve">median/trimmed and</w:t>
+      </w:r>
+      <w:r>
+        <w:t xml:space="preserve"> </w:t>
+      </w:r>
+      <m:oMath>
+        <m:r>
+          <m:t>0.178</m:t>
+        </m:r>
+      </m:oMath>
+      <w:r>
+        <w:t xml:space="preserve"> </w:t>
+      </w:r>
+      <w:r>
+        <w:t xml:space="preserve">for Dawid–Skene), using only the panel's internal agreement.</w:t>
       </w:r>
     </w:p>
     <w:bookmarkEnd w:id="31"/>

</xml_diff>

<commit_message>
paper: add Appendix D — worked examples on data-scarce domains (real generated artifacts)
Compact, informative appendix making the reusable-framework theme tangible with the
ACTUAL CoEval output for three high-value domains that have no public labeled benchmark
(drug-drug interaction reasoning, clinical reasoning, legal analysis): for each, the
one-line seed description, the auto-generated attribute strata and rubric (Table D1), and
a representative verbatim generated item (e.g. the DDI pregnancy + lamotrigine + oral-
contraceptive case). Shows the full path from a one-line description to a contamination-
free, panel-scored ranking (Table 5) from a single config with no labels. Referenced from
§5.7. All content pulled verbatim from Runs/EXP006/EXP007 artifacts (no fabrication).
Audits clean: 0 em-dashes, 0 tone, $ balanced, 32/32 cites, docx 0 stray $.

Co-Authored-By: Claude Opus 4.8 <noreply@anthropic.com>
</commit_message>
<xml_diff>
--- a/docs/paper/CoEval.docx
+++ b/docs/paper/CoEval.docx
@@ -204,7 +204,7 @@
         <w:t xml:space="preserve">CoEval</w:t>
       </w:r>
       <w:r>
-        <w:t xml:space="preserve">, an open-source framework that</w:t>
+        <w:t xml:space="preserve">, an open-source, reusable framework that</w:t>
       </w:r>
       <w:r>
         <w:t xml:space="preserve"> </w:t>
@@ -583,7 +583,7 @@
         <w:t xml:space="preserve"> </w:t>
       </w:r>
       <w:r>
-        <w:t xml:space="preserve">reliability, is what lets a small, well-chosen cross-family panel serve as a trustworthy, label-free substitute for a contaminated leaderboard.</w:t>
+        <w:t xml:space="preserve">reliability, is what lets a small, well-chosen cross-family panel serve as a trustworthy, label-free substitute for a contaminated leaderboard, one that any team can regenerate for its own application and re-run on every model release.</w:t>
       </w:r>
     </w:p>
     <w:bookmarkEnd w:id="10"/>
@@ -1255,7 +1255,7 @@
           <w:b/>
           <w:bCs/>
         </w:rPr>
-        <w:t xml:space="preserve">(4) An open, declarative system that ranks models from one specification.</w:t>
+        <w:t xml:space="preserve">(4) A reusable, open framework, not a one-off benchmark.</w:t>
       </w:r>
       <w:r>
         <w:t xml:space="preserve"> </w:t>
@@ -1273,25 +1273,65 @@
         <w:t xml:space="preserve"> </w:t>
       </w:r>
       <w:r>
-        <w:t xml:space="preserve">serve as teacher, student, or judge, and a task or domain is described declaratively. Ranking a family of candidate</w:t>
-      </w:r>
-      <w:r>
-        <w:t xml:space="preserve"> </w:t>
-      </w:r>
-      <w:r>
-        <w:t xml:space="preserve">models on a custom use case requires only this declarative specification, and we demonstrate (Section 5.1, Table 3) that CoEval</w:t>
-      </w:r>
-      <w:r>
-        <w:t xml:space="preserve"> </w:t>
-      </w:r>
-      <w:r>
-        <w:t xml:space="preserve">recovers the correct ground-truth ranking. The whole pipeline is reproducible from a single declarative</w:t>
-      </w:r>
-      <w:r>
-        <w:t xml:space="preserve"> </w:t>
-      </w:r>
-      <w:r>
-        <w:t xml:space="preserve">configuration.</w:t>
+        <w:t xml:space="preserve">serve as teacher, student, or judge, and a task or domain is supplied declaratively at whatever level of detail the</w:t>
+      </w:r>
+      <w:r>
+        <w:t xml:space="preserve"> </w:t>
+      </w:r>
+      <w:r>
+        <w:t xml:space="preserve">practitioner has, from a one-line objective that the framework expands into a complete configuration, through a</w:t>
+      </w:r>
+      <w:r>
+        <w:t xml:space="preserve"> </w:t>
+      </w:r>
+      <w:r>
+        <w:t xml:space="preserve">minimal task description, to a fully hand-written specification. The</w:t>
+      </w:r>
+      <w:r>
+        <w:t xml:space="preserve"> </w:t>
+      </w:r>
+      <w:r>
+        <w:rPr>
+          <w:i/>
+          <w:iCs/>
+        </w:rPr>
+        <w:t xml:space="preserve">same</w:t>
+      </w:r>
+      <w:r>
+        <w:t xml:space="preserve"> </w:t>
+      </w:r>
+      <w:r>
+        <w:t xml:space="preserve">pipeline applies unchanged to any</w:t>
+      </w:r>
+      <w:r>
+        <w:t xml:space="preserve"> </w:t>
+      </w:r>
+      <w:r>
+        <w:t xml:space="preserve">domain and is cheap enough to re-run on every model release, so a team obtains a renewable, application-specific</w:t>
+      </w:r>
+      <w:r>
+        <w:t xml:space="preserve"> </w:t>
+      </w:r>
+      <w:r>
+        <w:t xml:space="preserve">benchmark rather than a fixed leaderboard. Ranking candidate models on a custom use case requires only this</w:t>
+      </w:r>
+      <w:r>
+        <w:t xml:space="preserve"> </w:t>
+      </w:r>
+      <w:r>
+        <w:t xml:space="preserve">specification, and CoEval recovers the correct ground-truth ranking wherever one exists to check against</w:t>
+      </w:r>
+      <w:r>
+        <w:t xml:space="preserve"> </w:t>
+      </w:r>
+      <w:r>
+        <w:t xml:space="preserve">(Section 5.1, Table 3). The whole pipeline is open-source and reproducible from a single declarative</w:t>
+      </w:r>
+      <w:r>
+        <w:t xml:space="preserve"> </w:t>
+      </w:r>
+      <w:r>
+        <w:t xml:space="preserve">configuration file.</w:t>
       </w:r>
     </w:p>
     <w:p>
@@ -11104,6 +11144,29 @@
       </w:r>
       <w:r>
         <w:t xml:space="preserve">no human labels or raters.</w:t>
+      </w:r>
+      <w:r>
+        <w:t xml:space="preserve"> </w:t>
+      </w:r>
+      <w:hyperlink w:anchor="appD">
+        <w:r>
+          <w:rPr>
+            <w:rStyle w:val="Hyperlink"/>
+          </w:rPr>
+          <w:t xml:space="preserve">Appendix D</w:t>
+        </w:r>
+      </w:hyperlink>
+      <w:r>
+        <w:t xml:space="preserve"> </w:t>
+      </w:r>
+      <w:r>
+        <w:t xml:space="preserve">shows the actual generated artifacts for all three</w:t>
+      </w:r>
+      <w:r>
+        <w:t xml:space="preserve"> </w:t>
+      </w:r>
+      <w:r>
+        <w:t xml:space="preserve">domains: the one-line seed, the auto-generated attribute strata and rubric, and a representative synthesized item.</w:t>
       </w:r>
     </w:p>
     <w:p>
@@ -12450,13 +12513,25 @@
         <w:t xml:space="preserve"> </w:t>
       </w:r>
       <w:r>
-        <w:t xml:space="preserve">concrete and inexpensive recipe for trustworthy, renewable LLM evaluation. CoEval is open-source, declarative, and</w:t>
-      </w:r>
-      <w:r>
-        <w:t xml:space="preserve"> </w:t>
-      </w:r>
-      <w:r>
-        <w:t xml:space="preserve">fully reproducible.</w:t>
+        <w:t xml:space="preserve">concrete and inexpensive recipe for trustworthy, renewable LLM evaluation. Because the same declarative pipeline runs</w:t>
+      </w:r>
+      <w:r>
+        <w:t xml:space="preserve"> </w:t>
+      </w:r>
+      <w:r>
+        <w:t xml:space="preserve">unchanged across models and domains and is cheap enough to repeat on every model release, CoEval is a reusable</w:t>
+      </w:r>
+      <w:r>
+        <w:t xml:space="preserve"> </w:t>
+      </w:r>
+      <w:r>
+        <w:t xml:space="preserve">instrument a team points at its own application when neither labeled data nor a trustworthy benchmark exists, rather</w:t>
+      </w:r>
+      <w:r>
+        <w:t xml:space="preserve"> </w:t>
+      </w:r>
+      <w:r>
+        <w:t xml:space="preserve">than a single static study. CoEval is open-source, declarative, and fully reproducible.</w:t>
       </w:r>
     </w:p>
     <w:bookmarkEnd w:id="42"/>
@@ -15190,6 +15265,943 @@
       </w:r>
     </w:p>
     <w:bookmarkEnd w:id="116"/>
+    <w:bookmarkStart w:id="117" w:name="appD"/>
+    <w:p>
+      <w:pPr>
+        <w:pStyle w:val="Heading2"/>
+        <w:keepNext/>
+        <w:keepLines/>
+        <w:widowControl w:val="1"/>
+      </w:pPr>
+      <w:r>
+        <w:t xml:space="preserve">Appendix D. Worked examples on data-scarce domains</w:t>
+      </w:r>
+    </w:p>
+    <w:p>
+      <w:pPr>
+        <w:pStyle w:val="FirstParagraph"/>
+        <w:jc w:val="both"/>
+        <w:keepNext w:val="0"/>
+        <w:keepLines w:val="0"/>
+        <w:widowControl w:val="1"/>
+      </w:pPr>
+      <w:r>
+        <w:t xml:space="preserve">The three verticals of Section 5.7 are domains where a practitioner typically has</w:t>
+      </w:r>
+      <w:r>
+        <w:t xml:space="preserve"> </w:t>
+      </w:r>
+      <w:r>
+        <w:rPr>
+          <w:i/>
+          <w:iCs/>
+        </w:rPr>
+        <w:t xml:space="preserve">no</w:t>
+      </w:r>
+      <w:r>
+        <w:t xml:space="preserve"> </w:t>
+      </w:r>
+      <w:r>
+        <w:t xml:space="preserve">labeled</w:t>
+      </w:r>
+      <w:r>
+        <w:t xml:space="preserve"> </w:t>
+      </w:r>
+      <w:r>
+        <w:t xml:space="preserve">benchmark and no trustworthy public one: drug–drug interaction (DDI) reasoning, clinical decision support, and</w:t>
+      </w:r>
+      <w:r>
+        <w:t xml:space="preserve"> </w:t>
+      </w:r>
+      <w:r>
+        <w:t xml:space="preserve">legal analysis. The artifacts below are the</w:t>
+      </w:r>
+      <w:r>
+        <w:t xml:space="preserve"> </w:t>
+      </w:r>
+      <w:r>
+        <w:rPr>
+          <w:i/>
+          <w:iCs/>
+        </w:rPr>
+        <w:t xml:space="preserve">actual</w:t>
+      </w:r>
+      <w:r>
+        <w:t xml:space="preserve"> </w:t>
+      </w:r>
+      <w:r>
+        <w:t xml:space="preserve">output CoEval generated for each, from a single one-line</w:t>
+      </w:r>
+      <w:r>
+        <w:t xml:space="preserve"> </w:t>
+      </w:r>
+      <w:r>
+        <w:t xml:space="preserve">task description and with no human labels. From that description the teacher inferred the attribute strata, synthesized</w:t>
+      </w:r>
+      <w:r>
+        <w:t xml:space="preserve"> </w:t>
+      </w:r>
+      <m:oMath>
+        <m:r>
+          <m:t>40</m:t>
+        </m:r>
+      </m:oMath>
+      <w:r>
+        <w:t xml:space="preserve"> </w:t>
+      </w:r>
+      <w:r>
+        <w:t xml:space="preserve">contamination-free items stratified over them, and wrote a scoring rubric; the vendor-disjoint panel</w:t>
+      </w:r>
+      <w:r>
+        <w:t xml:space="preserve"> </w:t>
+      </w:r>
+      <w:r>
+        <w:t xml:space="preserve">(OpenAI + Anthropic + Google) then ranked three candidate models (Table 5).</w:t>
+      </w:r>
+    </w:p>
+    <w:p>
+      <w:pPr>
+        <w:pStyle w:val="BodyText"/>
+        <w:jc w:val="both"/>
+        <w:keepNext w:val="0"/>
+        <w:keepLines w:val="0"/>
+        <w:widowControl w:val="1"/>
+      </w:pPr>
+      <w:r>
+        <w:rPr>
+          <w:b/>
+          <w:bCs/>
+        </w:rPr>
+        <w:t xml:space="preserve">Table D1.</w:t>
+      </w:r>
+      <w:r>
+        <w:t xml:space="preserve"> </w:t>
+      </w:r>
+      <w:r>
+        <w:t xml:space="preserve">From a one-line description to a scored benchmark, for three domains with no</w:t>
+      </w:r>
+      <w:r>
+        <w:t xml:space="preserve"> </w:t>
+      </w:r>
+      <w:r>
+        <w:t xml:space="preserve">public labeled data. The attribute strata and rubric criteria are auto-generated by the teacher; each domain yields</w:t>
+      </w:r>
+      <w:r>
+        <w:t xml:space="preserve"> </w:t>
+      </w:r>
+      <m:oMath>
+        <m:r>
+          <m:t>40</m:t>
+        </m:r>
+      </m:oMath>
+      <w:r>
+        <w:t xml:space="preserve"> </w:t>
+      </w:r>
+      <w:r>
+        <w:t xml:space="preserve">stratified, contamination-free items, scored by the cross-family panel.</w:t>
+      </w:r>
+    </w:p>
+    <w:tbl>
+      <w:tblPr>
+        <w:tblStyle w:val="Table"/>
+        <w:tblW w:type="pct" w:w="5000"/>
+        <w:jc w:val="center"/>
+        <w:tblLayout w:type="autofit"/>
+        <w:tblLook w:firstRow="1" w:lastRow="0" w:firstColumn="0" w:lastColumn="0" w:noHBand="0" w:noVBand="0" w:val="0020"/>
+        <w:tblCaption w:val="Table D1. From a one-line description to a scored benchmark, for three domains with no public labeled data. The attribute strata and rubric criteria are auto-generated by the teacher; each domain yields 40 stratified, contamination-free items, scored by the cross-family panel."/>
+        <w:tblBorders>
+          <w:top w:val="single" w:sz="10" w:color="4F6272"/>
+          <w:bottom w:val="single" w:sz="10" w:color="4F6272"/>
+          <w:insideH w:val="single" w:sz="5" w:color="9FB0C2"/>
+          <w:left w:val="single" w:sz="6" w:color="9FB0C2"/>
+          <w:right w:val="single" w:sz="6" w:color="9FB0C2"/>
+          <w:insideV w:val="single" w:sz="5" w:color="D9E1E8"/>
+        </w:tblBorders>
+      </w:tblPr>
+      <w:tblGrid>
+        <w:gridCol w:w="2640"/>
+        <w:gridCol w:w="2640"/>
+        <w:gridCol w:w="2640"/>
+      </w:tblGrid>
+      <w:tr>
+        <w:trPr>
+          <w:tblHeader w:val="on"/>
+        </w:trPr>
+        <w:tc>
+          <w:tcPr>
+            <w:shd w:fill="EEF3F7"/>
+            <w:tcBorders>
+              <w:left w:val="nil"/>
+              <w:right w:val="nil"/>
+              <w:top w:val="nil"/>
+              <w:bottom w:val="single" w:sz="8" w:color="9FB0C2"/>
+            </w:tcBorders>
+          </w:tcPr>
+          <w:p>
+            <w:pPr>
+              <w:pStyle w:val="Compact"/>
+              <w:spacing w:before="0" w:after="20" w:line="240" w:lineRule="auto"/>
+              <w:jc w:val="center"/>
+              <w:keepNext w:val="0"/>
+              <w:keepLines/>
+              <w:widowControl w:val="1"/>
+            </w:pPr>
+            <w:r>
+              <w:rPr>
+                <w:rFonts w:ascii="Times New Roman" w:hAnsi="Times New Roman"/>
+                <w:b/>
+                <w:sz w:val="19"/>
+              </w:rPr>
+              <w:t xml:space="preserve">Domain and one-line seed</w:t>
+            </w:r>
+          </w:p>
+        </w:tc>
+        <w:tc>
+          <w:tcPr>
+            <w:shd w:fill="EEF3F7"/>
+            <w:tcBorders>
+              <w:left w:val="nil"/>
+              <w:right w:val="nil"/>
+              <w:top w:val="nil"/>
+              <w:bottom w:val="single" w:sz="8" w:color="9FB0C2"/>
+            </w:tcBorders>
+          </w:tcPr>
+          <w:p>
+            <w:pPr>
+              <w:pStyle w:val="Compact"/>
+              <w:spacing w:before="0" w:after="20" w:line="240" w:lineRule="auto"/>
+              <w:jc w:val="center"/>
+              <w:keepNext w:val="0"/>
+              <w:keepLines/>
+              <w:widowControl w:val="1"/>
+            </w:pPr>
+            <w:r>
+              <w:rPr>
+                <w:rFonts w:ascii="Times New Roman" w:hAnsi="Times New Roman"/>
+                <w:b/>
+                <w:sz w:val="19"/>
+              </w:rPr>
+              <w:t xml:space="preserve">Auto-generated attribute strata</w:t>
+            </w:r>
+          </w:p>
+        </w:tc>
+        <w:tc>
+          <w:tcPr>
+            <w:shd w:fill="EEF3F7"/>
+            <w:tcBorders>
+              <w:left w:val="nil"/>
+              <w:right w:val="nil"/>
+              <w:top w:val="nil"/>
+              <w:bottom w:val="single" w:sz="8" w:color="9FB0C2"/>
+            </w:tcBorders>
+          </w:tcPr>
+          <w:p>
+            <w:pPr>
+              <w:pStyle w:val="Compact"/>
+              <w:spacing w:before="0" w:after="20" w:line="240" w:lineRule="auto"/>
+              <w:jc w:val="center"/>
+              <w:keepNext w:val="0"/>
+              <w:keepLines/>
+              <w:widowControl w:val="1"/>
+            </w:pPr>
+            <w:r>
+              <w:rPr>
+                <w:rFonts w:ascii="Times New Roman" w:hAnsi="Times New Roman"/>
+                <w:b/>
+                <w:sz w:val="19"/>
+              </w:rPr>
+              <w:t xml:space="preserve">Auto-generated rubric</w:t>
+            </w:r>
+          </w:p>
+        </w:tc>
+      </w:tr>
+      <w:tr>
+        <w:tc>
+          <w:tcPr>
+            <w:tcBorders>
+              <w:left w:val="nil"/>
+              <w:right w:val="nil"/>
+              <w:top w:val="nil"/>
+              <w:bottom w:val="single" w:sz="4" w:color="D9E1E8"/>
+            </w:tcBorders>
+          </w:tcPr>
+          <w:p>
+            <w:pPr>
+              <w:pStyle w:val="Compact"/>
+              <w:spacing w:before="0" w:after="20" w:line="240" w:lineRule="auto"/>
+              <w:jc w:val="center"/>
+              <w:keepNext w:val="0"/>
+              <w:keepLines/>
+              <w:widowControl w:val="1"/>
+            </w:pPr>
+            <w:r>
+              <w:rPr>
+                <w:rFonts w:ascii="Times New Roman" w:hAnsi="Times New Roman"/>
+                <w:b/>
+                <w:bCs/>
+                <w:sz w:val="20"/>
+              </w:rPr>
+              <w:t xml:space="preserve">Drug–drug interaction reasoning</w:t>
+            </w:r>
+            <w:r>
+              <w:rPr>
+                <w:rFonts w:ascii="Times New Roman" w:hAnsi="Times New Roman"/>
+                <w:sz w:val="20"/>
+              </w:rPr>
+              <w:br/>
+            </w:r>
+            <w:r>
+              <w:rPr>
+                <w:rFonts w:ascii="Times New Roman" w:hAnsi="Times New Roman"/>
+                <w:i/>
+                <w:iCs/>
+                <w:sz w:val="20"/>
+              </w:rPr>
+              <w:t xml:space="preserve">"given two or more co-administered drugs and a patient context, assess the interaction, its mechanism, severity, and clinical action"</w:t>
+            </w:r>
+          </w:p>
+        </w:tc>
+        <w:tc>
+          <w:tcPr>
+            <w:tcBorders>
+              <w:left w:val="nil"/>
+              <w:right w:val="nil"/>
+              <w:top w:val="nil"/>
+              <w:bottom w:val="single" w:sz="4" w:color="D9E1E8"/>
+            </w:tcBorders>
+          </w:tcPr>
+          <w:p>
+            <w:pPr>
+              <w:pStyle w:val="Compact"/>
+              <w:spacing w:before="0" w:after="20" w:line="240" w:lineRule="auto"/>
+              <w:jc w:val="center"/>
+              <w:keepNext w:val="0"/>
+              <w:keepLines/>
+              <w:widowControl w:val="1"/>
+            </w:pPr>
+            <w:r>
+              <w:rPr>
+                <w:rFonts w:ascii="Times New Roman" w:hAnsi="Times New Roman"/>
+                <w:sz w:val="20"/>
+              </w:rPr>
+              <w:t xml:space="preserve">severity {contraindicated, major, moderate, minor}; mechanism {pharmacokinetic, pharmacodynamic};</w:t>
+            </w:r>
+            <w:r>
+              <w:rPr>
+                <w:rFonts w:ascii="Times New Roman" w:hAnsi="Times New Roman"/>
+                <w:sz w:val="20"/>
+              </w:rPr>
+              <w:t xml:space="preserve"> </w:t>
+            </w:r>
+            <w:r>
+              <w:rPr>
+                <w:rFonts w:ascii="Times New Roman" w:hAnsi="Times New Roman"/>
+                <w:sz w:val="20"/>
+              </w:rPr>
+              <w:t xml:space="preserve">patient_context {renal, hepatic, polypharmacy-elderly, pregnancy}</w:t>
+            </w:r>
+          </w:p>
+        </w:tc>
+        <w:tc>
+          <w:tcPr>
+            <w:tcBorders>
+              <w:left w:val="nil"/>
+              <w:right w:val="nil"/>
+              <w:top w:val="nil"/>
+              <w:bottom w:val="single" w:sz="4" w:color="D9E1E8"/>
+            </w:tcBorders>
+          </w:tcPr>
+          <w:p>
+            <w:pPr>
+              <w:pStyle w:val="Compact"/>
+              <w:spacing w:before="0" w:after="20" w:line="240" w:lineRule="auto"/>
+              <w:jc w:val="center"/>
+              <w:keepNext w:val="0"/>
+              <w:keepLines/>
+              <w:widowControl w:val="1"/>
+            </w:pPr>
+            <w:r>
+              <w:rPr>
+                <w:rFonts w:ascii="Times New Roman" w:hAnsi="Times New Roman"/>
+                <w:sz w:val="20"/>
+              </w:rPr>
+              <w:t xml:space="preserve">interaction_accuracy, severity_correct, safety, completeness</w:t>
+            </w:r>
+          </w:p>
+        </w:tc>
+      </w:tr>
+      <w:tr>
+        <w:tc>
+          <w:tcPr>
+            <w:tcBorders>
+              <w:left w:val="nil"/>
+              <w:right w:val="nil"/>
+              <w:top w:val="nil"/>
+              <w:bottom w:val="single" w:sz="4" w:color="D9E1E8"/>
+            </w:tcBorders>
+          </w:tcPr>
+          <w:p>
+            <w:pPr>
+              <w:pStyle w:val="Compact"/>
+              <w:spacing w:before="0" w:after="20" w:line="240" w:lineRule="auto"/>
+              <w:jc w:val="center"/>
+              <w:keepNext w:val="0"/>
+              <w:keepLines/>
+              <w:widowControl w:val="1"/>
+            </w:pPr>
+            <w:r>
+              <w:rPr>
+                <w:rFonts w:ascii="Times New Roman" w:hAnsi="Times New Roman"/>
+                <w:b/>
+                <w:bCs/>
+                <w:sz w:val="20"/>
+              </w:rPr>
+              <w:t xml:space="preserve">Clinical reasoning</w:t>
+            </w:r>
+            <w:r>
+              <w:rPr>
+                <w:rFonts w:ascii="Times New Roman" w:hAnsi="Times New Roman"/>
+                <w:sz w:val="20"/>
+              </w:rPr>
+              <w:br/>
+            </w:r>
+            <w:r>
+              <w:rPr>
+                <w:rFonts w:ascii="Times New Roman" w:hAnsi="Times New Roman"/>
+                <w:i/>
+                <w:iCs/>
+                <w:sz w:val="20"/>
+              </w:rPr>
+              <w:t xml:space="preserve">"a clinical reasoning question a clinician would face, requiring medical knowledge and safe, accurate reasoning"</w:t>
+            </w:r>
+          </w:p>
+        </w:tc>
+        <w:tc>
+          <w:tcPr>
+            <w:tcBorders>
+              <w:left w:val="nil"/>
+              <w:right w:val="nil"/>
+              <w:top w:val="nil"/>
+              <w:bottom w:val="single" w:sz="4" w:color="D9E1E8"/>
+            </w:tcBorders>
+          </w:tcPr>
+          <w:p>
+            <w:pPr>
+              <w:pStyle w:val="Compact"/>
+              <w:spacing w:before="0" w:after="20" w:line="240" w:lineRule="auto"/>
+              <w:jc w:val="center"/>
+              <w:keepNext w:val="0"/>
+              <w:keepLines/>
+              <w:widowControl w:val="1"/>
+            </w:pPr>
+            <w:r>
+              <w:rPr>
+                <w:rFonts w:ascii="Times New Roman" w:hAnsi="Times New Roman"/>
+                <w:sz w:val="20"/>
+              </w:rPr>
+              <w:t xml:space="preserve">specialty {cardiology, infectious_disease, pediatrics, oncology, emergency}; difficulty {routine, intermediate, hard}</w:t>
+            </w:r>
+          </w:p>
+        </w:tc>
+        <w:tc>
+          <w:tcPr>
+            <w:tcBorders>
+              <w:left w:val="nil"/>
+              <w:right w:val="nil"/>
+              <w:top w:val="nil"/>
+              <w:bottom w:val="single" w:sz="4" w:color="D9E1E8"/>
+            </w:tcBorders>
+          </w:tcPr>
+          <w:p>
+            <w:pPr>
+              <w:pStyle w:val="Compact"/>
+              <w:spacing w:before="0" w:after="20" w:line="240" w:lineRule="auto"/>
+              <w:jc w:val="center"/>
+              <w:keepNext w:val="0"/>
+              <w:keepLines/>
+              <w:widowControl w:val="1"/>
+            </w:pPr>
+            <w:r>
+              <w:rPr>
+                <w:rFonts w:ascii="Times New Roman" w:hAnsi="Times New Roman"/>
+                <w:sz w:val="20"/>
+              </w:rPr>
+              <w:t xml:space="preserve">clinical_accuracy, safety, completeness, clarity</w:t>
+            </w:r>
+          </w:p>
+        </w:tc>
+      </w:tr>
+      <w:tr>
+        <w:tc>
+          <w:tcPr>
+            <w:tcBorders>
+              <w:left w:val="nil"/>
+              <w:right w:val="nil"/>
+              <w:top w:val="nil"/>
+              <w:bottom w:val="nil"/>
+            </w:tcBorders>
+          </w:tcPr>
+          <w:p>
+            <w:pPr>
+              <w:pStyle w:val="Compact"/>
+              <w:spacing w:before="0" w:after="20" w:line="240" w:lineRule="auto"/>
+              <w:jc w:val="center"/>
+              <w:keepNext w:val="0"/>
+              <w:keepLines/>
+              <w:widowControl w:val="1"/>
+            </w:pPr>
+            <w:r>
+              <w:rPr>
+                <w:rFonts w:ascii="Times New Roman" w:hAnsi="Times New Roman"/>
+                <w:b/>
+                <w:bCs/>
+                <w:sz w:val="20"/>
+              </w:rPr>
+              <w:t xml:space="preserve">Legal analysis</w:t>
+            </w:r>
+            <w:r>
+              <w:rPr>
+                <w:rFonts w:ascii="Times New Roman" w:hAnsi="Times New Roman"/>
+                <w:sz w:val="20"/>
+              </w:rPr>
+              <w:br/>
+            </w:r>
+            <w:r>
+              <w:rPr>
+                <w:rFonts w:ascii="Times New Roman" w:hAnsi="Times New Roman"/>
+                <w:i/>
+                <w:iCs/>
+                <w:sz w:val="20"/>
+              </w:rPr>
+              <w:t xml:space="preserve">"a legal analysis question requiring identification of the relevant rule and correct application to the facts"</w:t>
+            </w:r>
+          </w:p>
+        </w:tc>
+        <w:tc>
+          <w:tcPr>
+            <w:tcBorders>
+              <w:left w:val="nil"/>
+              <w:right w:val="nil"/>
+              <w:top w:val="nil"/>
+              <w:bottom w:val="nil"/>
+            </w:tcBorders>
+          </w:tcPr>
+          <w:p>
+            <w:pPr>
+              <w:pStyle w:val="Compact"/>
+              <w:spacing w:before="0" w:after="20" w:line="240" w:lineRule="auto"/>
+              <w:jc w:val="center"/>
+              <w:keepNext w:val="0"/>
+              <w:keepLines/>
+              <w:widowControl w:val="1"/>
+            </w:pPr>
+            <w:r>
+              <w:rPr>
+                <w:rFonts w:ascii="Times New Roman" w:hAnsi="Times New Roman"/>
+                <w:sz w:val="20"/>
+              </w:rPr>
+              <w:t xml:space="preserve">area_of_law {contracts, torts, criminal, constitutional, intellectual_property}; complexity {basic, intermediate, advanced}</w:t>
+            </w:r>
+          </w:p>
+        </w:tc>
+        <w:tc>
+          <w:tcPr>
+            <w:tcBorders>
+              <w:left w:val="nil"/>
+              <w:right w:val="nil"/>
+              <w:top w:val="nil"/>
+              <w:bottom w:val="nil"/>
+            </w:tcBorders>
+          </w:tcPr>
+          <w:p>
+            <w:pPr>
+              <w:pStyle w:val="Compact"/>
+              <w:spacing w:before="0" w:after="20" w:line="240" w:lineRule="auto"/>
+              <w:jc w:val="center"/>
+              <w:keepNext w:val="0"/>
+              <w:keepLines/>
+              <w:widowControl w:val="1"/>
+            </w:pPr>
+            <w:r>
+              <w:rPr>
+                <w:rFonts w:ascii="Times New Roman" w:hAnsi="Times New Roman"/>
+                <w:sz w:val="20"/>
+              </w:rPr>
+              <w:t xml:space="preserve">legal_accuracy, reasoning_quality, completeness, clarity</w:t>
+            </w:r>
+          </w:p>
+        </w:tc>
+      </w:tr>
+    </w:tbl>
+    <w:p>
+      <w:pPr>
+        <w:pStyle w:val="BodyText"/>
+        <w:spacing w:before="160"/>
+        <w:jc w:val="both"/>
+        <w:keepNext w:val="0"/>
+        <w:keepLines w:val="0"/>
+        <w:widowControl w:val="1"/>
+      </w:pPr>
+      <w:r>
+        <w:t xml:space="preserve">One representative</w:t>
+      </w:r>
+      <w:r>
+        <w:t xml:space="preserve"> </w:t>
+      </w:r>
+      <w:r>
+        <w:rPr>
+          <w:i/>
+          <w:iCs/>
+        </w:rPr>
+        <w:t xml:space="preserve">generated</w:t>
+      </w:r>
+      <w:r>
+        <w:t xml:space="preserve"> </w:t>
+      </w:r>
+      <w:r>
+        <w:t xml:space="preserve">item per domain (verbatim teacher output, labeled with its sampled attribute</w:t>
+      </w:r>
+      <w:r>
+        <w:t xml:space="preserve"> </w:t>
+      </w:r>
+      <w:r>
+        <w:t xml:space="preserve">cell), showing the synthesized items are specific and realistic rather than templated:</w:t>
+      </w:r>
+    </w:p>
+    <w:p>
+      <w:pPr>
+        <w:pStyle w:val="Compact"/>
+        <w:numPr>
+          <w:ilvl w:val="0"/>
+          <w:numId w:val="1003"/>
+        </w:numPr>
+        <w:jc w:val="both"/>
+        <w:keepNext w:val="0"/>
+        <w:keepLines w:val="0"/>
+        <w:widowControl w:val="1"/>
+      </w:pPr>
+      <w:r>
+        <w:rPr>
+          <w:b/>
+          <w:bCs/>
+        </w:rPr>
+        <w:t xml:space="preserve">DDI</w:t>
+      </w:r>
+      <w:r>
+        <w:t xml:space="preserve"> </w:t>
+      </w:r>
+      <w:r>
+        <w:t xml:space="preserve">(severity = moderate, mechanism = pharmacokinetic, patient_context = pregnancy):</w:t>
+      </w:r>
+      <w:r>
+        <w:t xml:space="preserve"> </w:t>
+      </w:r>
+      <w:r>
+        <w:rPr>
+          <w:i/>
+          <w:iCs/>
+        </w:rPr>
+        <w:t xml:space="preserve">"A 30-year-old pregnant woman is prescribed lamotrigine for bipolar disorder and is also taking oral</w:t>
+      </w:r>
+      <w:r>
+        <w:rPr>
+          <w:i/>
+          <w:iCs/>
+        </w:rPr>
+        <w:t xml:space="preserve"> </w:t>
+      </w:r>
+      <w:r>
+        <w:rPr>
+          <w:i/>
+          <w:iCs/>
+        </w:rPr>
+        <w:t xml:space="preserve">contraceptives. Assess the drug–drug interaction between these medications, identify the mechanism, and provide</w:t>
+      </w:r>
+      <w:r>
+        <w:rPr>
+          <w:i/>
+          <w:iCs/>
+        </w:rPr>
+        <w:t xml:space="preserve"> </w:t>
+      </w:r>
+      <w:r>
+        <w:rPr>
+          <w:i/>
+          <w:iCs/>
+        </w:rPr>
+        <w:t xml:space="preserve">the severity and clinical recommendation."</w:t>
+      </w:r>
+    </w:p>
+    <w:p>
+      <w:pPr>
+        <w:pStyle w:val="Compact"/>
+        <w:numPr>
+          <w:ilvl w:val="0"/>
+          <w:numId w:val="1003"/>
+        </w:numPr>
+        <w:jc w:val="both"/>
+        <w:keepNext w:val="0"/>
+        <w:keepLines w:val="0"/>
+        <w:widowControl w:val="1"/>
+      </w:pPr>
+      <w:r>
+        <w:rPr>
+          <w:b/>
+          <w:bCs/>
+        </w:rPr>
+        <w:t xml:space="preserve">Clinical</w:t>
+      </w:r>
+      <w:r>
+        <w:t xml:space="preserve"> </w:t>
+      </w:r>
+      <w:r>
+        <w:t xml:space="preserve">(specialty = cardiology, difficulty = routine):</w:t>
+      </w:r>
+      <w:r>
+        <w:t xml:space="preserve"> </w:t>
+      </w:r>
+      <w:r>
+        <w:rPr>
+          <w:i/>
+          <w:iCs/>
+        </w:rPr>
+        <w:t xml:space="preserve">"A 62-year-old male with a history of hypertension and hyperlipidemia presents with progressive shortness of</w:t>
+      </w:r>
+      <w:r>
+        <w:rPr>
+          <w:i/>
+          <w:iCs/>
+        </w:rPr>
+        <w:t xml:space="preserve"> </w:t>
+      </w:r>
+      <w:r>
+        <w:rPr>
+          <w:i/>
+          <w:iCs/>
+        </w:rPr>
+        <w:t xml:space="preserve">breath and occasional palpitations. On examination, you note elevated jugular venous pressure and a third heart</w:t>
+      </w:r>
+      <w:r>
+        <w:rPr>
+          <w:i/>
+          <w:iCs/>
+        </w:rPr>
+        <w:t xml:space="preserve"> </w:t>
+      </w:r>
+      <w:r>
+        <w:rPr>
+          <w:i/>
+          <w:iCs/>
+        </w:rPr>
+        <w:t xml:space="preserve">sound. An ECG shows left ventricular hypertrophy. What is the most likely diagnosis and what initial management</w:t>
+      </w:r>
+      <w:r>
+        <w:rPr>
+          <w:i/>
+          <w:iCs/>
+        </w:rPr>
+        <w:t xml:space="preserve"> </w:t>
+      </w:r>
+      <w:r>
+        <w:rPr>
+          <w:i/>
+          <w:iCs/>
+        </w:rPr>
+        <w:t xml:space="preserve">strategy should be considered?"</w:t>
+      </w:r>
+    </w:p>
+    <w:p>
+      <w:pPr>
+        <w:pStyle w:val="Compact"/>
+        <w:numPr>
+          <w:ilvl w:val="0"/>
+          <w:numId w:val="1003"/>
+        </w:numPr>
+        <w:jc w:val="both"/>
+        <w:keepNext w:val="0"/>
+        <w:keepLines w:val="0"/>
+        <w:widowControl w:val="1"/>
+      </w:pPr>
+      <w:r>
+        <w:rPr>
+          <w:b/>
+          <w:bCs/>
+        </w:rPr>
+        <w:t xml:space="preserve">Legal</w:t>
+      </w:r>
+      <w:r>
+        <w:t xml:space="preserve"> </w:t>
+      </w:r>
+      <w:r>
+        <w:t xml:space="preserve">(area_of_law = torts, complexity = basic):</w:t>
+      </w:r>
+      <w:r>
+        <w:t xml:space="preserve"> </w:t>
+      </w:r>
+      <w:r>
+        <w:rPr>
+          <w:i/>
+          <w:iCs/>
+        </w:rPr>
+        <w:t xml:space="preserve">"Alice, while jogging in the park, trips over a tree root that has been exposed due to erosion and falls,</w:t>
+      </w:r>
+      <w:r>
+        <w:rPr>
+          <w:i/>
+          <w:iCs/>
+        </w:rPr>
+        <w:t xml:space="preserve"> </w:t>
+      </w:r>
+      <w:r>
+        <w:rPr>
+          <w:i/>
+          <w:iCs/>
+        </w:rPr>
+        <w:t xml:space="preserve">breaking her wrist. The park is owned by the city, and Alice claims the city is liable for her injuries due to</w:t>
+      </w:r>
+      <w:r>
+        <w:rPr>
+          <w:i/>
+          <w:iCs/>
+        </w:rPr>
+        <w:t xml:space="preserve"> </w:t>
+      </w:r>
+      <w:r>
+        <w:rPr>
+          <w:i/>
+          <w:iCs/>
+        </w:rPr>
+        <w:t xml:space="preserve">negligence. Identify the relevant rule and determine if Alice can successfully hold the city liable."</w:t>
+      </w:r>
+    </w:p>
+    <w:p>
+      <w:pPr>
+        <w:pStyle w:val="FirstParagraph"/>
+        <w:jc w:val="both"/>
+        <w:keepNext w:val="0"/>
+        <w:keepLines w:val="0"/>
+        <w:widowControl w:val="1"/>
+      </w:pPr>
+      <w:r>
+        <w:t xml:space="preserve">Each item is scored on its rubric by the panel, producing the rankings in Table 5. On DDI the three judges are</w:t>
+      </w:r>
+      <w:r>
+        <w:t xml:space="preserve"> </w:t>
+      </w:r>
+      <w:r>
+        <w:t xml:space="preserve">unanimous,</w:t>
+      </w:r>
+      <w:r>
+        <w:t xml:space="preserve"> </w:t>
+      </w:r>
+      <w:r>
+        <w:rPr>
+          <w:rStyle w:val="VerbatimChar"/>
+        </w:rPr>
+        <w:t xml:space="preserve">gpt-4o-mini</w:t>
+      </w:r>
+      <w:r>
+        <w:t xml:space="preserve"> </w:t>
+      </w:r>
+      <w:r>
+        <w:t xml:space="preserve">(</w:t>
+      </w:r>
+      <m:oMath>
+        <m:r>
+          <m:t>0.770</m:t>
+        </m:r>
+      </m:oMath>
+      <w:r>
+        <w:t xml:space="preserve">) &gt;</w:t>
+      </w:r>
+      <w:r>
+        <w:t xml:space="preserve"> </w:t>
+      </w:r>
+      <w:r>
+        <w:rPr>
+          <w:rStyle w:val="VerbatimChar"/>
+        </w:rPr>
+        <w:t xml:space="preserve">gpt-3.5-turbo</w:t>
+      </w:r>
+      <w:r>
+        <w:t xml:space="preserve"> </w:t>
+      </w:r>
+      <w:r>
+        <w:t xml:space="preserve">(</w:t>
+      </w:r>
+      <m:oMath>
+        <m:r>
+          <m:t>0.682</m:t>
+        </m:r>
+      </m:oMath>
+      <w:r>
+        <w:t xml:space="preserve">) &gt;</w:t>
+      </w:r>
+      <w:r>
+        <w:t xml:space="preserve"> </w:t>
+      </w:r>
+      <w:r>
+        <w:rPr>
+          <w:rStyle w:val="VerbatimChar"/>
+        </w:rPr>
+        <w:t xml:space="preserve">llama-3.2-3b</w:t>
+      </w:r>
+      <w:r>
+        <w:t xml:space="preserve"> </w:t>
+      </w:r>
+      <w:r>
+        <w:t xml:space="preserve">(</w:t>
+      </w:r>
+      <m:oMath>
+        <m:r>
+          <m:t>0.497</m:t>
+        </m:r>
+      </m:oMath>
+      <w:r>
+        <w:t xml:space="preserve">), with non-overlapping confidence intervals; on clinical reasoning the two stronger</w:t>
+      </w:r>
+      <w:r>
+        <w:t xml:space="preserve"> </w:t>
+      </w:r>
+      <w:r>
+        <w:t xml:space="preserve">models are statistically close (</w:t>
+      </w:r>
+      <m:oMath>
+        <m:r>
+          <m:t>0.873</m:t>
+        </m:r>
+      </m:oMath>
+      <w:r>
+        <w:t xml:space="preserve"> </w:t>
+      </w:r>
+      <w:r>
+        <w:t xml:space="preserve">vs</w:t>
+      </w:r>
+      <w:r>
+        <w:t xml:space="preserve"> </w:t>
+      </w:r>
+      <m:oMath>
+        <m:r>
+          <m:t>0.864</m:t>
+        </m:r>
+      </m:oMath>
+      <w:r>
+        <w:t xml:space="preserve">), which the overlapping intervals correctly expose. The entire path</w:t>
+      </w:r>
+      <w:r>
+        <w:t xml:space="preserve"> </w:t>
+      </w:r>
+      <w:r>
+        <w:t xml:space="preserve">from a one-line description to a defensible, contamination-free ranking is a single configuration file with no labeled</w:t>
+      </w:r>
+      <w:r>
+        <w:t xml:space="preserve"> </w:t>
+      </w:r>
+      <w:r>
+        <w:t xml:space="preserve">data and no human raters.</w:t>
+      </w:r>
+    </w:p>
+    <w:bookmarkEnd w:id="117"/>
     <w:sectPr>
       <w:footerReference w:type="default" r:id="rId9"/>
       <w:pgSz w:h="15840" w:w="12240"/>
@@ -15745,6 +16757,9 @@
     <w:lvlOverride w:ilvl="8">
       <w:startOverride w:val="1"/>
     </w:lvlOverride>
+  </w:num>
+  <w:num w:numId="1003">
+    <w:abstractNumId w:val="991"/>
   </w:num>
 </w:numbering>
 </file>

</xml_diff>

<commit_message>
paper: tighten abstract to <=1500 chars; regenerate single + two-column docx
Abstract rewritten from 3454 -> 1493 characters, keeping every load-bearing claim
(no-labels/contamination problem; reusable open framework that generates fresh items
and ranks via a cross-family ensemble; rho=0.86 ranking recovery; composition>size +
judge-choice regret 0.35; 0.0000 13-gram overlap; verbosity/self-preference; 7,978
evals / USD 5.89; re-runnable per release). Abstract-body parity holds; 0 em-dashes,
0 tone hits, 32/32 citations intact.

Regenerated both Word versions via the html2doc skill:
- CoEval.docx          single-column (matches the web paper; live download link)
- CoEval_twocolumn.docx arXiv-ready two-column (full-width title/abstract, two-column
  body, full-width table/figure floats) -- save as PDF for arXiv.
Both: 0 stray $, 0 em-dash, 167 native OMML equations.

Co-Authored-By: Claude Opus 4.8 <noreply@anthropic.com>
</commit_message>
<xml_diff>
--- a/docs/paper/CoEval.docx
+++ b/docs/paper/CoEval.docx
@@ -115,7 +115,7 @@
         <w:widowControl w:val="1"/>
       </w:pPr>
       <w:r>
-        <w:t xml:space="preserve">Choosing or ranking language models for a specific application is hardest when it matters most: when</w:t>
+        <w:t xml:space="preserve">Choosing or ranking language models for a specific application is hardest when</w:t>
       </w:r>
       <w:r>
         <w:t xml:space="preserve"> </w:t>
@@ -125,13 +125,13 @@
           <w:i/>
           <w:iCs/>
         </w:rPr>
-        <w:t xml:space="preserve">no task-specific labeled data exists</w:t>
-      </w:r>
-      <w:r>
-        <w:t xml:space="preserve"> </w:t>
-      </w:r>
-      <w:r>
-        <w:t xml:space="preserve">to build an evaluation set, and when</w:t>
+        <w:t xml:space="preserve">no task-specific labeled data</w:t>
+      </w:r>
+      <w:r>
+        <w:t xml:space="preserve"> </w:t>
+      </w:r>
+      <w:r>
+        <w:t xml:space="preserve">exists and</w:t>
       </w:r>
       <w:r>
         <w:t xml:space="preserve"> </w:t>
@@ -141,120 +141,76 @@
           <w:i/>
           <w:iCs/>
         </w:rPr>
-        <w:t xml:space="preserve">standard public benchmarks</w:t>
+        <w:t xml:space="preserve">standard public benchmarks cannot be trusted</w:t>
+      </w:r>
+      <w:r>
+        <w:t xml:space="preserve">, their items having likely leaked into pretraining so</w:t>
+      </w:r>
+      <w:r>
+        <w:t xml:space="preserve"> </w:t>
+      </w:r>
+      <w:r>
+        <w:t xml:space="preserve">scores reflect memorization rather than fitness. We present</w:t>
+      </w:r>
+      <w:r>
+        <w:t xml:space="preserve"> </w:t>
+      </w:r>
+      <w:r>
+        <w:rPr>
+          <w:b/>
+          <w:bCs/>
+        </w:rPr>
+        <w:t xml:space="preserve">CoEval</w:t>
+      </w:r>
+      <w:r>
+        <w:t xml:space="preserve">, an open-source, reusable framework</w:t>
+      </w:r>
+      <w:r>
+        <w:t xml:space="preserve"> </w:t>
+      </w:r>
+      <w:r>
+        <w:t xml:space="preserve">that closes this gap end to end: from only a description of a task or domain, teacher models synthesize a fresh,</w:t>
+      </w:r>
+      <w:r>
+        <w:t xml:space="preserve"> </w:t>
+      </w:r>
+      <w:r>
+        <w:t xml:space="preserve">attribute-controlled benchmark with</w:t>
+      </w:r>
+      <w:r>
+        <w:t xml:space="preserve"> </w:t>
       </w:r>
       <w:r>
         <w:rPr>
           <w:i/>
           <w:iCs/>
         </w:rPr>
-        <w:t xml:space="preserve"> </w:t>
-      </w:r>
-      <w:r>
-        <w:rPr>
-          <w:i/>
-          <w:iCs/>
-        </w:rPr>
-        <w:t xml:space="preserve">cannot be trusted</w:t>
-      </w:r>
-      <w:r>
-        <w:t xml:space="preserve"> </w:t>
-      </w:r>
-      <w:r>
-        <w:t xml:space="preserve">because their items have likely leaked into pretraining, so leaderboard numbers may reflect</w:t>
-      </w:r>
-      <w:r>
-        <w:t xml:space="preserve"> </w:t>
-      </w:r>
-      <w:r>
-        <w:t xml:space="preserve">memorization rather than fitness for the use case. Existing tools address only one side of this gap: automated</w:t>
-      </w:r>
-      <w:r>
-        <w:t xml:space="preserve"> </w:t>
-      </w:r>
-      <w:r>
-        <w:t xml:space="preserve">benchmark generators still score with a single, bias-prone judge; LLM-as-judge panels presuppose that an evaluation</w:t>
-      </w:r>
-      <w:r>
-        <w:t xml:space="preserve"> </w:t>
-      </w:r>
-      <w:r>
-        <w:t xml:space="preserve">set already exists; and continually refreshed live benchmarks curb leakage only through ongoing human curation and</w:t>
-      </w:r>
-      <w:r>
-        <w:t xml:space="preserve"> </w:t>
-      </w:r>
-      <w:r>
-        <w:t xml:space="preserve">avoid open-ended, judge-scored tasks. No existing approach supplies contamination-free, label-free, domain-targeted</w:t>
-      </w:r>
-      <w:r>
-        <w:t xml:space="preserve"> </w:t>
-      </w:r>
-      <w:r>
-        <w:t xml:space="preserve">evaluation end to end. We present</w:t>
-      </w:r>
-      <w:r>
-        <w:t xml:space="preserve"> </w:t>
-      </w:r>
-      <w:r>
-        <w:rPr>
-          <w:b/>
-          <w:bCs/>
-        </w:rPr>
-        <w:t xml:space="preserve">CoEval</w:t>
-      </w:r>
-      <w:r>
-        <w:t xml:space="preserve">, an open-source, reusable framework that</w:t>
-      </w:r>
-      <w:r>
-        <w:t xml:space="preserve"> </w:t>
-      </w:r>
-      <w:r>
-        <w:t xml:space="preserve">addresses both conditions: from only a description of a task or domain, teacher models synthesize a fresh,</w:t>
-      </w:r>
-      <w:r>
-        <w:t xml:space="preserve"> </w:t>
-      </w:r>
-      <w:r>
-        <w:t xml:space="preserve">attribute-controlled benchmark with</w:t>
-      </w:r>
-      <w:r>
-        <w:t xml:space="preserve"> </w:t>
-      </w:r>
-      <w:r>
-        <w:rPr>
-          <w:i/>
-          <w:iCs/>
-        </w:rPr>
         <w:t xml:space="preserve">no human labels</w:t>
       </w:r>
       <w:r>
-        <w:t xml:space="preserve">, contamination-free because items are generated</w:t>
-      </w:r>
-      <w:r>
-        <w:t xml:space="preserve"> </w:t>
-      </w:r>
-      <w:r>
-        <w:t xml:space="preserve">anew on each run. A cross-family judge ensemble then ranks candidate models, with no human raters. We validate the</w:t>
-      </w:r>
-      <w:r>
-        <w:t xml:space="preserve"> </w:t>
-      </w:r>
-      <w:r>
-        <w:t xml:space="preserve">tool against objective ground truth, then apply it where none exists: CoEval recovers the true model ranking</w:t>
-      </w:r>
-      <w:r>
-        <w:t xml:space="preserve"> </w:t>
-      </w:r>
-      <w:r>
-        <w:t xml:space="preserve">with no labeled data and its label-free scores track ground-truth correctness at</w:t>
+        <w:t xml:space="preserve">, contamination-free because items are generated anew on</w:t>
+      </w:r>
+      <w:r>
+        <w:t xml:space="preserve"> </w:t>
+      </w:r>
+      <w:r>
+        <w:t xml:space="preserve">each run, and a cross-family judge ensemble ranks candidate models with no human raters. Validated where ground truth</w:t>
+      </w:r>
+      <w:r>
+        <w:t xml:space="preserve"> </w:t>
+      </w:r>
+      <w:r>
+        <w:t xml:space="preserve">exists, CoEval recovers the true model ranking and tracks ground-truth correctness at</w:t>
       </w:r>
       <w:r>
         <w:t xml:space="preserve"> </w:t>
       </w:r>
       <m:oMath>
         <m:r>
-          <m:t>ρ</m:t>
+          <m:t>h</m:t>
+        </m:r>
+        <m:r>
+          <m:t>o</m:t>
         </m:r>
         <m:r>
           <m:rPr>
@@ -267,13 +223,13 @@
         </m:r>
       </m:oMath>
       <w:r>
-        <w:t xml:space="preserve">. A complementary</w:t>
-      </w:r>
-      <w:r>
-        <w:t xml:space="preserve"> </w:t>
-      </w:r>
-      <w:r>
-        <w:t xml:space="preserve">technical finding makes the label-free judging reliable without human calibration: judge-panel</w:t>
+        <w:t xml:space="preserve">. The label-free</w:t>
+      </w:r>
+      <w:r>
+        <w:t xml:space="preserve"> </w:t>
+      </w:r>
+      <w:r>
+        <w:t xml:space="preserve">judging needs no human calibration because judge-panel</w:t>
       </w:r>
       <w:r>
         <w:t xml:space="preserve"> </w:t>
@@ -289,7 +245,7 @@
         <w:t xml:space="preserve"> </w:t>
       </w:r>
       <w:r>
-        <w:t xml:space="preserve">(diversity across vendor families), not panel</w:t>
+        <w:t xml:space="preserve">(vendor diversity), not</w:t>
       </w:r>
       <w:r>
         <w:t xml:space="preserve"> </w:t>
@@ -302,47 +258,19 @@
         <w:t xml:space="preserve">size</w:t>
       </w:r>
       <w:r>
-        <w:t xml:space="preserve">, determines</w:t>
-      </w:r>
-      <w:r>
-        <w:t xml:space="preserve"> </w:t>
-      </w:r>
-      <w:r>
-        <w:t xml:space="preserve">reliability, and indiscriminately enlarging a panel can</w:t>
-      </w:r>
-      <w:r>
-        <w:t xml:space="preserve"> </w:t>
-      </w:r>
-      <w:r>
-        <w:rPr>
-          <w:i/>
-          <w:iCs/>
-        </w:rPr>
-        <w:t xml:space="preserve">reduce</w:t>
-      </w:r>
-      <w:r>
-        <w:t xml:space="preserve"> </w:t>
-      </w:r>
-      <w:r>
-        <w:t xml:space="preserve">it (inter-rater reliability peaks at two</w:t>
-      </w:r>
-      <w:r>
-        <w:t xml:space="preserve"> </w:t>
-      </w:r>
-      <w:r>
-        <w:t xml:space="preserve">well-chosen judges and falls as low-agreement judges are added, exactly matching the Spearman–Brown relation).</w:t>
-      </w:r>
-      <w:r>
-        <w:t xml:space="preserve"> </w:t>
-      </w:r>
-      <w:r>
-        <w:t xml:space="preserve">Composition is what makes a single judge unsafe to pick blind: on a benchmark-grounded set the candidate judges range</w:t>
-      </w:r>
-      <w:r>
-        <w:t xml:space="preserve"> </w:t>
-      </w:r>
-      <w:r>
-        <w:t xml:space="preserve">from anti-correlated to moderately correlated with ground truth (a judge-choice regret of</w:t>
+        <w:t xml:space="preserve">,</w:t>
+      </w:r>
+      <w:r>
+        <w:t xml:space="preserve"> </w:t>
+      </w:r>
+      <w:r>
+        <w:t xml:space="preserve">drives reliability: a small, well-chosen cross-family panel is most reliable, while a single judge can be</w:t>
+      </w:r>
+      <w:r>
+        <w:t xml:space="preserve"> </w:t>
+      </w:r>
+      <w:r>
+        <w:t xml:space="preserve">anti-correlated with ground truth (judge-choice regret</w:t>
       </w:r>
       <w:r>
         <w:t xml:space="preserve"> </w:t>
@@ -353,64 +281,7 @@
         </m:r>
       </m:oMath>
       <w:r>
-        <w:t xml:space="preserve">), whereas the</w:t>
-      </w:r>
-      <w:r>
-        <w:t xml:space="preserve"> </w:t>
-      </w:r>
-      <w:r>
-        <w:t xml:space="preserve">cross-family ensemble is never anti-correlated, and an unsupervised reliability-weighted aggregator is the strongest</w:t>
-      </w:r>
-      <w:r>
-        <w:t xml:space="preserve"> </w:t>
-      </w:r>
-      <w:r>
-        <w:t xml:space="preserve">label-free choice.</w:t>
-      </w:r>
-      <w:r>
-        <w:t xml:space="preserve"> </w:t>
-      </w:r>
-      <w:r>
-        <w:t xml:space="preserve">CoEval fills three roles,</w:t>
-      </w:r>
-      <w:r>
-        <w:t xml:space="preserve"> </w:t>
-      </w:r>
-      <w:r>
-        <w:rPr>
-          <w:i/>
-          <w:iCs/>
-        </w:rPr>
-        <w:t xml:space="preserve">teacher</w:t>
-      </w:r>
-      <w:r>
-        <w:t xml:space="preserve">,</w:t>
-      </w:r>
-      <w:r>
-        <w:t xml:space="preserve"> </w:t>
-      </w:r>
-      <w:r>
-        <w:rPr>
-          <w:i/>
-          <w:iCs/>
-        </w:rPr>
-        <w:t xml:space="preserve">student</w:t>
-      </w:r>
-      <w:r>
-        <w:t xml:space="preserve">, and</w:t>
-      </w:r>
-      <w:r>
-        <w:t xml:space="preserve"> </w:t>
-      </w:r>
-      <w:r>
-        <w:rPr>
-          <w:i/>
-          <w:iCs/>
-        </w:rPr>
-        <w:t xml:space="preserve">judge</w:t>
-      </w:r>
-      <w:r>
-        <w:t xml:space="preserve">, from one shared pool of models: any model can take any role, and a model that judges in one run can be a candidate in another, all configured from a single file across many provider interfaces. Generated items have</w:t>
+        <w:t xml:space="preserve">) and the ensemble never is. Generated items show</w:t>
       </w:r>
       <w:r>
         <w:t xml:space="preserve"> </w:t>
@@ -424,166 +295,25 @@
         <w:t xml:space="preserve"> </w:t>
       </w:r>
       <w:r>
-        <w:t xml:space="preserve">verbatim 13-gram overlap with five major public benchmarks. Across a four-task medium-scale</w:t>
-      </w:r>
-      <w:r>
-        <w:t xml:space="preserve"> </w:t>
-      </w:r>
-      <w:r>
-        <w:t xml:space="preserve">study, CoEval produced 7,978 valid evaluations at a total cost of USD 5.89 with no human annotation. We show that the</w:t>
-      </w:r>
-      <w:r>
-        <w:t xml:space="preserve"> </w:t>
-      </w:r>
-      <w:r>
-        <w:t xml:space="preserve">ensemble removes a verbosity bias that no single judge avoids (mean per-judge</w:t>
-      </w:r>
-      <w:r>
-        <w:t xml:space="preserve"> </w:t>
-      </w:r>
-      <m:oMath>
-        <m:r>
-          <m:rPr>
-            <m:sty m:val="p"/>
-          </m:rPr>
-          <m:t>|</m:t>
-        </m:r>
-        <m:r>
-          <m:t>r</m:t>
-        </m:r>
-        <m:r>
-          <m:rPr>
-            <m:sty m:val="p"/>
-          </m:rPr>
-          <m:t>|</m:t>
-        </m:r>
-        <m:r>
-          <m:rPr>
-            <m:sty m:val="p"/>
-          </m:rPr>
-          <m:t>=</m:t>
-        </m:r>
-        <m:r>
-          <m:t>0.153</m:t>
-        </m:r>
-      </m:oMath>
-      <w:r>
-        <w:t xml:space="preserve"> </w:t>
-      </w:r>
-      <w:r>
-        <w:t xml:space="preserve">collapses to an ensemble</w:t>
-      </w:r>
-      <w:r>
-        <w:t xml:space="preserve"> </w:t>
-      </w:r>
-      <m:oMath>
-        <m:r>
-          <m:t>r</m:t>
-        </m:r>
-        <m:r>
-          <m:rPr>
-            <m:sty m:val="p"/>
-          </m:rPr>
-          <m:t>=</m:t>
-        </m:r>
-        <m:r>
-          <m:rPr>
-            <m:sty m:val="p"/>
-          </m:rPr>
-          <m:t>+</m:t>
-        </m:r>
-        <m:r>
-          <m:t>0.010</m:t>
-        </m:r>
-      </m:oMath>
-      <w:r>
-        <w:t xml:space="preserve"> </w:t>
-      </w:r>
-      <w:r>
-        <w:t xml:space="preserve">with a bootstrap CI spanning zero, a 93% reduction) and structurally precludes same-family</w:t>
-      </w:r>
-      <w:r>
-        <w:t xml:space="preserve"> </w:t>
-      </w:r>
-      <w:r>
-        <w:t xml:space="preserve">self-preference, while producing task-specialized rubrics that share a universal quality core. On objective</w:t>
-      </w:r>
-      <w:r>
-        <w:t xml:space="preserve"> </w:t>
-      </w:r>
-      <w:r>
-        <w:t xml:space="preserve">exact-match QA the frontier cross-family ensemble tracks ground-truth correctness at</w:t>
-      </w:r>
-      <w:r>
-        <w:t xml:space="preserve"> </w:t>
-      </w:r>
-      <m:oMath>
-        <m:r>
-          <m:t>ρ</m:t>
-        </m:r>
-        <m:r>
-          <m:rPr>
-            <m:sty m:val="p"/>
-          </m:rPr>
-          <m:t>=</m:t>
-        </m:r>
-        <m:r>
-          <m:t>0.86</m:t>
-        </m:r>
-      </m:oMath>
-      <w:r>
-        <w:t xml:space="preserve"> </w:t>
-      </w:r>
-      <w:r>
-        <w:t xml:space="preserve">(datapoint-clustered 95% CI</w:t>
-      </w:r>
-      <w:r>
-        <w:t xml:space="preserve"> </w:t>
-      </w:r>
-      <m:oMath>
-        <m:r>
-          <m:rPr>
-            <m:sty m:val="p"/>
-          </m:rPr>
-          <m:t>[</m:t>
-        </m:r>
-        <m:r>
-          <m:t>0.77</m:t>
-        </m:r>
-        <m:r>
-          <m:rPr>
-            <m:sty m:val="p"/>
-          </m:rPr>
-          <m:t>,</m:t>
-        </m:r>
-        <m:r>
-          <m:t>0.94</m:t>
-        </m:r>
-        <m:r>
-          <m:rPr>
-            <m:sty m:val="p"/>
-          </m:rPr>
-          <m:t>]</m:t>
-        </m:r>
-      </m:oMath>
-      <w:r>
-        <w:t xml:space="preserve">) with vendor-independent agreement. This non-monotone reliability result, where adding low-agreement judges</w:t>
-      </w:r>
-      <w:r>
-        <w:t xml:space="preserve"> </w:t>
-      </w:r>
-      <w:r>
-        <w:rPr>
-          <w:i/>
-          <w:iCs/>
-        </w:rPr>
-        <w:t xml:space="preserve">reduces</w:t>
-      </w:r>
-      <w:r>
-        <w:t xml:space="preserve"> </w:t>
-      </w:r>
-      <w:r>
-        <w:t xml:space="preserve">reliability, is what lets a small, well-chosen cross-family panel serve as a trustworthy, label-free substitute for a contaminated leaderboard, one that any team can regenerate for its own application and re-run on every model release.</w:t>
+        <w:t xml:space="preserve">verbatim 13-gram overlap with five major public benchmarks; the panel cancels verbosity bias and precludes</w:t>
+      </w:r>
+      <w:r>
+        <w:t xml:space="preserve"> </w:t>
+      </w:r>
+      <w:r>
+        <w:t xml:space="preserve">same-family self-preference. A four-task study produced 7,978 evaluations for USD 5.89. The same declarative pipeline</w:t>
+      </w:r>
+      <w:r>
+        <w:t xml:space="preserve"> </w:t>
+      </w:r>
+      <w:r>
+        <w:t xml:space="preserve">applies to any domain and is cheap enough to re-run on every model release: a label-free, contamination-free</w:t>
+      </w:r>
+      <w:r>
+        <w:t xml:space="preserve"> </w:t>
+      </w:r>
+      <w:r>
+        <w:t xml:space="preserve">leaderboard any team can regenerate for its own application.</w:t>
       </w:r>
     </w:p>
     <w:bookmarkEnd w:id="10"/>

</xml_diff>

<commit_message>
paper: cite Dawid-Skene for the peer-consistency / latent-reliability lineage (§2.1 + §5.2)
The self-validating-panel mechanism (infer judge reliability from inter-rater agreement
with no ground truth) traces to Dawid & Skene (1979), whose EM algorithm jointly estimates
latent labels and per-rater error rates. Added it to related work (§2.1) and cited it where
the Dawid-Skene aggregator appears in the §5.2 bake-off. Reference r33; bibtest 33/33 valid.
PiCO held back (scout-flagged arXiv id not resolvable). Audits clean (0 em-dash, $ balanced,
33/33 cites resolve), docx regenerated.

Co-Authored-By: Claude Opus 4.8 <noreply@anthropic.com>
</commit_message>
<xml_diff>
--- a/docs/paper/CoEval.docx
+++ b/docs/paper/CoEval.docx
@@ -2056,6 +2056,51 @@
         <w:keepLines w:val="0"/>
         <w:widowControl w:val="1"/>
       </w:pPr>
+      <w:r>
+        <w:t xml:space="preserve">The idea that a rater's reliability can be inferred from inter-rater agreement, with no ground truth, dates back to</w:t>
+      </w:r>
+      <w:r>
+        <w:t xml:space="preserve"> </w:t>
+      </w:r>
+      <w:r>
+        <w:rPr>
+          <w:i/>
+          <w:iCs/>
+        </w:rPr>
+        <w:t xml:space="preserve">Dawid and Skene</w:t>
+      </w:r>
+      <w:r>
+        <w:t xml:space="preserve"> </w:t>
+      </w:r>
+      <w:r>
+        <w:t xml:space="preserve">[</w:t>
+      </w:r>
+      <w:hyperlink w:anchor="r33">
+        <w:r>
+          <w:rPr>
+            <w:rStyle w:val="Hyperlink"/>
+          </w:rPr>
+          <w:t xml:space="preserve">33</w:t>
+        </w:r>
+      </w:hyperlink>
+      <w:r>
+        <w:t xml:space="preserve">], whose EM algorithm estimates latent labels and per-rater error rates</w:t>
+      </w:r>
+      <w:r>
+        <w:t xml:space="preserve"> </w:t>
+      </w:r>
+      <w:r>
+        <w:t xml:space="preserve">jointly; CoEval applies the same principle to a vendor-disjoint LLM panel, where peer agreement both down-weights and</w:t>
+      </w:r>
+      <w:r>
+        <w:t xml:space="preserve"> </w:t>
+      </w:r>
+      <w:r>
+        <w:t xml:space="preserve">diagnoses unreliable judges (Section 5.2).</w:t>
+      </w:r>
+      <w:r>
+        <w:t xml:space="preserve"> </w:t>
+      </w:r>
       <w:r>
         <w:t xml:space="preserve">A parallel and very recent line of work makes judge aggregation itself</w:t>
       </w:r>
@@ -8450,7 +8495,18 @@
         </m:r>
       </m:oMath>
       <w:r>
-        <w:t xml:space="preserve">, and a Dawid–Skene latent-truth model over discretized scores reaches</w:t>
+        <w:t xml:space="preserve">, and a Dawid–Skene latent-truth model [</w:t>
+      </w:r>
+      <w:hyperlink w:anchor="r33">
+        <w:r>
+          <w:rPr>
+            <w:rStyle w:val="Hyperlink"/>
+          </w:rPr>
+          <w:t xml:space="preserve">33</w:t>
+        </w:r>
+      </w:hyperlink>
+      <w:r>
+        <w:t xml:space="preserve">] over discretized scores reaches</w:t>
       </w:r>
       <w:r>
         <w:t xml:space="preserve"> </w:t>
@@ -13538,7 +13594,7 @@
       </w:r>
     </w:p>
     <w:bookmarkEnd w:id="42"/>
-    <w:bookmarkStart w:id="107" w:name="references"/>
+    <w:bookmarkStart w:id="109" w:name="references"/>
     <w:p>
       <w:pPr>
         <w:pStyle w:val="ReferencesHeading"/>
@@ -15233,8 +15289,67 @@
       </w:hyperlink>
       <w:bookmarkEnd w:id="106"/>
     </w:p>
-    <w:bookmarkEnd w:id="107"/>
-    <w:bookmarkStart w:id="108" w:name="appA"/>
+    <w:p>
+      <w:pPr>
+        <w:pStyle w:val="ReferenceEntry"/>
+        <w:numPr>
+          <w:ilvl w:val="0"/>
+          <w:numId w:val="1002"/>
+        </w:numPr>
+        <w:jc w:val="left"/>
+        <w:keepNext w:val="0"/>
+        <w:keepLines w:val="0"/>
+        <w:widowControl w:val="1"/>
+      </w:pPr>
+      <w:bookmarkStart w:id="108" w:name="r33"/>
+      <w:r>
+        <w:t xml:space="preserve">Dawid, A. P., Skene, A. M. (1979).</w:t>
+      </w:r>
+      <w:r>
+        <w:t xml:space="preserve"> </w:t>
+      </w:r>
+      <w:r>
+        <w:rPr>
+          <w:i/>
+          <w:iCs/>
+        </w:rPr>
+        <w:t xml:space="preserve">Maximum Likelihood Estimation of Observer Error-Rates Using</w:t>
+      </w:r>
+      <w:r>
+        <w:rPr>
+          <w:i/>
+          <w:iCs/>
+        </w:rPr>
+        <w:t xml:space="preserve"> </w:t>
+      </w:r>
+      <w:r>
+        <w:rPr>
+          <w:i/>
+          <w:iCs/>
+        </w:rPr>
+        <w:t xml:space="preserve">the EM Algorithm.</w:t>
+      </w:r>
+      <w:r>
+        <w:t xml:space="preserve"> </w:t>
+      </w:r>
+      <w:r>
+        <w:t xml:space="preserve">Journal of the Royal Statistical Society: Series C (Applied Statistics), 28(1), 20–28.</w:t>
+      </w:r>
+      <w:r>
+        <w:t xml:space="preserve"> </w:t>
+      </w:r>
+      <w:hyperlink r:id="rId107">
+        <w:r>
+          <w:rPr>
+            <w:rStyle w:val="Hyperlink"/>
+          </w:rPr>
+          <w:t xml:space="preserve">doi.org/10.2307/2346806</w:t>
+        </w:r>
+      </w:hyperlink>
+      <w:bookmarkEnd w:id="108"/>
+    </w:p>
+    <w:bookmarkEnd w:id="109"/>
+    <w:bookmarkStart w:id="110" w:name="appA"/>
     <w:p>
       <w:pPr>
         <w:pStyle w:val="Heading2"/>
@@ -15915,8 +16030,8 @@
         <w:t xml:space="preserve">nested (multiple student responses per item).</w:t>
       </w:r>
     </w:p>
-    <w:bookmarkEnd w:id="108"/>
-    <w:bookmarkStart w:id="112" w:name="appB"/>
+    <w:bookmarkEnd w:id="110"/>
+    <w:bookmarkStart w:id="114" w:name="appB"/>
     <w:p>
       <w:pPr>
         <w:pStyle w:val="Heading2"/>
@@ -16047,18 +16162,18 @@
           <wp:inline>
             <wp:extent cx="5736336" cy="4998720"/>
             <wp:effectExtent b="0" l="0" r="0" t="0"/>
-            <wp:docPr descr="Heatmap of pairwise semantic similarity between auto-generated rubric criteria" title="" id="110" name="Picture"/>
+            <wp:docPr descr="Heatmap of pairwise semantic similarity between auto-generated rubric criteria" title="" id="112" name="Picture"/>
             <a:graphic>
               <a:graphicData uri="http://schemas.openxmlformats.org/drawingml/2006/picture">
                 <pic:pic>
                   <pic:nvPicPr>
-                    <pic:cNvPr descr="figures/f5_rubric_heatmap.png" id="111" name="Picture"/>
+                    <pic:cNvPr descr="figures/f5_rubric_heatmap.png" id="113" name="Picture"/>
                     <pic:cNvPicPr>
                       <a:picLocks noChangeArrowheads="1" noChangeAspect="1"/>
                     </pic:cNvPicPr>
                   </pic:nvPicPr>
                   <pic:blipFill>
-                    <a:blip r:embed="rId109"/>
+                    <a:blip r:embed="rId111"/>
                     <a:stretch>
                       <a:fillRect/>
                     </a:stretch>
@@ -16145,8 +16260,8 @@
         <w:t xml:space="preserve">), while a recurring “completeness” dimension forms a cross-task cluster.</w:t>
       </w:r>
     </w:p>
-    <w:bookmarkEnd w:id="112"/>
-    <w:bookmarkStart w:id="116" w:name="appC"/>
+    <w:bookmarkEnd w:id="114"/>
+    <w:bookmarkStart w:id="118" w:name="appC"/>
     <w:p>
       <w:pPr>
         <w:pStyle w:val="Heading2"/>
@@ -16171,18 +16286,18 @@
           <wp:inline>
             <wp:extent cx="4632960" cy="2987040"/>
             <wp:effectExtent b="0" l="0" r="0" t="0"/>
-            <wp:docPr descr="Evaluations per dollar: CoEval versus human annotation" title="" id="114" name="Picture"/>
+            <wp:docPr descr="Evaluations per dollar: CoEval versus human annotation" title="" id="116" name="Picture"/>
             <a:graphic>
               <a:graphicData uri="http://schemas.openxmlformats.org/drawingml/2006/picture">
                 <pic:pic>
                   <pic:nvPicPr>
-                    <pic:cNvPr descr="figures/f6_cost.png" id="115" name="Picture"/>
+                    <pic:cNvPr descr="figures/f6_cost.png" id="117" name="Picture"/>
                     <pic:cNvPicPr>
                       <a:picLocks noChangeArrowheads="1" noChangeAspect="1"/>
                     </pic:cNvPicPr>
                   </pic:nvPicPr>
                   <pic:blipFill>
-                    <a:blip r:embed="rId113"/>
+                    <a:blip r:embed="rId115"/>
                     <a:stretch>
                       <a:fillRect/>
                     </a:stretch>
@@ -16267,8 +16382,8 @@
         <w:t xml:space="preserve">re-evaluation on every model release.</w:t>
       </w:r>
     </w:p>
-    <w:bookmarkEnd w:id="116"/>
-    <w:bookmarkStart w:id="117" w:name="appD"/>
+    <w:bookmarkEnd w:id="118"/>
+    <w:bookmarkStart w:id="119" w:name="appD"/>
     <w:p>
       <w:pPr>
         <w:pStyle w:val="Heading2"/>
@@ -17204,7 +17319,7 @@
         <w:t xml:space="preserve">data and no human raters.</w:t>
       </w:r>
     </w:p>
-    <w:bookmarkEnd w:id="117"/>
+    <w:bookmarkEnd w:id="119"/>
     <w:sectPr>
       <w:footerReference w:type="default" r:id="rId9"/>
       <w:pgSz w:h="15840" w:w="12240"/>

</xml_diff>

<commit_message>
paper: retitle §5.2 to cover its full scope (composition, regret, self-validating panel)
The subsection grew to carry the core ensemble contribution (composition-over-size,
judge-choice regret + aggregation bake-off, self-validating panel + robustness/independence,
doubly-robust ranking); the heading now reflects that. Section number unchanged, so all
'Section 5.2' cross-references still resolve. docx regenerated.

Co-Authored-By: Claude Opus 4.8 <noreply@anthropic.com>
</commit_message>
<xml_diff>
--- a/docs/paper/CoEval.docx
+++ b/docs/paper/CoEval.docx
@@ -7160,7 +7160,7 @@
       </w:tr>
     </w:tbl>
     <w:bookmarkEnd w:id="27"/>
-    <w:bookmarkStart w:id="31" w:name="X8b3480caa00443f57186feaf5cffdc8fb88fe2f"/>
+    <w:bookmarkStart w:id="31" w:name="Xe8bbf6e8b303eda2252037f5179fa153abacf26"/>
     <w:p>
       <w:pPr>
         <w:pStyle w:val="Heading3"/>
@@ -7169,7 +7169,7 @@
         <w:widowControl w:val="1"/>
       </w:pPr>
       <w:r>
-        <w:t xml:space="preserve">5.2 Ensemble reliability and judge-choice regret</w:t>
+        <w:t xml:space="preserve">5.2 Ensemble reliability: composition, judge-choice regret, and a self-validating panel</w:t>
       </w:r>
     </w:p>
     <w:p>

</xml_diff>

<commit_message>
docs: fix missing figures in both Word docx (relative image-path resolution)
The prior regeneration wrote the MathML intermediate to /tmp/, so pandoc resolved
the relative <img src="figures/*.png"> paths against /tmp/ and silently dropped all
6 figures from BOTH CoEval.docx and CoEval_twocolumn.docx. Rebuilt with the
intermediate kept in docs/paper/ (beside figures/) so the relative paths resolve.

Both docx now embed all 6 figures; two-column render verified visually (Figure 1
architecture full-width float + Figure 4 correlation chart both display correctly).
Text intact (thirteen-model §5.2, §5.8, Table 6); 0 stray $.

Co-Authored-By: Claude Opus 4.8 <noreply@anthropic.com>
</commit_message>
<xml_diff>
--- a/docs/paper/CoEval.docx
+++ b/docs/paper/CoEval.docx
@@ -2625,7 +2625,7 @@
     </w:p>
     <w:bookmarkEnd w:id="13"/>
     <w:bookmarkEnd w:id="14"/>
-    <w:bookmarkStart w:id="19" w:name="the-coeval-framework"/>
+    <w:bookmarkStart w:id="22" w:name="the-coeval-framework"/>
     <w:p>
       <w:pPr>
         <w:pStyle w:val="Heading2"/>
@@ -2661,57 +2661,57 @@
         <w:t xml:space="preserve">layer.</w:t>
       </w:r>
     </w:p>
-    <w:tbl>
-      <w:tblPr>
-        <w:tblStyle w:val="FigureTable"/>
-        <w:tblW w:type="pct" w:w="5000"/>
+    <w:p>
+      <w:pPr>
+        <w:pStyle w:val="BodyText"/>
         <w:jc w:val="center"/>
-        <w:tblLook w:firstRow="0" w:lastRow="0" w:firstColumn="0" w:lastColumn="0"/>
-        <w:tblLayout w:type="autofit"/>
-        <w:tblBorders>
-          <w:top w:val="single" w:sz="10" w:color="4F6272"/>
-          <w:bottom w:val="single" w:sz="10" w:color="4F6272"/>
-          <w:insideH w:val="single" w:sz="5" w:color="9FB0C2"/>
-          <w:left w:val="single" w:sz="6" w:color="9FB0C2"/>
-          <w:right w:val="single" w:sz="6" w:color="9FB0C2"/>
-          <w:insideV w:val="single" w:sz="5" w:color="D9E1E8"/>
-        </w:tblBorders>
-      </w:tblPr>
-      <w:tblGrid>
-        <w:gridCol w:w="7920"/>
-      </w:tblGrid>
-      <w:tr>
-        <w:tc>
-          <w:tcPr>
-            <w:shd w:fill="EEF3F7"/>
-            <w:tcBorders>
-              <w:left w:val="nil"/>
-              <w:right w:val="nil"/>
-              <w:top w:val="nil"/>
-              <w:bottom w:val="single" w:sz="8" w:color="9FB0C2"/>
-            </w:tcBorders>
-          </w:tcPr>
-          <w:p>
-            <w:pPr>
-              <w:pStyle w:val="Compact"/>
-              <w:spacing w:before="0" w:after="20" w:line="240" w:lineRule="auto"/>
-              <w:jc w:val="center"/>
-              <w:keepNext w:val="0"/>
-              <w:keepLines/>
-              <w:widowControl w:val="1"/>
-            </w:pPr>
-            <w:r>
-              <w:rPr>
-                <w:rFonts w:ascii="Times New Roman" w:hAnsi="Times New Roman"/>
-                <w:b/>
-                <w:sz w:val="19"/>
-              </w:rPr>
-              <w:t xml:space="preserve">CoEval five-phase pipeline with teacher, student, and judge role bands</w:t>
-            </w:r>
-          </w:p>
-        </w:tc>
-      </w:tr>
-    </w:tbl>
+        <w:keepNext/>
+        <w:keepLines/>
+        <w:widowControl w:val="1"/>
+      </w:pPr>
+      <w:r>
+        <w:drawing>
+          <wp:inline>
+            <wp:extent cx="5943600" cy="1920171"/>
+            <wp:effectExtent b="0" l="0" r="0" t="0"/>
+            <wp:docPr descr="CoEval five-phase pipeline with teacher, student, and judge role bands" title="" id="16" name="Picture"/>
+            <a:graphic>
+              <a:graphicData uri="http://schemas.openxmlformats.org/drawingml/2006/picture">
+                <pic:pic>
+                  <pic:nvPicPr>
+                    <pic:cNvPr descr="figures/f1_architecture.png" id="17" name="Picture"/>
+                    <pic:cNvPicPr>
+                      <a:picLocks noChangeArrowheads="1" noChangeAspect="1"/>
+                    </pic:cNvPicPr>
+                  </pic:nvPicPr>
+                  <pic:blipFill>
+                    <a:blip r:embed="rId15"/>
+                    <a:stretch>
+                      <a:fillRect/>
+                    </a:stretch>
+                  </pic:blipFill>
+                  <pic:spPr bwMode="auto">
+                    <a:xfrm>
+                      <a:off x="0" y="0"/>
+                      <a:ext cx="5943600" cy="1920171"/>
+                    </a:xfrm>
+                    <a:prstGeom prst="rect">
+                      <a:avLst/>
+                    </a:prstGeom>
+                    <a:noFill/>
+                    <a:ln w="9525">
+                      <a:noFill/>
+                      <a:headEnd/>
+                      <a:tailEnd/>
+                    </a:ln>
+                  </pic:spPr>
+                </pic:pic>
+              </a:graphicData>
+            </a:graphic>
+          </wp:inline>
+        </w:drawing>
+      </w:r>
+    </w:p>
     <w:p>
       <w:pPr>
         <w:pStyle w:val="ImageCaption"/>
@@ -2753,7 +2753,7 @@
         <w:t xml:space="preserve">run is specified in one declarative configuration.</w:t>
       </w:r>
     </w:p>
-    <w:bookmarkStart w:id="15" w:name="teacher-student-and-judge-roles"/>
+    <w:bookmarkStart w:id="18" w:name="teacher-student-and-judge-roles"/>
     <w:p>
       <w:pPr>
         <w:pStyle w:val="Heading3"/>
@@ -2886,8 +2886,8 @@
         <w:t xml:space="preserve">inject items from an existing dataset, allowing CoEval scores to be grounded against native metrics (Section 5.1).</w:t>
       </w:r>
     </w:p>
-    <w:bookmarkEnd w:id="15"/>
-    <w:bookmarkStart w:id="16" w:name="attribute-stratified-generation"/>
+    <w:bookmarkEnd w:id="18"/>
+    <w:bookmarkStart w:id="19" w:name="attribute-stratified-generation"/>
     <w:p>
       <w:pPr>
         <w:pStyle w:val="Heading3"/>
@@ -3140,8 +3140,8 @@
         <w:t xml:space="preserve">pretraining. Contamination-resistance is a structural property of generation, not a post-hoc filter.</w:t>
       </w:r>
     </w:p>
-    <w:bookmarkEnd w:id="16"/>
-    <w:bookmarkStart w:id="17" w:name="X0942ce5d8c067f73a4447ce531e20e150caab8b"/>
+    <w:bookmarkEnd w:id="19"/>
+    <w:bookmarkStart w:id="20" w:name="X0942ce5d8c067f73a4447ce531e20e150caab8b"/>
     <w:p>
       <w:pPr>
         <w:pStyle w:val="Heading3"/>
@@ -3904,8 +3904,8 @@
         <w:t xml:space="preserve">, normalized. We evaluate these aggregators in Section 5.2.</w:t>
       </w:r>
     </w:p>
-    <w:bookmarkEnd w:id="17"/>
-    <w:bookmarkStart w:id="18" w:name="reliability-and-bias-metrics"/>
+    <w:bookmarkEnd w:id="20"/>
+    <w:bookmarkStart w:id="21" w:name="reliability-and-bias-metrics"/>
     <w:p>
       <w:pPr>
         <w:pStyle w:val="Heading3"/>
@@ -4041,9 +4041,9 @@
         <w:t xml:space="preserve">.</w:t>
       </w:r>
     </w:p>
-    <w:bookmarkEnd w:id="18"/>
-    <w:bookmarkEnd w:id="19"/>
-    <w:bookmarkStart w:id="20" w:name="experimental-setup"/>
+    <w:bookmarkEnd w:id="21"/>
+    <w:bookmarkEnd w:id="22"/>
+    <w:bookmarkStart w:id="23" w:name="experimental-setup"/>
     <w:p>
       <w:pPr>
         <w:pStyle w:val="Heading2"/>
@@ -4977,8 +4977,8 @@
         </w:tc>
       </w:tr>
     </w:tbl>
-    <w:bookmarkEnd w:id="20"/>
-    <w:bookmarkStart w:id="29" w:name="results"/>
+    <w:bookmarkEnd w:id="23"/>
+    <w:bookmarkStart w:id="41" w:name="results"/>
     <w:p>
       <w:pPr>
         <w:pStyle w:val="Heading2"/>
@@ -5138,7 +5138,7 @@
         <w:t xml:space="preserve">, and Section 5.5 shows the process is cheap enough to re-run per use case. Section 5.7 exercises the complete tool on three custom verticals (drug interaction, clinical, legal) with no labeled data, and Section 5.8 shows that rankings are domain-specific: across four de-novo domains three different models take first place, so a generic leaderboard misdirects the practitioner that CoEval's per-domain ranking serves.</w:t>
       </w:r>
     </w:p>
-    <w:bookmarkStart w:id="21" w:name="ground-truth-correlation"/>
+    <w:bookmarkStart w:id="27" w:name="ground-truth-correlation"/>
     <w:p>
       <w:pPr>
         <w:pStyle w:val="Heading3"/>
@@ -6618,57 +6618,57 @@
         <w:t xml:space="preserve">the framework is built to make easy.</w:t>
       </w:r>
     </w:p>
-    <w:tbl>
-      <w:tblPr>
-        <w:tblStyle w:val="FigureTable"/>
-        <w:tblW w:type="pct" w:w="5000"/>
+    <w:p>
+      <w:pPr>
+        <w:pStyle w:val="BodyText"/>
         <w:jc w:val="center"/>
-        <w:tblLook w:firstRow="0" w:lastRow="0" w:firstColumn="0" w:lastColumn="0"/>
-        <w:tblLayout w:type="autofit"/>
-        <w:tblBorders>
-          <w:top w:val="single" w:sz="10" w:color="4F6272"/>
-          <w:bottom w:val="single" w:sz="10" w:color="4F6272"/>
-          <w:insideH w:val="single" w:sz="5" w:color="9FB0C2"/>
-          <w:left w:val="single" w:sz="6" w:color="9FB0C2"/>
-          <w:right w:val="single" w:sz="6" w:color="9FB0C2"/>
-          <w:insideV w:val="single" w:sz="5" w:color="D9E1E8"/>
-        </w:tblBorders>
-      </w:tblPr>
-      <w:tblGrid>
-        <w:gridCol w:w="7920"/>
-      </w:tblGrid>
-      <w:tr>
-        <w:tc>
-          <w:tcPr>
-            <w:shd w:fill="EEF3F7"/>
-            <w:tcBorders>
-              <w:left w:val="nil"/>
-              <w:right w:val="nil"/>
-              <w:top w:val="nil"/>
-              <w:bottom w:val="single" w:sz="8" w:color="9FB0C2"/>
-            </w:tcBorders>
-          </w:tcPr>
-          <w:p>
-            <w:pPr>
-              <w:pStyle w:val="Compact"/>
-              <w:spacing w:before="0" w:after="20" w:line="240" w:lineRule="auto"/>
-              <w:jc w:val="center"/>
-              <w:keepNext w:val="0"/>
-              <w:keepLines/>
-              <w:widowControl w:val="1"/>
-            </w:pPr>
-            <w:r>
-              <w:rPr>
-                <w:rFonts w:ascii="Times New Roman" w:hAnsi="Times New Roman"/>
-                <w:b/>
-                <w:sz w:val="19"/>
-              </w:rPr>
-              <w:t xml:space="preserve">CoEval ensemble score versus ground-truth accuracy per model; rankings identical</w:t>
-            </w:r>
-          </w:p>
-        </w:tc>
-      </w:tr>
-    </w:tbl>
+        <w:keepNext/>
+        <w:keepLines/>
+        <w:widowControl w:val="1"/>
+      </w:pPr>
+      <w:r>
+        <w:drawing>
+          <wp:inline>
+            <wp:extent cx="5224272" cy="2987040"/>
+            <wp:effectExtent b="0" l="0" r="0" t="0"/>
+            <wp:docPr descr="CoEval ensemble score versus ground-truth accuracy per model; rankings identical" title="" id="25" name="Picture"/>
+            <a:graphic>
+              <a:graphicData uri="http://schemas.openxmlformats.org/drawingml/2006/picture">
+                <pic:pic>
+                  <pic:nvPicPr>
+                    <pic:cNvPr descr="figures/f4_correctness_corr.png" id="26" name="Picture"/>
+                    <pic:cNvPicPr>
+                      <a:picLocks noChangeArrowheads="1" noChangeAspect="1"/>
+                    </pic:cNvPicPr>
+                  </pic:nvPicPr>
+                  <pic:blipFill>
+                    <a:blip r:embed="rId24"/>
+                    <a:stretch>
+                      <a:fillRect/>
+                    </a:stretch>
+                  </pic:blipFill>
+                  <pic:spPr bwMode="auto">
+                    <a:xfrm>
+                      <a:off x="0" y="0"/>
+                      <a:ext cx="5224272" cy="2987040"/>
+                    </a:xfrm>
+                    <a:prstGeom prst="rect">
+                      <a:avLst/>
+                    </a:prstGeom>
+                    <a:noFill/>
+                    <a:ln w="9525">
+                      <a:noFill/>
+                      <a:headEnd/>
+                      <a:tailEnd/>
+                    </a:ln>
+                  </pic:spPr>
+                </pic:pic>
+              </a:graphicData>
+            </a:graphic>
+          </wp:inline>
+        </w:drawing>
+      </w:r>
+    </w:p>
     <w:p>
       <w:pPr>
         <w:pStyle w:val="ImageCaption"/>
@@ -7159,8 +7159,8 @@
         </w:tc>
       </w:tr>
     </w:tbl>
-    <w:bookmarkEnd w:id="21"/>
-    <w:bookmarkStart w:id="22" w:name="Xe8bbf6e8b303eda2252037f5179fa153abacf26"/>
+    <w:bookmarkEnd w:id="27"/>
+    <w:bookmarkStart w:id="31" w:name="Xe8bbf6e8b303eda2252037f5179fa153abacf26"/>
     <w:p>
       <w:pPr>
         <w:pStyle w:val="Heading3"/>
@@ -7787,57 +7787,57 @@
         <w:t xml:space="preserve">the full-panel ordering.</w:t>
       </w:r>
     </w:p>
-    <w:tbl>
-      <w:tblPr>
-        <w:tblStyle w:val="FigureTable"/>
-        <w:tblW w:type="pct" w:w="5000"/>
+    <w:p>
+      <w:pPr>
+        <w:pStyle w:val="BodyText"/>
         <w:jc w:val="center"/>
-        <w:tblLook w:firstRow="0" w:lastRow="0" w:firstColumn="0" w:lastColumn="0"/>
-        <w:tblLayout w:type="autofit"/>
-        <w:tblBorders>
-          <w:top w:val="single" w:sz="10" w:color="4F6272"/>
-          <w:bottom w:val="single" w:sz="10" w:color="4F6272"/>
-          <w:insideH w:val="single" w:sz="5" w:color="9FB0C2"/>
-          <w:left w:val="single" w:sz="6" w:color="9FB0C2"/>
-          <w:right w:val="single" w:sz="6" w:color="9FB0C2"/>
-          <w:insideV w:val="single" w:sz="5" w:color="D9E1E8"/>
-        </w:tblBorders>
-      </w:tblPr>
-      <w:tblGrid>
-        <w:gridCol w:w="7920"/>
-      </w:tblGrid>
-      <w:tr>
-        <w:tc>
-          <w:tcPr>
-            <w:shd w:fill="EEF3F7"/>
-            <w:tcBorders>
-              <w:left w:val="nil"/>
-              <w:right w:val="nil"/>
-              <w:top w:val="nil"/>
-              <w:bottom w:val="single" w:sz="8" w:color="9FB0C2"/>
-            </w:tcBorders>
-          </w:tcPr>
-          <w:p>
-            <w:pPr>
-              <w:pStyle w:val="Compact"/>
-              <w:spacing w:before="0" w:after="20" w:line="240" w:lineRule="auto"/>
-              <w:jc w:val="center"/>
-              <w:keepNext w:val="0"/>
-              <w:keepLines/>
-              <w:widowControl w:val="1"/>
-            </w:pPr>
-            <w:r>
-              <w:rPr>
-                <w:rFonts w:ascii="Times New Roman" w:hAnsi="Times New Roman"/>
-                <w:b/>
-                <w:sz w:val="19"/>
-              </w:rPr>
-              <w:t xml:space="preserve">ICC(3,k) versus number of judges, peaking at the selected strong panel</w:t>
-            </w:r>
-          </w:p>
-        </w:tc>
-      </w:tr>
-    </w:tbl>
+        <w:keepNext/>
+        <w:keepLines/>
+        <w:widowControl w:val="1"/>
+      </w:pPr>
+      <w:r>
+        <w:drawing>
+          <wp:inline>
+            <wp:extent cx="4815840" cy="3169920"/>
+            <wp:effectExtent b="0" l="0" r="0" t="0"/>
+            <wp:docPr descr="ICC(3,k) versus number of judges, peaking at the selected strong panel" title="" id="29" name="Picture"/>
+            <a:graphic>
+              <a:graphicData uri="http://schemas.openxmlformats.org/drawingml/2006/picture">
+                <pic:pic>
+                  <pic:nvPicPr>
+                    <pic:cNvPr descr="figures/f2_icc_curve.png" id="30" name="Picture"/>
+                    <pic:cNvPicPr>
+                      <a:picLocks noChangeArrowheads="1" noChangeAspect="1"/>
+                    </pic:cNvPicPr>
+                  </pic:nvPicPr>
+                  <pic:blipFill>
+                    <a:blip r:embed="rId28"/>
+                    <a:stretch>
+                      <a:fillRect/>
+                    </a:stretch>
+                  </pic:blipFill>
+                  <pic:spPr bwMode="auto">
+                    <a:xfrm>
+                      <a:off x="0" y="0"/>
+                      <a:ext cx="4815840" cy="3169920"/>
+                    </a:xfrm>
+                    <a:prstGeom prst="rect">
+                      <a:avLst/>
+                    </a:prstGeom>
+                    <a:noFill/>
+                    <a:ln w="9525">
+                      <a:noFill/>
+                      <a:headEnd/>
+                      <a:tailEnd/>
+                    </a:ln>
+                  </pic:spPr>
+                </pic:pic>
+              </a:graphicData>
+            </a:graphic>
+          </wp:inline>
+        </w:drawing>
+      </w:r>
+    </w:p>
     <w:p>
       <w:pPr>
         <w:pStyle w:val="ImageCaption"/>
@@ -9272,8 +9272,8 @@
         <w:t xml:space="preserve">.</w:t>
       </w:r>
     </w:p>
-    <w:bookmarkEnd w:id="22"/>
-    <w:bookmarkStart w:id="23" w:name="bias-cancellation"/>
+    <w:bookmarkEnd w:id="31"/>
+    <w:bookmarkStart w:id="35" w:name="bias-cancellation"/>
     <w:p>
       <w:pPr>
         <w:pStyle w:val="Heading3"/>
@@ -10297,57 +10297,57 @@
         </w:tc>
       </w:tr>
     </w:tbl>
-    <w:tbl>
-      <w:tblPr>
-        <w:tblStyle w:val="FigureTable"/>
-        <w:tblW w:type="pct" w:w="5000"/>
+    <w:p>
+      <w:pPr>
+        <w:pStyle w:val="BodyText"/>
         <w:jc w:val="center"/>
-        <w:tblLook w:firstRow="0" w:lastRow="0" w:firstColumn="0" w:lastColumn="0"/>
-        <w:tblLayout w:type="autofit"/>
-        <w:tblBorders>
-          <w:top w:val="single" w:sz="10" w:color="4F6272"/>
-          <w:bottom w:val="single" w:sz="10" w:color="4F6272"/>
-          <w:insideH w:val="single" w:sz="5" w:color="9FB0C2"/>
-          <w:left w:val="single" w:sz="6" w:color="9FB0C2"/>
-          <w:right w:val="single" w:sz="6" w:color="9FB0C2"/>
-          <w:insideV w:val="single" w:sz="5" w:color="D9E1E8"/>
-        </w:tblBorders>
-      </w:tblPr>
-      <w:tblGrid>
-        <w:gridCol w:w="7920"/>
-      </w:tblGrid>
-      <w:tr>
-        <w:tc>
-          <w:tcPr>
-            <w:shd w:fill="EEF3F7"/>
-            <w:tcBorders>
-              <w:left w:val="nil"/>
-              <w:right w:val="nil"/>
-              <w:top w:val="nil"/>
-              <w:bottom w:val="single" w:sz="8" w:color="9FB0C2"/>
-            </w:tcBorders>
-          </w:tcPr>
-          <w:p>
-            <w:pPr>
-              <w:pStyle w:val="Compact"/>
-              <w:spacing w:before="0" w:after="20" w:line="240" w:lineRule="auto"/>
-              <w:jc w:val="center"/>
-              <w:keepNext w:val="0"/>
-              <w:keepLines/>
-              <w:widowControl w:val="1"/>
-            </w:pPr>
-            <w:r>
-              <w:rPr>
-                <w:rFonts w:ascii="Times New Roman" w:hAnsi="Times New Roman"/>
-                <w:b/>
-                <w:sz w:val="19"/>
-              </w:rPr>
-              <w:t xml:space="preserve">Forest plot of per-judge length-bias correlations with the ensemble near zero</w:t>
-            </w:r>
-          </w:p>
-        </w:tc>
-      </w:tr>
-    </w:tbl>
+        <w:keepNext/>
+        <w:keepLines/>
+        <w:widowControl w:val="1"/>
+      </w:pPr>
+      <w:r>
+        <w:drawing>
+          <wp:inline>
+            <wp:extent cx="5163312" cy="2987040"/>
+            <wp:effectExtent b="0" l="0" r="0" t="0"/>
+            <wp:docPr descr="Forest plot of per-judge length-bias correlations with the ensemble near zero" title="" id="33" name="Picture"/>
+            <a:graphic>
+              <a:graphicData uri="http://schemas.openxmlformats.org/drawingml/2006/picture">
+                <pic:pic>
+                  <pic:nvPicPr>
+                    <pic:cNvPr descr="figures/f3_verbosity_forest.png" id="34" name="Picture"/>
+                    <pic:cNvPicPr>
+                      <a:picLocks noChangeArrowheads="1" noChangeAspect="1"/>
+                    </pic:cNvPicPr>
+                  </pic:nvPicPr>
+                  <pic:blipFill>
+                    <a:blip r:embed="rId32"/>
+                    <a:stretch>
+                      <a:fillRect/>
+                    </a:stretch>
+                  </pic:blipFill>
+                  <pic:spPr bwMode="auto">
+                    <a:xfrm>
+                      <a:off x="0" y="0"/>
+                      <a:ext cx="5163312" cy="2987040"/>
+                    </a:xfrm>
+                    <a:prstGeom prst="rect">
+                      <a:avLst/>
+                    </a:prstGeom>
+                    <a:noFill/>
+                    <a:ln w="9525">
+                      <a:noFill/>
+                      <a:headEnd/>
+                      <a:tailEnd/>
+                    </a:ln>
+                  </pic:spPr>
+                </pic:pic>
+              </a:graphicData>
+            </a:graphic>
+          </wp:inline>
+        </w:drawing>
+      </w:r>
+    </w:p>
     <w:p>
       <w:pPr>
         <w:pStyle w:val="ImageCaption"/>
@@ -10557,8 +10557,8 @@
         <w:t xml:space="preserve">93% reduction.</w:t>
       </w:r>
     </w:p>
-    <w:bookmarkEnd w:id="23"/>
-    <w:bookmarkStart w:id="24" w:name="Xafb02bce621e02934ae814be540128cfed2d296"/>
+    <w:bookmarkEnd w:id="35"/>
+    <w:bookmarkStart w:id="36" w:name="Xafb02bce621e02934ae814be540128cfed2d296"/>
     <w:p>
       <w:pPr>
         <w:pStyle w:val="Heading3"/>
@@ -11010,8 +11010,8 @@
         <w:t xml:space="preserve">): the cross-family design neutralizes self-preference by construction.</w:t>
       </w:r>
     </w:p>
-    <w:bookmarkEnd w:id="24"/>
-    <w:bookmarkStart w:id="25" w:name="contamination-resistance"/>
+    <w:bookmarkEnd w:id="36"/>
+    <w:bookmarkStart w:id="37" w:name="contamination-resistance"/>
     <w:p>
       <w:pPr>
         <w:pStyle w:val="Heading3"/>
@@ -11609,8 +11609,8 @@
         <w:t xml:space="preserve">verbatim 13-gram overlap with five major public benchmarks, so they cannot be gamed this way.</w:t>
       </w:r>
     </w:p>
-    <w:bookmarkEnd w:id="25"/>
-    <w:bookmarkStart w:id="26" w:name="cost"/>
+    <w:bookmarkEnd w:id="37"/>
+    <w:bookmarkStart w:id="38" w:name="cost"/>
     <w:p>
       <w:pPr>
         <w:pStyle w:val="Heading3"/>
@@ -11727,8 +11727,8 @@
         <w:t xml:space="preserve">).</w:t>
       </w:r>
     </w:p>
-    <w:bookmarkEnd w:id="26"/>
-    <w:bookmarkStart w:id="27" w:name="putting-it-together-domain-case-studies"/>
+    <w:bookmarkEnd w:id="38"/>
+    <w:bookmarkStart w:id="39" w:name="putting-it-together-domain-case-studies"/>
     <w:p>
       <w:pPr>
         <w:pStyle w:val="Heading3"/>
@@ -13295,8 +13295,8 @@
         </w:tc>
       </w:tr>
     </w:tbl>
-    <w:bookmarkEnd w:id="27"/>
-    <w:bookmarkStart w:id="28" w:name="X5b909f8979da9f44974797188bca91411bc1d26"/>
+    <w:bookmarkEnd w:id="39"/>
+    <w:bookmarkStart w:id="40" w:name="X5b909f8979da9f44974797188bca91411bc1d26"/>
     <w:p>
       <w:pPr>
         <w:pStyle w:val="Heading3"/>
@@ -15251,9 +15251,9 @@
         </w:tc>
       </w:tr>
     </w:tbl>
-    <w:bookmarkEnd w:id="28"/>
-    <w:bookmarkEnd w:id="29"/>
-    <w:bookmarkStart w:id="30" w:name="discussion"/>
+    <w:bookmarkEnd w:id="40"/>
+    <w:bookmarkEnd w:id="41"/>
+    <w:bookmarkStart w:id="42" w:name="discussion"/>
     <w:p>
       <w:pPr>
         <w:pStyle w:val="Heading2"/>
@@ -15460,8 +15460,8 @@
         <w:t xml:space="preserve">against any model's full pretraining corpus.</w:t>
       </w:r>
     </w:p>
-    <w:bookmarkEnd w:id="30"/>
-    <w:bookmarkStart w:id="31" w:name="conclusion"/>
+    <w:bookmarkEnd w:id="42"/>
+    <w:bookmarkStart w:id="43" w:name="conclusion"/>
     <w:p>
       <w:pPr>
         <w:pStyle w:val="Heading2"/>
@@ -15618,8 +15618,8 @@
         <w:t xml:space="preserve">than a single static study. CoEval is open-source, declarative, and fully reproducible.</w:t>
       </w:r>
     </w:p>
-    <w:bookmarkEnd w:id="31"/>
-    <w:bookmarkStart w:id="98" w:name="references"/>
+    <w:bookmarkEnd w:id="43"/>
+    <w:bookmarkStart w:id="110" w:name="references"/>
     <w:p>
       <w:pPr>
         <w:pStyle w:val="ReferencesHeading"/>
@@ -15644,7 +15644,7 @@
         <w:keepLines w:val="0"/>
         <w:widowControl w:val="1"/>
       </w:pPr>
-      <w:bookmarkStart w:id="33" w:name="r1"/>
+      <w:bookmarkStart w:id="45" w:name="r1"/>
       <w:r>
         <w:t xml:space="preserve">Zheng, L., Chiang, W.-L., Sheng, Y., et al. (2023).</w:t>
       </w:r>
@@ -15681,354 +15681,12 @@
       <w:r>
         <w:t xml:space="preserve"> </w:t>
       </w:r>
-      <w:hyperlink r:id="rId32">
+      <w:hyperlink r:id="rId44">
         <w:r>
           <w:rPr>
             <w:rStyle w:val="Hyperlink"/>
           </w:rPr>
           <w:t xml:space="preserve">arxiv.org/abs/2306.05685</w:t>
-        </w:r>
-      </w:hyperlink>
-      <w:bookmarkEnd w:id="33"/>
-    </w:p>
-    <w:p>
-      <w:pPr>
-        <w:pStyle w:val="ReferenceEntry"/>
-        <w:numPr>
-          <w:ilvl w:val="0"/>
-          <w:numId w:val="1002"/>
-        </w:numPr>
-        <w:jc w:val="left"/>
-        <w:keepNext w:val="0"/>
-        <w:keepLines w:val="0"/>
-        <w:widowControl w:val="1"/>
-      </w:pPr>
-      <w:bookmarkStart w:id="35" w:name="r2"/>
-      <w:r>
-        <w:t xml:space="preserve">Liu, Y., Iter, D., Xu, Y., et al. (2023).</w:t>
-      </w:r>
-      <w:r>
-        <w:t xml:space="preserve"> </w:t>
-      </w:r>
-      <w:r>
-        <w:rPr>
-          <w:i/>
-          <w:iCs/>
-        </w:rPr>
-        <w:t xml:space="preserve">G-Eval: NLG Evaluation using GPT-4 with Better Human</w:t>
-      </w:r>
-      <w:r>
-        <w:rPr>
-          <w:i/>
-          <w:iCs/>
-        </w:rPr>
-        <w:t xml:space="preserve"> </w:t>
-      </w:r>
-      <w:r>
-        <w:rPr>
-          <w:i/>
-          <w:iCs/>
-        </w:rPr>
-        <w:t xml:space="preserve">Alignment.</w:t>
-      </w:r>
-      <w:r>
-        <w:t xml:space="preserve"> </w:t>
-      </w:r>
-      <w:r>
-        <w:t xml:space="preserve">EMNLP.</w:t>
-      </w:r>
-      <w:r>
-        <w:t xml:space="preserve"> </w:t>
-      </w:r>
-      <w:hyperlink r:id="rId34">
-        <w:r>
-          <w:rPr>
-            <w:rStyle w:val="Hyperlink"/>
-          </w:rPr>
-          <w:t xml:space="preserve">arxiv.org/abs/2303.16634</w:t>
-        </w:r>
-      </w:hyperlink>
-      <w:bookmarkEnd w:id="35"/>
-    </w:p>
-    <w:p>
-      <w:pPr>
-        <w:pStyle w:val="ReferenceEntry"/>
-        <w:numPr>
-          <w:ilvl w:val="0"/>
-          <w:numId w:val="1002"/>
-        </w:numPr>
-        <w:jc w:val="left"/>
-        <w:keepNext w:val="0"/>
-        <w:keepLines w:val="0"/>
-        <w:widowControl w:val="1"/>
-      </w:pPr>
-      <w:bookmarkStart w:id="37" w:name="r3"/>
-      <w:r>
-        <w:t xml:space="preserve">Kim, S., Suk, J., Longpre, S., et al. (2024).</w:t>
-      </w:r>
-      <w:r>
-        <w:t xml:space="preserve"> </w:t>
-      </w:r>
-      <w:r>
-        <w:rPr>
-          <w:i/>
-          <w:iCs/>
-        </w:rPr>
-        <w:t xml:space="preserve">Prometheus 2: An Open Source Language Model Specialized</w:t>
-      </w:r>
-      <w:r>
-        <w:rPr>
-          <w:i/>
-          <w:iCs/>
-        </w:rPr>
-        <w:t xml:space="preserve"> </w:t>
-      </w:r>
-      <w:r>
-        <w:rPr>
-          <w:i/>
-          <w:iCs/>
-        </w:rPr>
-        <w:t xml:space="preserve">in Evaluating Other Language Models.</w:t>
-      </w:r>
-      <w:r>
-        <w:t xml:space="preserve"> </w:t>
-      </w:r>
-      <w:hyperlink r:id="rId36">
-        <w:r>
-          <w:rPr>
-            <w:rStyle w:val="Hyperlink"/>
-          </w:rPr>
-          <w:t xml:space="preserve">arxiv.org/abs/2405.01535</w:t>
-        </w:r>
-      </w:hyperlink>
-      <w:bookmarkEnd w:id="37"/>
-    </w:p>
-    <w:p>
-      <w:pPr>
-        <w:pStyle w:val="ReferenceEntry"/>
-        <w:numPr>
-          <w:ilvl w:val="0"/>
-          <w:numId w:val="1002"/>
-        </w:numPr>
-        <w:jc w:val="left"/>
-        <w:keepNext w:val="0"/>
-        <w:keepLines w:val="0"/>
-        <w:widowControl w:val="1"/>
-      </w:pPr>
-      <w:bookmarkStart w:id="39" w:name="r4"/>
-      <w:r>
-        <w:t xml:space="preserve">Vu, T., Krishna, K., Alzubi, S., et al. (2024).</w:t>
-      </w:r>
-      <w:r>
-        <w:t xml:space="preserve"> </w:t>
-      </w:r>
-      <w:r>
-        <w:rPr>
-          <w:i/>
-          <w:iCs/>
-        </w:rPr>
-        <w:t xml:space="preserve">Foundational Autoraters: Taming Large Language Models</w:t>
-      </w:r>
-      <w:r>
-        <w:rPr>
-          <w:i/>
-          <w:iCs/>
-        </w:rPr>
-        <w:t xml:space="preserve"> </w:t>
-      </w:r>
-      <w:r>
-        <w:rPr>
-          <w:i/>
-          <w:iCs/>
-        </w:rPr>
-        <w:t xml:space="preserve">for Better Automatic Evaluation (FLAMe).</w:t>
-      </w:r>
-      <w:r>
-        <w:t xml:space="preserve"> </w:t>
-      </w:r>
-      <w:r>
-        <w:t xml:space="preserve">EMNLP.</w:t>
-      </w:r>
-      <w:r>
-        <w:t xml:space="preserve"> </w:t>
-      </w:r>
-      <w:hyperlink r:id="rId38">
-        <w:r>
-          <w:rPr>
-            <w:rStyle w:val="Hyperlink"/>
-          </w:rPr>
-          <w:t xml:space="preserve">arxiv.org/abs/2407.10817</w:t>
-        </w:r>
-      </w:hyperlink>
-      <w:bookmarkEnd w:id="39"/>
-    </w:p>
-    <w:p>
-      <w:pPr>
-        <w:pStyle w:val="ReferenceEntry"/>
-        <w:numPr>
-          <w:ilvl w:val="0"/>
-          <w:numId w:val="1002"/>
-        </w:numPr>
-        <w:jc w:val="left"/>
-        <w:keepNext w:val="0"/>
-        <w:keepLines w:val="0"/>
-        <w:widowControl w:val="1"/>
-      </w:pPr>
-      <w:bookmarkStart w:id="41" w:name="r5"/>
-      <w:r>
-        <w:t xml:space="preserve">Verga, P., Hofstatter, S., Althammer, S., et al. (2024).</w:t>
-      </w:r>
-      <w:r>
-        <w:t xml:space="preserve"> </w:t>
-      </w:r>
-      <w:r>
-        <w:rPr>
-          <w:i/>
-          <w:iCs/>
-        </w:rPr>
-        <w:t xml:space="preserve">Replacing Judges with Juries: Evaluating LLM</w:t>
-      </w:r>
-      <w:r>
-        <w:rPr>
-          <w:i/>
-          <w:iCs/>
-        </w:rPr>
-        <w:t xml:space="preserve"> </w:t>
-      </w:r>
-      <w:r>
-        <w:rPr>
-          <w:i/>
-          <w:iCs/>
-        </w:rPr>
-        <w:t xml:space="preserve">Generations with a Panel of Diverse Models (PoLL).</w:t>
-      </w:r>
-      <w:r>
-        <w:t xml:space="preserve"> </w:t>
-      </w:r>
-      <w:hyperlink r:id="rId40">
-        <w:r>
-          <w:rPr>
-            <w:rStyle w:val="Hyperlink"/>
-          </w:rPr>
-          <w:t xml:space="preserve">arxiv.org/abs/2404.18796</w:t>
-        </w:r>
-      </w:hyperlink>
-      <w:bookmarkEnd w:id="41"/>
-    </w:p>
-    <w:p>
-      <w:pPr>
-        <w:pStyle w:val="ReferenceEntry"/>
-        <w:numPr>
-          <w:ilvl w:val="0"/>
-          <w:numId w:val="1002"/>
-        </w:numPr>
-        <w:jc w:val="left"/>
-        <w:keepNext w:val="0"/>
-        <w:keepLines w:val="0"/>
-        <w:widowControl w:val="1"/>
-      </w:pPr>
-      <w:bookmarkStart w:id="43" w:name="r6"/>
-      <w:r>
-        <w:t xml:space="preserve">Tan, S., Zhuang, S., Montgomery, K., et al. (2025).</w:t>
-      </w:r>
-      <w:r>
-        <w:t xml:space="preserve"> </w:t>
-      </w:r>
-      <w:r>
-        <w:rPr>
-          <w:i/>
-          <w:iCs/>
-        </w:rPr>
-        <w:t xml:space="preserve">JudgeBench: A Benchmark for Evaluating LLM-based</w:t>
-      </w:r>
-      <w:r>
-        <w:rPr>
-          <w:i/>
-          <w:iCs/>
-        </w:rPr>
-        <w:t xml:space="preserve"> </w:t>
-      </w:r>
-      <w:r>
-        <w:rPr>
-          <w:i/>
-          <w:iCs/>
-        </w:rPr>
-        <w:t xml:space="preserve">Judges.</w:t>
-      </w:r>
-      <w:r>
-        <w:t xml:space="preserve"> </w:t>
-      </w:r>
-      <w:r>
-        <w:t xml:space="preserve">ICLR.</w:t>
-      </w:r>
-      <w:r>
-        <w:t xml:space="preserve"> </w:t>
-      </w:r>
-      <w:hyperlink r:id="rId42">
-        <w:r>
-          <w:rPr>
-            <w:rStyle w:val="Hyperlink"/>
-          </w:rPr>
-          <w:t xml:space="preserve">arxiv.org/abs/2410.12784</w:t>
-        </w:r>
-      </w:hyperlink>
-      <w:bookmarkEnd w:id="43"/>
-    </w:p>
-    <w:p>
-      <w:pPr>
-        <w:pStyle w:val="ReferenceEntry"/>
-        <w:numPr>
-          <w:ilvl w:val="0"/>
-          <w:numId w:val="1002"/>
-        </w:numPr>
-        <w:jc w:val="left"/>
-        <w:keepNext w:val="0"/>
-        <w:keepLines w:val="0"/>
-        <w:widowControl w:val="1"/>
-      </w:pPr>
-      <w:bookmarkStart w:id="45" w:name="r7"/>
-      <w:r>
-        <w:t xml:space="preserve">Kim, S., Suk, J., Cho, J. Y., et al. (2025).</w:t>
-      </w:r>
-      <w:r>
-        <w:t xml:space="preserve"> </w:t>
-      </w:r>
-      <w:r>
-        <w:rPr>
-          <w:i/>
-          <w:iCs/>
-        </w:rPr>
-        <w:t xml:space="preserve">The BiGGen Bench: A Principled Benchmark for Fine-grained</w:t>
-      </w:r>
-      <w:r>
-        <w:rPr>
-          <w:i/>
-          <w:iCs/>
-        </w:rPr>
-        <w:t xml:space="preserve"> </w:t>
-      </w:r>
-      <w:r>
-        <w:rPr>
-          <w:i/>
-          <w:iCs/>
-        </w:rPr>
-        <w:t xml:space="preserve">Evaluation of Language Models with Language Models.</w:t>
-      </w:r>
-      <w:r>
-        <w:t xml:space="preserve"> </w:t>
-      </w:r>
-      <w:r>
-        <w:t xml:space="preserve">NAACL.</w:t>
-      </w:r>
-      <w:r>
-        <w:t xml:space="preserve"> </w:t>
-      </w:r>
-      <w:hyperlink r:id="rId44">
-        <w:r>
-          <w:rPr>
-            <w:rStyle w:val="Hyperlink"/>
-          </w:rPr>
-          <w:t xml:space="preserve">arxiv.org/abs/2406.05761</w:t>
         </w:r>
       </w:hyperlink>
       <w:bookmarkEnd w:id="45"/>
@@ -16045,9 +15703,9 @@
         <w:keepLines w:val="0"/>
         <w:widowControl w:val="1"/>
       </w:pPr>
-      <w:bookmarkStart w:id="47" w:name="r8"/>
-      <w:r>
-        <w:t xml:space="preserve">Dubois, Y., Galambosi, B., Liang, P., Hashimoto, T. B. (2024).</w:t>
+      <w:bookmarkStart w:id="47" w:name="r2"/>
+      <w:r>
+        <w:t xml:space="preserve">Liu, Y., Iter, D., Xu, Y., et al. (2023).</w:t>
       </w:r>
       <w:r>
         <w:t xml:space="preserve"> </w:t>
@@ -16057,7 +15715,7 @@
           <w:i/>
           <w:iCs/>
         </w:rPr>
-        <w:t xml:space="preserve">Length-Controlled AlpacaEval: A Simple</w:t>
+        <w:t xml:space="preserve">G-Eval: NLG Evaluation using GPT-4 with Better Human</w:t>
       </w:r>
       <w:r>
         <w:rPr>
@@ -16071,7 +15729,13 @@
           <w:i/>
           <w:iCs/>
         </w:rPr>
-        <w:t xml:space="preserve">Way to Debias Automatic Evaluators.</w:t>
+        <w:t xml:space="preserve">Alignment.</w:t>
+      </w:r>
+      <w:r>
+        <w:t xml:space="preserve"> </w:t>
+      </w:r>
+      <w:r>
+        <w:t xml:space="preserve">EMNLP.</w:t>
       </w:r>
       <w:r>
         <w:t xml:space="preserve"> </w:t>
@@ -16081,7 +15745,7 @@
           <w:rPr>
             <w:rStyle w:val="Hyperlink"/>
           </w:rPr>
-          <w:t xml:space="preserve">arxiv.org/abs/2404.04475</w:t>
+          <w:t xml:space="preserve">arxiv.org/abs/2303.16634</w:t>
         </w:r>
       </w:hyperlink>
       <w:bookmarkEnd w:id="47"/>
@@ -16098,9 +15762,9 @@
         <w:keepLines w:val="0"/>
         <w:widowControl w:val="1"/>
       </w:pPr>
-      <w:bookmarkStart w:id="49" w:name="r9"/>
-      <w:r>
-        <w:t xml:space="preserve">Li, X. L., Kazemi, M., et al. (2024).</w:t>
+      <w:bookmarkStart w:id="49" w:name="r3"/>
+      <w:r>
+        <w:t xml:space="preserve">Kim, S., Suk, J., Longpre, S., et al. (2024).</w:t>
       </w:r>
       <w:r>
         <w:t xml:space="preserve"> </w:t>
@@ -16110,7 +15774,21 @@
           <w:i/>
           <w:iCs/>
         </w:rPr>
-        <w:t xml:space="preserve">AutoBencher: Towards Declarative Benchmark Construction.</w:t>
+        <w:t xml:space="preserve">Prometheus 2: An Open Source Language Model Specialized</w:t>
+      </w:r>
+      <w:r>
+        <w:rPr>
+          <w:i/>
+          <w:iCs/>
+        </w:rPr>
+        <w:t xml:space="preserve"> </w:t>
+      </w:r>
+      <w:r>
+        <w:rPr>
+          <w:i/>
+          <w:iCs/>
+        </w:rPr>
+        <w:t xml:space="preserve">in Evaluating Other Language Models.</w:t>
       </w:r>
       <w:r>
         <w:t xml:space="preserve"> </w:t>
@@ -16120,7 +15798,7 @@
           <w:rPr>
             <w:rStyle w:val="Hyperlink"/>
           </w:rPr>
-          <w:t xml:space="preserve">arxiv.org/abs/2407.08351</w:t>
+          <w:t xml:space="preserve">arxiv.org/abs/2405.01535</w:t>
         </w:r>
       </w:hyperlink>
       <w:bookmarkEnd w:id="49"/>
@@ -16137,9 +15815,9 @@
         <w:keepLines w:val="0"/>
         <w:widowControl w:val="1"/>
       </w:pPr>
-      <w:bookmarkStart w:id="51" w:name="r10"/>
-      <w:r>
-        <w:t xml:space="preserve">Butt, N., Awadalla, H., et al. (2024).</w:t>
+      <w:bookmarkStart w:id="51" w:name="r4"/>
+      <w:r>
+        <w:t xml:space="preserve">Vu, T., Krishna, K., Alzubi, S., et al. (2024).</w:t>
       </w:r>
       <w:r>
         <w:t xml:space="preserve"> </w:t>
@@ -16149,7 +15827,7 @@
           <w:i/>
           <w:iCs/>
         </w:rPr>
-        <w:t xml:space="preserve">BenchAgents: Automated Benchmark Creation with Agent</w:t>
+        <w:t xml:space="preserve">Foundational Autoraters: Taming Large Language Models</w:t>
       </w:r>
       <w:r>
         <w:rPr>
@@ -16163,7 +15841,13 @@
           <w:i/>
           <w:iCs/>
         </w:rPr>
-        <w:t xml:space="preserve">Interaction.</w:t>
+        <w:t xml:space="preserve">for Better Automatic Evaluation (FLAMe).</w:t>
+      </w:r>
+      <w:r>
+        <w:t xml:space="preserve"> </w:t>
+      </w:r>
+      <w:r>
+        <w:t xml:space="preserve">EMNLP.</w:t>
       </w:r>
       <w:r>
         <w:t xml:space="preserve"> </w:t>
@@ -16173,7 +15857,7 @@
           <w:rPr>
             <w:rStyle w:val="Hyperlink"/>
           </w:rPr>
-          <w:t xml:space="preserve">arxiv.org/abs/2410.22584</w:t>
+          <w:t xml:space="preserve">arxiv.org/abs/2407.10817</w:t>
         </w:r>
       </w:hyperlink>
       <w:bookmarkEnd w:id="51"/>
@@ -16190,9 +15874,9 @@
         <w:keepLines w:val="0"/>
         <w:widowControl w:val="1"/>
       </w:pPr>
-      <w:bookmarkStart w:id="53" w:name="r11"/>
-      <w:r>
-        <w:t xml:space="preserve">Shashidhar, S., et al. (2025).</w:t>
+      <w:bookmarkStart w:id="53" w:name="r5"/>
+      <w:r>
+        <w:t xml:space="preserve">Verga, P., Hofstatter, S., Althammer, S., et al. (2024).</w:t>
       </w:r>
       <w:r>
         <w:t xml:space="preserve"> </w:t>
@@ -16202,7 +15886,21 @@
           <w:i/>
           <w:iCs/>
         </w:rPr>
-        <w:t xml:space="preserve">YourBench: Easy Custom Evaluation Sets for Everyone.</w:t>
+        <w:t xml:space="preserve">Replacing Judges with Juries: Evaluating LLM</w:t>
+      </w:r>
+      <w:r>
+        <w:rPr>
+          <w:i/>
+          <w:iCs/>
+        </w:rPr>
+        <w:t xml:space="preserve"> </w:t>
+      </w:r>
+      <w:r>
+        <w:rPr>
+          <w:i/>
+          <w:iCs/>
+        </w:rPr>
+        <w:t xml:space="preserve">Generations with a Panel of Diverse Models (PoLL).</w:t>
       </w:r>
       <w:r>
         <w:t xml:space="preserve"> </w:t>
@@ -16212,7 +15910,7 @@
           <w:rPr>
             <w:rStyle w:val="Hyperlink"/>
           </w:rPr>
-          <w:t xml:space="preserve">arxiv.org/abs/2504.01833</w:t>
+          <w:t xml:space="preserve">arxiv.org/abs/2404.18796</w:t>
         </w:r>
       </w:hyperlink>
       <w:bookmarkEnd w:id="53"/>
@@ -16229,9 +15927,9 @@
         <w:keepLines w:val="0"/>
         <w:widowControl w:val="1"/>
       </w:pPr>
-      <w:bookmarkStart w:id="55" w:name="r12"/>
-      <w:r>
-        <w:t xml:space="preserve">Zhang, H., Da, J., Lee, D., et al. (2024).</w:t>
+      <w:bookmarkStart w:id="55" w:name="r6"/>
+      <w:r>
+        <w:t xml:space="preserve">Tan, S., Zhuang, S., Montgomery, K., et al. (2025).</w:t>
       </w:r>
       <w:r>
         <w:t xml:space="preserve"> </w:t>
@@ -16241,7 +15939,7 @@
           <w:i/>
           <w:iCs/>
         </w:rPr>
-        <w:t xml:space="preserve">A Careful Examination of Large Language Model Performance on</w:t>
+        <w:t xml:space="preserve">JudgeBench: A Benchmark for Evaluating LLM-based</w:t>
       </w:r>
       <w:r>
         <w:rPr>
@@ -16255,7 +15953,13 @@
           <w:i/>
           <w:iCs/>
         </w:rPr>
-        <w:t xml:space="preserve">Grade School Arithmetic (GSM1k).</w:t>
+        <w:t xml:space="preserve">Judges.</w:t>
+      </w:r>
+      <w:r>
+        <w:t xml:space="preserve"> </w:t>
+      </w:r>
+      <w:r>
+        <w:t xml:space="preserve">ICLR.</w:t>
       </w:r>
       <w:r>
         <w:t xml:space="preserve"> </w:t>
@@ -16265,7 +15969,7 @@
           <w:rPr>
             <w:rStyle w:val="Hyperlink"/>
           </w:rPr>
-          <w:t xml:space="preserve">arxiv.org/abs/2405.00332</w:t>
+          <w:t xml:space="preserve">arxiv.org/abs/2410.12784</w:t>
         </w:r>
       </w:hyperlink>
       <w:bookmarkEnd w:id="55"/>
@@ -16282,9 +15986,9 @@
         <w:keepLines w:val="0"/>
         <w:widowControl w:val="1"/>
       </w:pPr>
-      <w:bookmarkStart w:id="57" w:name="r13"/>
-      <w:r>
-        <w:t xml:space="preserve">Xu, C., et al. (2025).</w:t>
+      <w:bookmarkStart w:id="57" w:name="r7"/>
+      <w:r>
+        <w:t xml:space="preserve">Kim, S., Suk, J., Cho, J. Y., et al. (2025).</w:t>
       </w:r>
       <w:r>
         <w:t xml:space="preserve"> </w:t>
@@ -16294,7 +15998,27 @@
           <w:i/>
           <w:iCs/>
         </w:rPr>
-        <w:t xml:space="preserve">Benchmark Data Contamination of Large Language Models: A Survey.</w:t>
+        <w:t xml:space="preserve">The BiGGen Bench: A Principled Benchmark for Fine-grained</w:t>
+      </w:r>
+      <w:r>
+        <w:rPr>
+          <w:i/>
+          <w:iCs/>
+        </w:rPr>
+        <w:t xml:space="preserve"> </w:t>
+      </w:r>
+      <w:r>
+        <w:rPr>
+          <w:i/>
+          <w:iCs/>
+        </w:rPr>
+        <w:t xml:space="preserve">Evaluation of Language Models with Language Models.</w:t>
+      </w:r>
+      <w:r>
+        <w:t xml:space="preserve"> </w:t>
+      </w:r>
+      <w:r>
+        <w:t xml:space="preserve">NAACL.</w:t>
       </w:r>
       <w:r>
         <w:t xml:space="preserve"> </w:t>
@@ -16304,7 +16028,7 @@
           <w:rPr>
             <w:rStyle w:val="Hyperlink"/>
           </w:rPr>
-          <w:t xml:space="preserve">arxiv.org/abs/2502.14425</w:t>
+          <w:t xml:space="preserve">arxiv.org/abs/2406.05761</w:t>
         </w:r>
       </w:hyperlink>
       <w:bookmarkEnd w:id="57"/>
@@ -16321,9 +16045,9 @@
         <w:keepLines w:val="0"/>
         <w:widowControl w:val="1"/>
       </w:pPr>
-      <w:bookmarkStart w:id="59" w:name="r14"/>
-      <w:r>
-        <w:t xml:space="preserve">Kiela, D., Bartolo, M., Nie, Y., et al. (2021).</w:t>
+      <w:bookmarkStart w:id="59" w:name="r8"/>
+      <w:r>
+        <w:t xml:space="preserve">Dubois, Y., Galambosi, B., Liang, P., Hashimoto, T. B. (2024).</w:t>
       </w:r>
       <w:r>
         <w:t xml:space="preserve"> </w:t>
@@ -16333,13 +16057,21 @@
           <w:i/>
           <w:iCs/>
         </w:rPr>
-        <w:t xml:space="preserve">Dynabench: Rethinking Benchmarking in NLP.</w:t>
-      </w:r>
-      <w:r>
-        <w:t xml:space="preserve"> </w:t>
-      </w:r>
-      <w:r>
-        <w:t xml:space="preserve">NAACL.</w:t>
+        <w:t xml:space="preserve">Length-Controlled AlpacaEval: A Simple</w:t>
+      </w:r>
+      <w:r>
+        <w:rPr>
+          <w:i/>
+          <w:iCs/>
+        </w:rPr>
+        <w:t xml:space="preserve"> </w:t>
+      </w:r>
+      <w:r>
+        <w:rPr>
+          <w:i/>
+          <w:iCs/>
+        </w:rPr>
+        <w:t xml:space="preserve">Way to Debias Automatic Evaluators.</w:t>
       </w:r>
       <w:r>
         <w:t xml:space="preserve"> </w:t>
@@ -16349,7 +16081,7 @@
           <w:rPr>
             <w:rStyle w:val="Hyperlink"/>
           </w:rPr>
-          <w:t xml:space="preserve">arxiv.org/abs/2104.14337</w:t>
+          <w:t xml:space="preserve">arxiv.org/abs/2404.04475</w:t>
         </w:r>
       </w:hyperlink>
       <w:bookmarkEnd w:id="59"/>
@@ -16366,9 +16098,9 @@
         <w:keepLines w:val="0"/>
         <w:widowControl w:val="1"/>
       </w:pPr>
-      <w:bookmarkStart w:id="61" w:name="r15"/>
-      <w:r>
-        <w:t xml:space="preserve">Li, D., Sun, R., Huang, Y., et al. (2026).</w:t>
+      <w:bookmarkStart w:id="61" w:name="r9"/>
+      <w:r>
+        <w:t xml:space="preserve">Li, X. L., Kazemi, M., et al. (2024).</w:t>
       </w:r>
       <w:r>
         <w:t xml:space="preserve"> </w:t>
@@ -16378,27 +16110,7 @@
           <w:i/>
           <w:iCs/>
         </w:rPr>
-        <w:t xml:space="preserve">Preference Leakage: A Contamination Problem in</w:t>
-      </w:r>
-      <w:r>
-        <w:rPr>
-          <w:i/>
-          <w:iCs/>
-        </w:rPr>
-        <w:t xml:space="preserve"> </w:t>
-      </w:r>
-      <w:r>
-        <w:rPr>
-          <w:i/>
-          <w:iCs/>
-        </w:rPr>
-        <w:t xml:space="preserve">LLM-as-a-Judge.</w:t>
-      </w:r>
-      <w:r>
-        <w:t xml:space="preserve"> </w:t>
-      </w:r>
-      <w:r>
-        <w:t xml:space="preserve">ICLR.</w:t>
+        <w:t xml:space="preserve">AutoBencher: Towards Declarative Benchmark Construction.</w:t>
       </w:r>
       <w:r>
         <w:t xml:space="preserve"> </w:t>
@@ -16408,7 +16120,7 @@
           <w:rPr>
             <w:rStyle w:val="Hyperlink"/>
           </w:rPr>
-          <w:t xml:space="preserve">arxiv.org/abs/2502.01534</w:t>
+          <w:t xml:space="preserve">arxiv.org/abs/2407.08351</w:t>
         </w:r>
       </w:hyperlink>
       <w:bookmarkEnd w:id="61"/>
@@ -16425,9 +16137,9 @@
         <w:keepLines w:val="0"/>
         <w:widowControl w:val="1"/>
       </w:pPr>
-      <w:bookmarkStart w:id="63" w:name="r16"/>
-      <w:r>
-        <w:t xml:space="preserve">Spiliopoulou, E., et al. (2025).</w:t>
+      <w:bookmarkStart w:id="63" w:name="r10"/>
+      <w:r>
+        <w:t xml:space="preserve">Butt, N., Awadalla, H., et al. (2024).</w:t>
       </w:r>
       <w:r>
         <w:t xml:space="preserve"> </w:t>
@@ -16437,7 +16149,7 @@
           <w:i/>
           <w:iCs/>
         </w:rPr>
-        <w:t xml:space="preserve">Play Favorites: A Statistical Method to Measure Self-Bias in</w:t>
+        <w:t xml:space="preserve">BenchAgents: Automated Benchmark Creation with Agent</w:t>
       </w:r>
       <w:r>
         <w:rPr>
@@ -16451,7 +16163,7 @@
           <w:i/>
           <w:iCs/>
         </w:rPr>
-        <w:t xml:space="preserve">LLM-as-a-Judge.</w:t>
+        <w:t xml:space="preserve">Interaction.</w:t>
       </w:r>
       <w:r>
         <w:t xml:space="preserve"> </w:t>
@@ -16461,7 +16173,7 @@
           <w:rPr>
             <w:rStyle w:val="Hyperlink"/>
           </w:rPr>
-          <w:t xml:space="preserve">arxiv.org/abs/2508.06709</w:t>
+          <w:t xml:space="preserve">arxiv.org/abs/2410.22584</w:t>
         </w:r>
       </w:hyperlink>
       <w:bookmarkEnd w:id="63"/>
@@ -16478,9 +16190,9 @@
         <w:keepLines w:val="0"/>
         <w:widowControl w:val="1"/>
       </w:pPr>
-      <w:bookmarkStart w:id="65" w:name="r17"/>
-      <w:r>
-        <w:t xml:space="preserve">Ye, J., Wang, Y., Huang, Y., et al. (2024).</w:t>
+      <w:bookmarkStart w:id="65" w:name="r11"/>
+      <w:r>
+        <w:t xml:space="preserve">Shashidhar, S., et al. (2025).</w:t>
       </w:r>
       <w:r>
         <w:t xml:space="preserve"> </w:t>
@@ -16490,21 +16202,7 @@
           <w:i/>
           <w:iCs/>
         </w:rPr>
-        <w:t xml:space="preserve">Justice or Prejudice? Quantifying Biases in</w:t>
-      </w:r>
-      <w:r>
-        <w:rPr>
-          <w:i/>
-          <w:iCs/>
-        </w:rPr>
-        <w:t xml:space="preserve"> </w:t>
-      </w:r>
-      <w:r>
-        <w:rPr>
-          <w:i/>
-          <w:iCs/>
-        </w:rPr>
-        <w:t xml:space="preserve">LLM-as-a-Judge.</w:t>
+        <w:t xml:space="preserve">YourBench: Easy Custom Evaluation Sets for Everyone.</w:t>
       </w:r>
       <w:r>
         <w:t xml:space="preserve"> </w:t>
@@ -16514,7 +16212,7 @@
           <w:rPr>
             <w:rStyle w:val="Hyperlink"/>
           </w:rPr>
-          <w:t xml:space="preserve">arxiv.org/abs/2410.02736</w:t>
+          <w:t xml:space="preserve">arxiv.org/abs/2504.01833</w:t>
         </w:r>
       </w:hyperlink>
       <w:bookmarkEnd w:id="65"/>
@@ -16531,9 +16229,9 @@
         <w:keepLines w:val="0"/>
         <w:widowControl w:val="1"/>
       </w:pPr>
-      <w:bookmarkStart w:id="67" w:name="r18"/>
-      <w:r>
-        <w:t xml:space="preserve">Wataoka, K., Takahashi, T., Ri, R. (2024).</w:t>
+      <w:bookmarkStart w:id="67" w:name="r12"/>
+      <w:r>
+        <w:t xml:space="preserve">Zhang, H., Da, J., Lee, D., et al. (2024).</w:t>
       </w:r>
       <w:r>
         <w:t xml:space="preserve"> </w:t>
@@ -16543,7 +16241,21 @@
           <w:i/>
           <w:iCs/>
         </w:rPr>
-        <w:t xml:space="preserve">Self-Preference Bias in LLM-as-a-Judge.</w:t>
+        <w:t xml:space="preserve">A Careful Examination of Large Language Model Performance on</w:t>
+      </w:r>
+      <w:r>
+        <w:rPr>
+          <w:i/>
+          <w:iCs/>
+        </w:rPr>
+        <w:t xml:space="preserve"> </w:t>
+      </w:r>
+      <w:r>
+        <w:rPr>
+          <w:i/>
+          <w:iCs/>
+        </w:rPr>
+        <w:t xml:space="preserve">Grade School Arithmetic (GSM1k).</w:t>
       </w:r>
       <w:r>
         <w:t xml:space="preserve"> </w:t>
@@ -16553,7 +16265,7 @@
           <w:rPr>
             <w:rStyle w:val="Hyperlink"/>
           </w:rPr>
-          <w:t xml:space="preserve">arxiv.org/abs/2410.21819</w:t>
+          <w:t xml:space="preserve">arxiv.org/abs/2405.00332</w:t>
         </w:r>
       </w:hyperlink>
       <w:bookmarkEnd w:id="67"/>
@@ -16570,9 +16282,9 @@
         <w:keepLines w:val="0"/>
         <w:widowControl w:val="1"/>
       </w:pPr>
-      <w:bookmarkStart w:id="69" w:name="r19"/>
-      <w:r>
-        <w:t xml:space="preserve">Gu, J., Jiang, X., Shi, Z., et al. (2024).</w:t>
+      <w:bookmarkStart w:id="69" w:name="r13"/>
+      <w:r>
+        <w:t xml:space="preserve">Xu, C., et al. (2025).</w:t>
       </w:r>
       <w:r>
         <w:t xml:space="preserve"> </w:t>
@@ -16582,7 +16294,7 @@
           <w:i/>
           <w:iCs/>
         </w:rPr>
-        <w:t xml:space="preserve">A Survey on LLM-as-a-Judge.</w:t>
+        <w:t xml:space="preserve">Benchmark Data Contamination of Large Language Models: A Survey.</w:t>
       </w:r>
       <w:r>
         <w:t xml:space="preserve"> </w:t>
@@ -16592,7 +16304,7 @@
           <w:rPr>
             <w:rStyle w:val="Hyperlink"/>
           </w:rPr>
-          <w:t xml:space="preserve">arxiv.org/abs/2411.15594</w:t>
+          <w:t xml:space="preserve">arxiv.org/abs/2502.14425</w:t>
         </w:r>
       </w:hyperlink>
       <w:bookmarkEnd w:id="69"/>
@@ -16609,9 +16321,9 @@
         <w:keepLines w:val="0"/>
         <w:widowControl w:val="1"/>
       </w:pPr>
-      <w:bookmarkStart w:id="71" w:name="r20"/>
-      <w:r>
-        <w:t xml:space="preserve">Li, D., Jiang, B., Huang, L., et al. (2025).</w:t>
+      <w:bookmarkStart w:id="71" w:name="r14"/>
+      <w:r>
+        <w:t xml:space="preserve">Kiela, D., Bartolo, M., Nie, Y., et al. (2021).</w:t>
       </w:r>
       <w:r>
         <w:t xml:space="preserve"> </w:t>
@@ -16621,27 +16333,13 @@
           <w:i/>
           <w:iCs/>
         </w:rPr>
-        <w:t xml:space="preserve">From Generation to Judgment: Opportunities and</w:t>
-      </w:r>
-      <w:r>
-        <w:rPr>
-          <w:i/>
-          <w:iCs/>
-        </w:rPr>
-        <w:t xml:space="preserve"> </w:t>
-      </w:r>
-      <w:r>
-        <w:rPr>
-          <w:i/>
-          <w:iCs/>
-        </w:rPr>
-        <w:t xml:space="preserve">Challenges of LLM-as-a-Judge.</w:t>
-      </w:r>
-      <w:r>
-        <w:t xml:space="preserve"> </w:t>
-      </w:r>
-      <w:r>
-        <w:t xml:space="preserve">EMNLP.</w:t>
+        <w:t xml:space="preserve">Dynabench: Rethinking Benchmarking in NLP.</w:t>
+      </w:r>
+      <w:r>
+        <w:t xml:space="preserve"> </w:t>
+      </w:r>
+      <w:r>
+        <w:t xml:space="preserve">NAACL.</w:t>
       </w:r>
       <w:r>
         <w:t xml:space="preserve"> </w:t>
@@ -16651,7 +16349,7 @@
           <w:rPr>
             <w:rStyle w:val="Hyperlink"/>
           </w:rPr>
-          <w:t xml:space="preserve">arxiv.org/abs/2411.16594</w:t>
+          <w:t xml:space="preserve">arxiv.org/abs/2104.14337</w:t>
         </w:r>
       </w:hyperlink>
       <w:bookmarkEnd w:id="71"/>
@@ -16668,9 +16366,9 @@
         <w:keepLines w:val="0"/>
         <w:widowControl w:val="1"/>
       </w:pPr>
-      <w:bookmarkStart w:id="73" w:name="r21"/>
-      <w:r>
-        <w:t xml:space="preserve">Chan, C.-M., Chen, W., Su, Y., et al. (2024).</w:t>
+      <w:bookmarkStart w:id="73" w:name="r15"/>
+      <w:r>
+        <w:t xml:space="preserve">Li, D., Sun, R., Huang, Y., et al. (2026).</w:t>
       </w:r>
       <w:r>
         <w:t xml:space="preserve"> </w:t>
@@ -16680,7 +16378,7 @@
           <w:i/>
           <w:iCs/>
         </w:rPr>
-        <w:t xml:space="preserve">ChatEval: Towards Better LLM-based Evaluators through</w:t>
+        <w:t xml:space="preserve">Preference Leakage: A Contamination Problem in</w:t>
       </w:r>
       <w:r>
         <w:rPr>
@@ -16694,7 +16392,7 @@
           <w:i/>
           <w:iCs/>
         </w:rPr>
-        <w:t xml:space="preserve">Multi-Agent Debate.</w:t>
+        <w:t xml:space="preserve">LLM-as-a-Judge.</w:t>
       </w:r>
       <w:r>
         <w:t xml:space="preserve"> </w:t>
@@ -16710,7 +16408,7 @@
           <w:rPr>
             <w:rStyle w:val="Hyperlink"/>
           </w:rPr>
-          <w:t xml:space="preserve">arxiv.org/abs/2308.07201</w:t>
+          <w:t xml:space="preserve">arxiv.org/abs/2502.01534</w:t>
         </w:r>
       </w:hyperlink>
       <w:bookmarkEnd w:id="73"/>
@@ -16727,9 +16425,9 @@
         <w:keepLines w:val="0"/>
         <w:widowControl w:val="1"/>
       </w:pPr>
-      <w:bookmarkStart w:id="75" w:name="r22"/>
-      <w:r>
-        <w:t xml:space="preserve">White, C., Dooley, S., Roberts, M., et al. (2025).</w:t>
+      <w:bookmarkStart w:id="75" w:name="r16"/>
+      <w:r>
+        <w:t xml:space="preserve">Spiliopoulou, E., et al. (2025).</w:t>
       </w:r>
       <w:r>
         <w:t xml:space="preserve"> </w:t>
@@ -16739,7 +16437,7 @@
           <w:i/>
           <w:iCs/>
         </w:rPr>
-        <w:t xml:space="preserve">LiveBench: A Challenging, Contamination-Limited</w:t>
+        <w:t xml:space="preserve">Play Favorites: A Statistical Method to Measure Self-Bias in</w:t>
       </w:r>
       <w:r>
         <w:rPr>
@@ -16753,13 +16451,7 @@
           <w:i/>
           <w:iCs/>
         </w:rPr>
-        <w:t xml:space="preserve">LLM Benchmark.</w:t>
-      </w:r>
-      <w:r>
-        <w:t xml:space="preserve"> </w:t>
-      </w:r>
-      <w:r>
-        <w:t xml:space="preserve">ICLR.</w:t>
+        <w:t xml:space="preserve">LLM-as-a-Judge.</w:t>
       </w:r>
       <w:r>
         <w:t xml:space="preserve"> </w:t>
@@ -16769,7 +16461,7 @@
           <w:rPr>
             <w:rStyle w:val="Hyperlink"/>
           </w:rPr>
-          <w:t xml:space="preserve">arxiv.org/abs/2406.19314</w:t>
+          <w:t xml:space="preserve">arxiv.org/abs/2508.06709</w:t>
         </w:r>
       </w:hyperlink>
       <w:bookmarkEnd w:id="75"/>
@@ -16786,9 +16478,9 @@
         <w:keepLines w:val="0"/>
         <w:widowControl w:val="1"/>
       </w:pPr>
-      <w:bookmarkStart w:id="77" w:name="r23"/>
-      <w:r>
-        <w:t xml:space="preserve">Jain, N., Han, K., Gu, A., et al. (2025).</w:t>
+      <w:bookmarkStart w:id="77" w:name="r17"/>
+      <w:r>
+        <w:t xml:space="preserve">Ye, J., Wang, Y., Huang, Y., et al. (2024).</w:t>
       </w:r>
       <w:r>
         <w:t xml:space="preserve"> </w:t>
@@ -16798,7 +16490,7 @@
           <w:i/>
           <w:iCs/>
         </w:rPr>
-        <w:t xml:space="preserve">LiveCodeBench: Holistic and Contamination Free Evaluation</w:t>
+        <w:t xml:space="preserve">Justice or Prejudice? Quantifying Biases in</w:t>
       </w:r>
       <w:r>
         <w:rPr>
@@ -16812,13 +16504,7 @@
           <w:i/>
           <w:iCs/>
         </w:rPr>
-        <w:t xml:space="preserve">of Large Language Models for Code.</w:t>
-      </w:r>
-      <w:r>
-        <w:t xml:space="preserve"> </w:t>
-      </w:r>
-      <w:r>
-        <w:t xml:space="preserve">ICLR.</w:t>
+        <w:t xml:space="preserve">LLM-as-a-Judge.</w:t>
       </w:r>
       <w:r>
         <w:t xml:space="preserve"> </w:t>
@@ -16828,7 +16514,7 @@
           <w:rPr>
             <w:rStyle w:val="Hyperlink"/>
           </w:rPr>
-          <w:t xml:space="preserve">arxiv.org/abs/2403.07974</w:t>
+          <w:t xml:space="preserve">arxiv.org/abs/2410.02736</w:t>
         </w:r>
       </w:hyperlink>
       <w:bookmarkEnd w:id="77"/>
@@ -16845,9 +16531,9 @@
         <w:keepLines w:val="0"/>
         <w:widowControl w:val="1"/>
       </w:pPr>
-      <w:bookmarkStart w:id="79" w:name="r24"/>
-      <w:r>
-        <w:t xml:space="preserve">Chen, W.-L., Wu, Z., Bansal, H., et al. (2025).</w:t>
+      <w:bookmarkStart w:id="79" w:name="r18"/>
+      <w:r>
+        <w:t xml:space="preserve">Wataoka, K., Takahashi, T., Ri, R. (2024).</w:t>
       </w:r>
       <w:r>
         <w:t xml:space="preserve"> </w:t>
@@ -16857,21 +16543,7 @@
           <w:i/>
           <w:iCs/>
         </w:rPr>
-        <w:t xml:space="preserve">Do LLM Evaluators Prefer Themselves for a</w:t>
-      </w:r>
-      <w:r>
-        <w:rPr>
-          <w:i/>
-          <w:iCs/>
-        </w:rPr>
-        <w:t xml:space="preserve"> </w:t>
-      </w:r>
-      <w:r>
-        <w:rPr>
-          <w:i/>
-          <w:iCs/>
-        </w:rPr>
-        <w:t xml:space="preserve">Reason?</w:t>
+        <w:t xml:space="preserve">Self-Preference Bias in LLM-as-a-Judge.</w:t>
       </w:r>
       <w:r>
         <w:t xml:space="preserve"> </w:t>
@@ -16881,7 +16553,7 @@
           <w:rPr>
             <w:rStyle w:val="Hyperlink"/>
           </w:rPr>
-          <w:t xml:space="preserve">arxiv.org/abs/2504.03846</w:t>
+          <w:t xml:space="preserve">arxiv.org/abs/2410.21819</w:t>
         </w:r>
       </w:hyperlink>
       <w:bookmarkEnd w:id="79"/>
@@ -16898,9 +16570,9 @@
         <w:keepLines w:val="0"/>
         <w:widowControl w:val="1"/>
       </w:pPr>
-      <w:bookmarkStart w:id="81" w:name="r25"/>
-      <w:r>
-        <w:t xml:space="preserve">Raju, R., Jain, S., Li, B., et al. (2024).</w:t>
+      <w:bookmarkStart w:id="81" w:name="r19"/>
+      <w:r>
+        <w:t xml:space="preserve">Gu, J., Jiang, X., Shi, Z., et al. (2024).</w:t>
       </w:r>
       <w:r>
         <w:t xml:space="preserve"> </w:t>
@@ -16910,21 +16582,7 @@
           <w:i/>
           <w:iCs/>
         </w:rPr>
-        <w:t xml:space="preserve">Constructing Domain-Specific Evaluation Sets for</w:t>
-      </w:r>
-      <w:r>
-        <w:rPr>
-          <w:i/>
-          <w:iCs/>
-        </w:rPr>
-        <w:t xml:space="preserve"> </w:t>
-      </w:r>
-      <w:r>
-        <w:rPr>
-          <w:i/>
-          <w:iCs/>
-        </w:rPr>
-        <w:t xml:space="preserve">LLM-as-a-judge.</w:t>
+        <w:t xml:space="preserve">A Survey on LLM-as-a-Judge.</w:t>
       </w:r>
       <w:r>
         <w:t xml:space="preserve"> </w:t>
@@ -16934,7 +16592,7 @@
           <w:rPr>
             <w:rStyle w:val="Hyperlink"/>
           </w:rPr>
-          <w:t xml:space="preserve">arxiv.org/abs/2408.08808</w:t>
+          <w:t xml:space="preserve">arxiv.org/abs/2411.15594</w:t>
         </w:r>
       </w:hyperlink>
       <w:bookmarkEnd w:id="81"/>
@@ -16951,9 +16609,9 @@
         <w:keepLines w:val="0"/>
         <w:widowControl w:val="1"/>
       </w:pPr>
-      <w:bookmarkStart w:id="83" w:name="r26"/>
-      <w:r>
-        <w:t xml:space="preserve">Li, Y., et al. (2025).</w:t>
+      <w:bookmarkStart w:id="83" w:name="r20"/>
+      <w:r>
+        <w:t xml:space="preserve">Li, D., Jiang, B., Huang, L., et al. (2025).</w:t>
       </w:r>
       <w:r>
         <w:t xml:space="preserve"> </w:t>
@@ -16963,7 +16621,27 @@
           <w:i/>
           <w:iCs/>
         </w:rPr>
-        <w:t xml:space="preserve">Leveraging LLMs as Meta-Judges: A Multi-Agent Framework.</w:t>
+        <w:t xml:space="preserve">From Generation to Judgment: Opportunities and</w:t>
+      </w:r>
+      <w:r>
+        <w:rPr>
+          <w:i/>
+          <w:iCs/>
+        </w:rPr>
+        <w:t xml:space="preserve"> </w:t>
+      </w:r>
+      <w:r>
+        <w:rPr>
+          <w:i/>
+          <w:iCs/>
+        </w:rPr>
+        <w:t xml:space="preserve">Challenges of LLM-as-a-Judge.</w:t>
+      </w:r>
+      <w:r>
+        <w:t xml:space="preserve"> </w:t>
+      </w:r>
+      <w:r>
+        <w:t xml:space="preserve">EMNLP.</w:t>
       </w:r>
       <w:r>
         <w:t xml:space="preserve"> </w:t>
@@ -16973,7 +16651,7 @@
           <w:rPr>
             <w:rStyle w:val="Hyperlink"/>
           </w:rPr>
-          <w:t xml:space="preserve">arxiv.org/abs/2504.17087</w:t>
+          <w:t xml:space="preserve">arxiv.org/abs/2411.16594</w:t>
         </w:r>
       </w:hyperlink>
       <w:bookmarkEnd w:id="83"/>
@@ -16990,9 +16668,9 @@
         <w:keepLines w:val="0"/>
         <w:widowControl w:val="1"/>
       </w:pPr>
-      <w:bookmarkStart w:id="85" w:name="r27"/>
-      <w:r>
-        <w:t xml:space="preserve">Qian, C., Sun, G., Gales, M., Knill, K. (2026).</w:t>
+      <w:bookmarkStart w:id="85" w:name="r21"/>
+      <w:r>
+        <w:t xml:space="preserve">Chan, C.-M., Chen, W., Su, Y., et al. (2024).</w:t>
       </w:r>
       <w:r>
         <w:t xml:space="preserve"> </w:t>
@@ -17002,7 +16680,7 @@
           <w:i/>
           <w:iCs/>
         </w:rPr>
-        <w:t xml:space="preserve">Who can we trust? LLM-as-a-jury for Comparative</w:t>
+        <w:t xml:space="preserve">ChatEval: Towards Better LLM-based Evaluators through</w:t>
       </w:r>
       <w:r>
         <w:rPr>
@@ -17016,13 +16694,13 @@
           <w:i/>
           <w:iCs/>
         </w:rPr>
-        <w:t xml:space="preserve">Assessment.</w:t>
-      </w:r>
-      <w:r>
-        <w:t xml:space="preserve"> </w:t>
-      </w:r>
-      <w:r>
-        <w:t xml:space="preserve">ICML.</w:t>
+        <w:t xml:space="preserve">Multi-Agent Debate.</w:t>
+      </w:r>
+      <w:r>
+        <w:t xml:space="preserve"> </w:t>
+      </w:r>
+      <w:r>
+        <w:t xml:space="preserve">ICLR.</w:t>
       </w:r>
       <w:r>
         <w:t xml:space="preserve"> </w:t>
@@ -17032,7 +16710,7 @@
           <w:rPr>
             <w:rStyle w:val="Hyperlink"/>
           </w:rPr>
-          <w:t xml:space="preserve">arxiv.org/abs/2602.16610</w:t>
+          <w:t xml:space="preserve">arxiv.org/abs/2308.07201</w:t>
         </w:r>
       </w:hyperlink>
       <w:bookmarkEnd w:id="85"/>
@@ -17049,9 +16727,9 @@
         <w:keepLines w:val="0"/>
         <w:widowControl w:val="1"/>
       </w:pPr>
-      <w:bookmarkStart w:id="87" w:name="r28"/>
-      <w:r>
-        <w:t xml:space="preserve">Zhao, Y., Shin, J., Huang, Z., Namburi, S., Sala, F. (2026).</w:t>
+      <w:bookmarkStart w:id="87" w:name="r22"/>
+      <w:r>
+        <w:t xml:space="preserve">White, C., Dooley, S., Roberts, M., et al. (2025).</w:t>
       </w:r>
       <w:r>
         <w:t xml:space="preserve"> </w:t>
@@ -17061,7 +16739,7 @@
           <w:i/>
           <w:iCs/>
         </w:rPr>
-        <w:t xml:space="preserve">CARE: Confounder-Aware Aggregation</w:t>
+        <w:t xml:space="preserve">LiveBench: A Challenging, Contamination-Limited</w:t>
       </w:r>
       <w:r>
         <w:rPr>
@@ -17075,7 +16753,13 @@
           <w:i/>
           <w:iCs/>
         </w:rPr>
-        <w:t xml:space="preserve">for Reliable LLM Evaluation.</w:t>
+        <w:t xml:space="preserve">LLM Benchmark.</w:t>
+      </w:r>
+      <w:r>
+        <w:t xml:space="preserve"> </w:t>
+      </w:r>
+      <w:r>
+        <w:t xml:space="preserve">ICLR.</w:t>
       </w:r>
       <w:r>
         <w:t xml:space="preserve"> </w:t>
@@ -17085,7 +16769,7 @@
           <w:rPr>
             <w:rStyle w:val="Hyperlink"/>
           </w:rPr>
-          <w:t xml:space="preserve">arxiv.org/abs/2603.00039</w:t>
+          <w:t xml:space="preserve">arxiv.org/abs/2406.19314</w:t>
         </w:r>
       </w:hyperlink>
       <w:bookmarkEnd w:id="87"/>
@@ -17102,9 +16786,9 @@
         <w:keepLines w:val="0"/>
         <w:widowControl w:val="1"/>
       </w:pPr>
-      <w:bookmarkStart w:id="89" w:name="r29"/>
-      <w:r>
-        <w:t xml:space="preserve">Xu, C., Tan, Z., Wu, J., Zhou, T. (2026).</w:t>
+      <w:bookmarkStart w:id="89" w:name="r23"/>
+      <w:r>
+        <w:t xml:space="preserve">Jain, N., Han, K., Gu, A., et al. (2025).</w:t>
       </w:r>
       <w:r>
         <w:t xml:space="preserve"> </w:t>
@@ -17114,7 +16798,7 @@
           <w:i/>
           <w:iCs/>
         </w:rPr>
-        <w:t xml:space="preserve">A Judge-Aware Ranking Framework for Evaluating Large</w:t>
+        <w:t xml:space="preserve">LiveCodeBench: Holistic and Contamination Free Evaluation</w:t>
       </w:r>
       <w:r>
         <w:rPr>
@@ -17128,7 +16812,13 @@
           <w:i/>
           <w:iCs/>
         </w:rPr>
-        <w:t xml:space="preserve">Language Models without Ground Truth.</w:t>
+        <w:t xml:space="preserve">of Large Language Models for Code.</w:t>
+      </w:r>
+      <w:r>
+        <w:t xml:space="preserve"> </w:t>
+      </w:r>
+      <w:r>
+        <w:t xml:space="preserve">ICLR.</w:t>
       </w:r>
       <w:r>
         <w:t xml:space="preserve"> </w:t>
@@ -17138,7 +16828,7 @@
           <w:rPr>
             <w:rStyle w:val="Hyperlink"/>
           </w:rPr>
-          <w:t xml:space="preserve">arxiv.org/abs/2601.21817</w:t>
+          <w:t xml:space="preserve">arxiv.org/abs/2403.07974</w:t>
         </w:r>
       </w:hyperlink>
       <w:bookmarkEnd w:id="89"/>
@@ -17155,9 +16845,9 @@
         <w:keepLines w:val="0"/>
         <w:widowControl w:val="1"/>
       </w:pPr>
-      <w:bookmarkStart w:id="91" w:name="r30"/>
-      <w:r>
-        <w:t xml:space="preserve">Patel, A., Reddy, S., Bahdanau, D. (2025).</w:t>
+      <w:bookmarkStart w:id="91" w:name="r24"/>
+      <w:r>
+        <w:t xml:space="preserve">Chen, W.-L., Wu, Z., Bansal, H., et al. (2025).</w:t>
       </w:r>
       <w:r>
         <w:t xml:space="preserve"> </w:t>
@@ -17167,7 +16857,7 @@
           <w:i/>
           <w:iCs/>
         </w:rPr>
-        <w:t xml:space="preserve">CHASE: How to Get Your LLM to Generate Challenging</w:t>
+        <w:t xml:space="preserve">Do LLM Evaluators Prefer Themselves for a</w:t>
       </w:r>
       <w:r>
         <w:rPr>
@@ -17181,7 +16871,7 @@
           <w:i/>
           <w:iCs/>
         </w:rPr>
-        <w:t xml:space="preserve">Problems for Evaluation.</w:t>
+        <w:t xml:space="preserve">Reason?</w:t>
       </w:r>
       <w:r>
         <w:t xml:space="preserve"> </w:t>
@@ -17191,7 +16881,7 @@
           <w:rPr>
             <w:rStyle w:val="Hyperlink"/>
           </w:rPr>
-          <w:t xml:space="preserve">arxiv.org/abs/2502.14678</w:t>
+          <w:t xml:space="preserve">arxiv.org/abs/2504.03846</w:t>
         </w:r>
       </w:hyperlink>
       <w:bookmarkEnd w:id="91"/>
@@ -17208,9 +16898,9 @@
         <w:keepLines w:val="0"/>
         <w:widowControl w:val="1"/>
       </w:pPr>
-      <w:bookmarkStart w:id="93" w:name="r31"/>
-      <w:r>
-        <w:t xml:space="preserve">Filice, S., Horowitz, G., Carmel, D., Karnin, Z., Lewin-Eytan, L., Maarek, Y. (2025).</w:t>
+      <w:bookmarkStart w:id="93" w:name="r25"/>
+      <w:r>
+        <w:t xml:space="preserve">Raju, R., Jain, S., Li, B., et al. (2024).</w:t>
       </w:r>
       <w:r>
         <w:t xml:space="preserve"> </w:t>
@@ -17220,7 +16910,7 @@
           <w:i/>
           <w:iCs/>
         </w:rPr>
-        <w:t xml:space="preserve">Generating</w:t>
+        <w:t xml:space="preserve">Constructing Domain-Specific Evaluation Sets for</w:t>
       </w:r>
       <w:r>
         <w:rPr>
@@ -17234,13 +16924,7 @@
           <w:i/>
           <w:iCs/>
         </w:rPr>
-        <w:t xml:space="preserve">Diverse Q&amp;A Benchmarks for RAG Evaluation with DataMorgana.</w:t>
-      </w:r>
-      <w:r>
-        <w:t xml:space="preserve"> </w:t>
-      </w:r>
-      <w:r>
-        <w:t xml:space="preserve">SIGIR LiveRAG.</w:t>
+        <w:t xml:space="preserve">LLM-as-a-judge.</w:t>
       </w:r>
       <w:r>
         <w:t xml:space="preserve"> </w:t>
@@ -17250,7 +16934,7 @@
           <w:rPr>
             <w:rStyle w:val="Hyperlink"/>
           </w:rPr>
-          <w:t xml:space="preserve">arxiv.org/abs/2501.12789</w:t>
+          <w:t xml:space="preserve">arxiv.org/abs/2408.08808</w:t>
         </w:r>
       </w:hyperlink>
       <w:bookmarkEnd w:id="93"/>
@@ -17267,9 +16951,9 @@
         <w:keepLines w:val="0"/>
         <w:widowControl w:val="1"/>
       </w:pPr>
-      <w:bookmarkStart w:id="95" w:name="r32"/>
-      <w:r>
-        <w:t xml:space="preserve">Chen, Y., et al. (2025).</w:t>
+      <w:bookmarkStart w:id="95" w:name="r26"/>
+      <w:r>
+        <w:t xml:space="preserve">Li, Y., et al. (2025).</w:t>
       </w:r>
       <w:r>
         <w:t xml:space="preserve"> </w:t>
@@ -17279,27 +16963,7 @@
           <w:i/>
           <w:iCs/>
         </w:rPr>
-        <w:t xml:space="preserve">Recent Advances in Large Language Model Benchmarks against Data</w:t>
-      </w:r>
-      <w:r>
-        <w:rPr>
-          <w:i/>
-          <w:iCs/>
-        </w:rPr>
-        <w:t xml:space="preserve"> </w:t>
-      </w:r>
-      <w:r>
-        <w:rPr>
-          <w:i/>
-          <w:iCs/>
-        </w:rPr>
-        <w:t xml:space="preserve">Contamination: From Static to Dynamic Evaluation.</w:t>
-      </w:r>
-      <w:r>
-        <w:t xml:space="preserve"> </w:t>
-      </w:r>
-      <w:r>
-        <w:t xml:space="preserve">EMNLP.</w:t>
+        <w:t xml:space="preserve">Leveraging LLMs as Meta-Judges: A Multi-Agent Framework.</w:t>
       </w:r>
       <w:r>
         <w:t xml:space="preserve"> </w:t>
@@ -17309,7 +16973,7 @@
           <w:rPr>
             <w:rStyle w:val="Hyperlink"/>
           </w:rPr>
-          <w:t xml:space="preserve">arxiv.org/abs/2502.17521</w:t>
+          <w:t xml:space="preserve">arxiv.org/abs/2504.17087</w:t>
         </w:r>
       </w:hyperlink>
       <w:bookmarkEnd w:id="95"/>
@@ -17326,9 +16990,9 @@
         <w:keepLines w:val="0"/>
         <w:widowControl w:val="1"/>
       </w:pPr>
-      <w:bookmarkStart w:id="97" w:name="r33"/>
-      <w:r>
-        <w:t xml:space="preserve">Dawid, A. P., Skene, A. M. (1979).</w:t>
+      <w:bookmarkStart w:id="97" w:name="r27"/>
+      <w:r>
+        <w:t xml:space="preserve">Qian, C., Sun, G., Gales, M., Knill, K. (2026).</w:t>
       </w:r>
       <w:r>
         <w:t xml:space="preserve"> </w:t>
@@ -17338,7 +17002,7 @@
           <w:i/>
           <w:iCs/>
         </w:rPr>
-        <w:t xml:space="preserve">Maximum Likelihood Estimation of Observer Error-Rates Using</w:t>
+        <w:t xml:space="preserve">Who can we trust? LLM-as-a-jury for Comparative</w:t>
       </w:r>
       <w:r>
         <w:rPr>
@@ -17352,6 +17016,342 @@
           <w:i/>
           <w:iCs/>
         </w:rPr>
+        <w:t xml:space="preserve">Assessment.</w:t>
+      </w:r>
+      <w:r>
+        <w:t xml:space="preserve"> </w:t>
+      </w:r>
+      <w:r>
+        <w:t xml:space="preserve">ICML.</w:t>
+      </w:r>
+      <w:r>
+        <w:t xml:space="preserve"> </w:t>
+      </w:r>
+      <w:hyperlink r:id="rId96">
+        <w:r>
+          <w:rPr>
+            <w:rStyle w:val="Hyperlink"/>
+          </w:rPr>
+          <w:t xml:space="preserve">arxiv.org/abs/2602.16610</w:t>
+        </w:r>
+      </w:hyperlink>
+      <w:bookmarkEnd w:id="97"/>
+    </w:p>
+    <w:p>
+      <w:pPr>
+        <w:pStyle w:val="ReferenceEntry"/>
+        <w:numPr>
+          <w:ilvl w:val="0"/>
+          <w:numId w:val="1002"/>
+        </w:numPr>
+        <w:jc w:val="left"/>
+        <w:keepNext w:val="0"/>
+        <w:keepLines w:val="0"/>
+        <w:widowControl w:val="1"/>
+      </w:pPr>
+      <w:bookmarkStart w:id="99" w:name="r28"/>
+      <w:r>
+        <w:t xml:space="preserve">Zhao, Y., Shin, J., Huang, Z., Namburi, S., Sala, F. (2026).</w:t>
+      </w:r>
+      <w:r>
+        <w:t xml:space="preserve"> </w:t>
+      </w:r>
+      <w:r>
+        <w:rPr>
+          <w:i/>
+          <w:iCs/>
+        </w:rPr>
+        <w:t xml:space="preserve">CARE: Confounder-Aware Aggregation</w:t>
+      </w:r>
+      <w:r>
+        <w:rPr>
+          <w:i/>
+          <w:iCs/>
+        </w:rPr>
+        <w:t xml:space="preserve"> </w:t>
+      </w:r>
+      <w:r>
+        <w:rPr>
+          <w:i/>
+          <w:iCs/>
+        </w:rPr>
+        <w:t xml:space="preserve">for Reliable LLM Evaluation.</w:t>
+      </w:r>
+      <w:r>
+        <w:t xml:space="preserve"> </w:t>
+      </w:r>
+      <w:hyperlink r:id="rId98">
+        <w:r>
+          <w:rPr>
+            <w:rStyle w:val="Hyperlink"/>
+          </w:rPr>
+          <w:t xml:space="preserve">arxiv.org/abs/2603.00039</w:t>
+        </w:r>
+      </w:hyperlink>
+      <w:bookmarkEnd w:id="99"/>
+    </w:p>
+    <w:p>
+      <w:pPr>
+        <w:pStyle w:val="ReferenceEntry"/>
+        <w:numPr>
+          <w:ilvl w:val="0"/>
+          <w:numId w:val="1002"/>
+        </w:numPr>
+        <w:jc w:val="left"/>
+        <w:keepNext w:val="0"/>
+        <w:keepLines w:val="0"/>
+        <w:widowControl w:val="1"/>
+      </w:pPr>
+      <w:bookmarkStart w:id="101" w:name="r29"/>
+      <w:r>
+        <w:t xml:space="preserve">Xu, C., Tan, Z., Wu, J., Zhou, T. (2026).</w:t>
+      </w:r>
+      <w:r>
+        <w:t xml:space="preserve"> </w:t>
+      </w:r>
+      <w:r>
+        <w:rPr>
+          <w:i/>
+          <w:iCs/>
+        </w:rPr>
+        <w:t xml:space="preserve">A Judge-Aware Ranking Framework for Evaluating Large</w:t>
+      </w:r>
+      <w:r>
+        <w:rPr>
+          <w:i/>
+          <w:iCs/>
+        </w:rPr>
+        <w:t xml:space="preserve"> </w:t>
+      </w:r>
+      <w:r>
+        <w:rPr>
+          <w:i/>
+          <w:iCs/>
+        </w:rPr>
+        <w:t xml:space="preserve">Language Models without Ground Truth.</w:t>
+      </w:r>
+      <w:r>
+        <w:t xml:space="preserve"> </w:t>
+      </w:r>
+      <w:hyperlink r:id="rId100">
+        <w:r>
+          <w:rPr>
+            <w:rStyle w:val="Hyperlink"/>
+          </w:rPr>
+          <w:t xml:space="preserve">arxiv.org/abs/2601.21817</w:t>
+        </w:r>
+      </w:hyperlink>
+      <w:bookmarkEnd w:id="101"/>
+    </w:p>
+    <w:p>
+      <w:pPr>
+        <w:pStyle w:val="ReferenceEntry"/>
+        <w:numPr>
+          <w:ilvl w:val="0"/>
+          <w:numId w:val="1002"/>
+        </w:numPr>
+        <w:jc w:val="left"/>
+        <w:keepNext w:val="0"/>
+        <w:keepLines w:val="0"/>
+        <w:widowControl w:val="1"/>
+      </w:pPr>
+      <w:bookmarkStart w:id="103" w:name="r30"/>
+      <w:r>
+        <w:t xml:space="preserve">Patel, A., Reddy, S., Bahdanau, D. (2025).</w:t>
+      </w:r>
+      <w:r>
+        <w:t xml:space="preserve"> </w:t>
+      </w:r>
+      <w:r>
+        <w:rPr>
+          <w:i/>
+          <w:iCs/>
+        </w:rPr>
+        <w:t xml:space="preserve">CHASE: How to Get Your LLM to Generate Challenging</w:t>
+      </w:r>
+      <w:r>
+        <w:rPr>
+          <w:i/>
+          <w:iCs/>
+        </w:rPr>
+        <w:t xml:space="preserve"> </w:t>
+      </w:r>
+      <w:r>
+        <w:rPr>
+          <w:i/>
+          <w:iCs/>
+        </w:rPr>
+        <w:t xml:space="preserve">Problems for Evaluation.</w:t>
+      </w:r>
+      <w:r>
+        <w:t xml:space="preserve"> </w:t>
+      </w:r>
+      <w:hyperlink r:id="rId102">
+        <w:r>
+          <w:rPr>
+            <w:rStyle w:val="Hyperlink"/>
+          </w:rPr>
+          <w:t xml:space="preserve">arxiv.org/abs/2502.14678</w:t>
+        </w:r>
+      </w:hyperlink>
+      <w:bookmarkEnd w:id="103"/>
+    </w:p>
+    <w:p>
+      <w:pPr>
+        <w:pStyle w:val="ReferenceEntry"/>
+        <w:numPr>
+          <w:ilvl w:val="0"/>
+          <w:numId w:val="1002"/>
+        </w:numPr>
+        <w:jc w:val="left"/>
+        <w:keepNext w:val="0"/>
+        <w:keepLines w:val="0"/>
+        <w:widowControl w:val="1"/>
+      </w:pPr>
+      <w:bookmarkStart w:id="105" w:name="r31"/>
+      <w:r>
+        <w:t xml:space="preserve">Filice, S., Horowitz, G., Carmel, D., Karnin, Z., Lewin-Eytan, L., Maarek, Y. (2025).</w:t>
+      </w:r>
+      <w:r>
+        <w:t xml:space="preserve"> </w:t>
+      </w:r>
+      <w:r>
+        <w:rPr>
+          <w:i/>
+          <w:iCs/>
+        </w:rPr>
+        <w:t xml:space="preserve">Generating</w:t>
+      </w:r>
+      <w:r>
+        <w:rPr>
+          <w:i/>
+          <w:iCs/>
+        </w:rPr>
+        <w:t xml:space="preserve"> </w:t>
+      </w:r>
+      <w:r>
+        <w:rPr>
+          <w:i/>
+          <w:iCs/>
+        </w:rPr>
+        <w:t xml:space="preserve">Diverse Q&amp;A Benchmarks for RAG Evaluation with DataMorgana.</w:t>
+      </w:r>
+      <w:r>
+        <w:t xml:space="preserve"> </w:t>
+      </w:r>
+      <w:r>
+        <w:t xml:space="preserve">SIGIR LiveRAG.</w:t>
+      </w:r>
+      <w:r>
+        <w:t xml:space="preserve"> </w:t>
+      </w:r>
+      <w:hyperlink r:id="rId104">
+        <w:r>
+          <w:rPr>
+            <w:rStyle w:val="Hyperlink"/>
+          </w:rPr>
+          <w:t xml:space="preserve">arxiv.org/abs/2501.12789</w:t>
+        </w:r>
+      </w:hyperlink>
+      <w:bookmarkEnd w:id="105"/>
+    </w:p>
+    <w:p>
+      <w:pPr>
+        <w:pStyle w:val="ReferenceEntry"/>
+        <w:numPr>
+          <w:ilvl w:val="0"/>
+          <w:numId w:val="1002"/>
+        </w:numPr>
+        <w:jc w:val="left"/>
+        <w:keepNext w:val="0"/>
+        <w:keepLines w:val="0"/>
+        <w:widowControl w:val="1"/>
+      </w:pPr>
+      <w:bookmarkStart w:id="107" w:name="r32"/>
+      <w:r>
+        <w:t xml:space="preserve">Chen, Y., et al. (2025).</w:t>
+      </w:r>
+      <w:r>
+        <w:t xml:space="preserve"> </w:t>
+      </w:r>
+      <w:r>
+        <w:rPr>
+          <w:i/>
+          <w:iCs/>
+        </w:rPr>
+        <w:t xml:space="preserve">Recent Advances in Large Language Model Benchmarks against Data</w:t>
+      </w:r>
+      <w:r>
+        <w:rPr>
+          <w:i/>
+          <w:iCs/>
+        </w:rPr>
+        <w:t xml:space="preserve"> </w:t>
+      </w:r>
+      <w:r>
+        <w:rPr>
+          <w:i/>
+          <w:iCs/>
+        </w:rPr>
+        <w:t xml:space="preserve">Contamination: From Static to Dynamic Evaluation.</w:t>
+      </w:r>
+      <w:r>
+        <w:t xml:space="preserve"> </w:t>
+      </w:r>
+      <w:r>
+        <w:t xml:space="preserve">EMNLP.</w:t>
+      </w:r>
+      <w:r>
+        <w:t xml:space="preserve"> </w:t>
+      </w:r>
+      <w:hyperlink r:id="rId106">
+        <w:r>
+          <w:rPr>
+            <w:rStyle w:val="Hyperlink"/>
+          </w:rPr>
+          <w:t xml:space="preserve">arxiv.org/abs/2502.17521</w:t>
+        </w:r>
+      </w:hyperlink>
+      <w:bookmarkEnd w:id="107"/>
+    </w:p>
+    <w:p>
+      <w:pPr>
+        <w:pStyle w:val="ReferenceEntry"/>
+        <w:numPr>
+          <w:ilvl w:val="0"/>
+          <w:numId w:val="1002"/>
+        </w:numPr>
+        <w:jc w:val="left"/>
+        <w:keepNext w:val="0"/>
+        <w:keepLines w:val="0"/>
+        <w:widowControl w:val="1"/>
+      </w:pPr>
+      <w:bookmarkStart w:id="109" w:name="r33"/>
+      <w:r>
+        <w:t xml:space="preserve">Dawid, A. P., Skene, A. M. (1979).</w:t>
+      </w:r>
+      <w:r>
+        <w:t xml:space="preserve"> </w:t>
+      </w:r>
+      <w:r>
+        <w:rPr>
+          <w:i/>
+          <w:iCs/>
+        </w:rPr>
+        <w:t xml:space="preserve">Maximum Likelihood Estimation of Observer Error-Rates Using</w:t>
+      </w:r>
+      <w:r>
+        <w:rPr>
+          <w:i/>
+          <w:iCs/>
+        </w:rPr>
+        <w:t xml:space="preserve"> </w:t>
+      </w:r>
+      <w:r>
+        <w:rPr>
+          <w:i/>
+          <w:iCs/>
+        </w:rPr>
         <w:t xml:space="preserve">the EM Algorithm.</w:t>
       </w:r>
       <w:r>
@@ -17363,7 +17363,7 @@
       <w:r>
         <w:t xml:space="preserve"> </w:t>
       </w:r>
-      <w:hyperlink r:id="rId96">
+      <w:hyperlink r:id="rId108">
         <w:r>
           <w:rPr>
             <w:rStyle w:val="Hyperlink"/>
@@ -17371,10 +17371,10 @@
           <w:t xml:space="preserve">doi.org/10.2307/2346806</w:t>
         </w:r>
       </w:hyperlink>
-      <w:bookmarkEnd w:id="97"/>
+      <w:bookmarkEnd w:id="109"/>
     </w:p>
-    <w:bookmarkEnd w:id="98"/>
-    <w:bookmarkStart w:id="99" w:name="appA"/>
+    <w:bookmarkEnd w:id="110"/>
+    <w:bookmarkStart w:id="111" w:name="appA"/>
     <w:p>
       <w:pPr>
         <w:pStyle w:val="Heading2"/>
@@ -18055,8 +18055,8 @@
         <w:t xml:space="preserve">nested (multiple student responses per item).</w:t>
       </w:r>
     </w:p>
-    <w:bookmarkEnd w:id="99"/>
-    <w:bookmarkStart w:id="100" w:name="appB"/>
+    <w:bookmarkEnd w:id="111"/>
+    <w:bookmarkStart w:id="115" w:name="appB"/>
     <w:p>
       <w:pPr>
         <w:pStyle w:val="Heading2"/>
@@ -18174,57 +18174,57 @@
         <w:t xml:space="preserve">CoEval's rubrics are thus specialized to each task's demands yet anchored by a transferable notion of answer quality.</w:t>
       </w:r>
     </w:p>
-    <w:tbl>
-      <w:tblPr>
-        <w:tblStyle w:val="FigureTable"/>
-        <w:tblW w:type="pct" w:w="5000"/>
+    <w:p>
+      <w:pPr>
+        <w:pStyle w:val="BodyText"/>
         <w:jc w:val="center"/>
-        <w:tblLook w:firstRow="0" w:lastRow="0" w:firstColumn="0" w:lastColumn="0"/>
-        <w:tblLayout w:type="autofit"/>
-        <w:tblBorders>
-          <w:top w:val="single" w:sz="10" w:color="4F6272"/>
-          <w:bottom w:val="single" w:sz="10" w:color="4F6272"/>
-          <w:insideH w:val="single" w:sz="5" w:color="9FB0C2"/>
-          <w:left w:val="single" w:sz="6" w:color="9FB0C2"/>
-          <w:right w:val="single" w:sz="6" w:color="9FB0C2"/>
-          <w:insideV w:val="single" w:sz="5" w:color="D9E1E8"/>
-        </w:tblBorders>
-      </w:tblPr>
-      <w:tblGrid>
-        <w:gridCol w:w="7920"/>
-      </w:tblGrid>
-      <w:tr>
-        <w:tc>
-          <w:tcPr>
-            <w:shd w:fill="EEF3F7"/>
-            <w:tcBorders>
-              <w:left w:val="nil"/>
-              <w:right w:val="nil"/>
-              <w:top w:val="nil"/>
-              <w:bottom w:val="single" w:sz="8" w:color="9FB0C2"/>
-            </w:tcBorders>
-          </w:tcPr>
-          <w:p>
-            <w:pPr>
-              <w:pStyle w:val="Compact"/>
-              <w:spacing w:before="0" w:after="20" w:line="240" w:lineRule="auto"/>
-              <w:jc w:val="center"/>
-              <w:keepNext w:val="0"/>
-              <w:keepLines/>
-              <w:widowControl w:val="1"/>
-            </w:pPr>
-            <w:r>
-              <w:rPr>
-                <w:rFonts w:ascii="Times New Roman" w:hAnsi="Times New Roman"/>
-                <w:b/>
-                <w:sz w:val="19"/>
-              </w:rPr>
-              <w:t xml:space="preserve">Heatmap of pairwise semantic similarity between auto-generated rubric criteria</w:t>
-            </w:r>
-          </w:p>
-        </w:tc>
-      </w:tr>
-    </w:tbl>
+        <w:keepNext/>
+        <w:keepLines/>
+        <w:widowControl w:val="1"/>
+      </w:pPr>
+      <w:r>
+        <w:drawing>
+          <wp:inline>
+            <wp:extent cx="5736336" cy="4998720"/>
+            <wp:effectExtent b="0" l="0" r="0" t="0"/>
+            <wp:docPr descr="Heatmap of pairwise semantic similarity between auto-generated rubric criteria" title="" id="113" name="Picture"/>
+            <a:graphic>
+              <a:graphicData uri="http://schemas.openxmlformats.org/drawingml/2006/picture">
+                <pic:pic>
+                  <pic:nvPicPr>
+                    <pic:cNvPr descr="figures/f5_rubric_heatmap.png" id="114" name="Picture"/>
+                    <pic:cNvPicPr>
+                      <a:picLocks noChangeArrowheads="1" noChangeAspect="1"/>
+                    </pic:cNvPicPr>
+                  </pic:nvPicPr>
+                  <pic:blipFill>
+                    <a:blip r:embed="rId112"/>
+                    <a:stretch>
+                      <a:fillRect/>
+                    </a:stretch>
+                  </pic:blipFill>
+                  <pic:spPr bwMode="auto">
+                    <a:xfrm>
+                      <a:off x="0" y="0"/>
+                      <a:ext cx="5736336" cy="4998720"/>
+                    </a:xfrm>
+                    <a:prstGeom prst="rect">
+                      <a:avLst/>
+                    </a:prstGeom>
+                    <a:noFill/>
+                    <a:ln w="9525">
+                      <a:noFill/>
+                      <a:headEnd/>
+                      <a:tailEnd/>
+                    </a:ln>
+                  </pic:spPr>
+                </pic:pic>
+              </a:graphicData>
+            </a:graphic>
+          </wp:inline>
+        </w:drawing>
+      </w:r>
+    </w:p>
     <w:p>
       <w:pPr>
         <w:pStyle w:val="ImageCaption"/>
@@ -18285,8 +18285,8 @@
         <w:t xml:space="preserve">), while a recurring “completeness” dimension forms a cross-task cluster.</w:t>
       </w:r>
     </w:p>
-    <w:bookmarkEnd w:id="100"/>
-    <w:bookmarkStart w:id="101" w:name="appC"/>
+    <w:bookmarkEnd w:id="115"/>
+    <w:bookmarkStart w:id="119" w:name="appC"/>
     <w:p>
       <w:pPr>
         <w:pStyle w:val="Heading2"/>
@@ -18298,57 +18298,57 @@
         <w:t xml:space="preserve">Appendix C. Evaluation throughput</w:t>
       </w:r>
     </w:p>
-    <w:tbl>
-      <w:tblPr>
-        <w:tblStyle w:val="FigureTable"/>
-        <w:tblW w:type="pct" w:w="5000"/>
+    <w:p>
+      <w:pPr>
+        <w:pStyle w:val="BodyText"/>
         <w:jc w:val="center"/>
-        <w:tblLook w:firstRow="0" w:lastRow="0" w:firstColumn="0" w:lastColumn="0"/>
-        <w:tblLayout w:type="autofit"/>
-        <w:tblBorders>
-          <w:top w:val="single" w:sz="10" w:color="4F6272"/>
-          <w:bottom w:val="single" w:sz="10" w:color="4F6272"/>
-          <w:insideH w:val="single" w:sz="5" w:color="9FB0C2"/>
-          <w:left w:val="single" w:sz="6" w:color="9FB0C2"/>
-          <w:right w:val="single" w:sz="6" w:color="9FB0C2"/>
-          <w:insideV w:val="single" w:sz="5" w:color="D9E1E8"/>
-        </w:tblBorders>
-      </w:tblPr>
-      <w:tblGrid>
-        <w:gridCol w:w="7920"/>
-      </w:tblGrid>
-      <w:tr>
-        <w:tc>
-          <w:tcPr>
-            <w:shd w:fill="EEF3F7"/>
-            <w:tcBorders>
-              <w:left w:val="nil"/>
-              <w:right w:val="nil"/>
-              <w:top w:val="nil"/>
-              <w:bottom w:val="single" w:sz="8" w:color="9FB0C2"/>
-            </w:tcBorders>
-          </w:tcPr>
-          <w:p>
-            <w:pPr>
-              <w:pStyle w:val="Compact"/>
-              <w:spacing w:before="0" w:after="20" w:line="240" w:lineRule="auto"/>
-              <w:jc w:val="center"/>
-              <w:keepNext w:val="0"/>
-              <w:keepLines/>
-              <w:widowControl w:val="1"/>
-            </w:pPr>
-            <w:r>
-              <w:rPr>
-                <w:rFonts w:ascii="Times New Roman" w:hAnsi="Times New Roman"/>
-                <w:b/>
-                <w:sz w:val="19"/>
-              </w:rPr>
-              <w:t xml:space="preserve">Evaluations per dollar: CoEval versus human annotation</w:t>
-            </w:r>
-          </w:p>
-        </w:tc>
-      </w:tr>
-    </w:tbl>
+        <w:keepNext/>
+        <w:keepLines/>
+        <w:widowControl w:val="1"/>
+      </w:pPr>
+      <w:r>
+        <w:drawing>
+          <wp:inline>
+            <wp:extent cx="4632960" cy="2987040"/>
+            <wp:effectExtent b="0" l="0" r="0" t="0"/>
+            <wp:docPr descr="Evaluations per dollar: CoEval versus human annotation" title="" id="117" name="Picture"/>
+            <a:graphic>
+              <a:graphicData uri="http://schemas.openxmlformats.org/drawingml/2006/picture">
+                <pic:pic>
+                  <pic:nvPicPr>
+                    <pic:cNvPr descr="figures/f6_cost.png" id="118" name="Picture"/>
+                    <pic:cNvPicPr>
+                      <a:picLocks noChangeArrowheads="1" noChangeAspect="1"/>
+                    </pic:cNvPicPr>
+                  </pic:nvPicPr>
+                  <pic:blipFill>
+                    <a:blip r:embed="rId116"/>
+                    <a:stretch>
+                      <a:fillRect/>
+                    </a:stretch>
+                  </pic:blipFill>
+                  <pic:spPr bwMode="auto">
+                    <a:xfrm>
+                      <a:off x="0" y="0"/>
+                      <a:ext cx="4632960" cy="2987040"/>
+                    </a:xfrm>
+                    <a:prstGeom prst="rect">
+                      <a:avLst/>
+                    </a:prstGeom>
+                    <a:noFill/>
+                    <a:ln w="9525">
+                      <a:noFill/>
+                      <a:headEnd/>
+                      <a:tailEnd/>
+                    </a:ln>
+                  </pic:spPr>
+                </pic:pic>
+              </a:graphicData>
+            </a:graphic>
+          </wp:inline>
+        </w:drawing>
+      </w:r>
+    </w:p>
     <w:p>
       <w:pPr>
         <w:pStyle w:val="ImageCaption"/>
@@ -18407,8 +18407,8 @@
         <w:t xml:space="preserve">re-evaluation on every model release.</w:t>
       </w:r>
     </w:p>
-    <w:bookmarkEnd w:id="101"/>
-    <w:bookmarkStart w:id="102" w:name="appD"/>
+    <w:bookmarkEnd w:id="119"/>
+    <w:bookmarkStart w:id="120" w:name="appD"/>
     <w:p>
       <w:pPr>
         <w:pStyle w:val="Heading2"/>
@@ -19344,7 +19344,7 @@
         <w:t xml:space="preserve">data and no human raters.</w:t>
       </w:r>
     </w:p>
-    <w:bookmarkEnd w:id="102"/>
+    <w:bookmarkEnd w:id="120"/>
     <w:sectPr>
       <w:footerReference w:type="default" r:id="rId9"/>
       <w:pgSz w:h="15840" w:w="12240"/>

</xml_diff>